<commit_message>
Bitacora: despliegue del entorno y R01F01T02 (802.1Q)
</commit_message>
<xml_diff>
--- a/Prememorias/Pre_2.docx
+++ b/Prememorias/Pre_2.docx
@@ -20462,6 +20462,8 @@
         <w:rPr>
           <w:rFonts w:ascii="Arial" w:eastAsia="Arial" w:hAnsi="Arial" w:cs="Arial"/>
           <w:color w:val="000000"/>
+          <w:sz w:val="24"/>
+          <w:szCs w:val="24"/>
         </w:rPr>
       </w:pPr>
       <w:r>
@@ -20470,14 +20472,1498 @@
           <w:b/>
           <w:bCs/>
           <w:color w:val="000000"/>
+          <w:sz w:val="24"/>
+          <w:szCs w:val="24"/>
         </w:rPr>
         <w:t>Desarrollo de la solución</w:t>
+      </w:r>
+    </w:p>
+    <w:p>
+      <w:pPr>
+        <w:pStyle w:val="Ttulo1"/>
+        <w:spacing w:before="240"/>
+        <w:rPr>
+          <w:sz w:val="24"/>
+          <w:szCs w:val="24"/>
+        </w:rPr>
+      </w:pPr>
+      <w:r>
+        <w:rPr>
+          <w:rFonts w:ascii="Arial" w:eastAsia="Arial" w:hAnsi="Arial" w:cs="Arial"/>
+          <w:sz w:val="24"/>
+          <w:szCs w:val="24"/>
+        </w:rPr>
+        <w:t>Despliegue e instalación</w:t>
+      </w:r>
+    </w:p>
+    <w:p>
+      <w:pPr>
+        <w:pStyle w:val="Ttulo2"/>
+        <w:spacing w:before="160"/>
+        <w:rPr>
+          <w:sz w:val="24"/>
+          <w:szCs w:val="24"/>
+        </w:rPr>
+      </w:pPr>
+      <w:r>
+        <w:rPr>
+          <w:rFonts w:ascii="Arial" w:eastAsia="Arial" w:hAnsi="Arial" w:cs="Arial"/>
+          <w:sz w:val="24"/>
+          <w:szCs w:val="24"/>
+        </w:rPr>
+        <w:t>Preparación del entorno de laboratorio</w:t>
+      </w:r>
+    </w:p>
+    <w:p>
+      <w:pPr>
+        <w:spacing w:after="60"/>
+        <w:rPr>
+          <w:sz w:val="24"/>
+          <w:szCs w:val="24"/>
+        </w:rPr>
+      </w:pPr>
+      <w:r>
+        <w:rPr>
+          <w:rFonts w:ascii="Arial" w:eastAsia="Arial" w:hAnsi="Arial" w:cs="Arial"/>
+          <w:b/>
+          <w:bCs/>
+          <w:sz w:val="24"/>
+          <w:szCs w:val="24"/>
+        </w:rPr>
+        <w:t xml:space="preserve">Objetivo: </w:t>
+      </w:r>
+      <w:r>
+        <w:rPr>
+          <w:rFonts w:ascii="Arial" w:eastAsia="Arial" w:hAnsi="Arial" w:cs="Arial"/>
+          <w:sz w:val="24"/>
+          <w:szCs w:val="24"/>
+        </w:rPr>
+        <w:t xml:space="preserve">montar el entorno de emulación de red (GNS3) y desplegar el cortafuegos </w:t>
+      </w:r>
+      <w:proofErr w:type="spellStart"/>
+      <w:r>
+        <w:rPr>
+          <w:rFonts w:ascii="Arial" w:eastAsia="Arial" w:hAnsi="Arial" w:cs="Arial"/>
+          <w:sz w:val="24"/>
+          <w:szCs w:val="24"/>
+        </w:rPr>
+        <w:t>pfSense</w:t>
+      </w:r>
+      <w:proofErr w:type="spellEnd"/>
+      <w:r>
+        <w:rPr>
+          <w:rFonts w:ascii="Arial" w:eastAsia="Arial" w:hAnsi="Arial" w:cs="Arial"/>
+          <w:sz w:val="24"/>
+          <w:szCs w:val="24"/>
+        </w:rPr>
+        <w:t>, base de la arquitectura Zero Trust.</w:t>
+      </w:r>
+    </w:p>
+    <w:p>
+      <w:pPr>
+        <w:spacing w:after="40"/>
+        <w:rPr>
+          <w:sz w:val="24"/>
+          <w:szCs w:val="24"/>
+        </w:rPr>
+      </w:pPr>
+      <w:r>
+        <w:rPr>
+          <w:rFonts w:ascii="Arial" w:eastAsia="Arial" w:hAnsi="Arial" w:cs="Arial"/>
+          <w:b/>
+          <w:bCs/>
+          <w:sz w:val="24"/>
+          <w:szCs w:val="24"/>
+        </w:rPr>
+        <w:t>Configuración realizada:</w:t>
+      </w:r>
+    </w:p>
+    <w:p>
+      <w:pPr>
+        <w:spacing w:after="40"/>
+        <w:ind w:left="454"/>
+        <w:rPr>
+          <w:rFonts w:ascii="Arial" w:eastAsia="Arial" w:hAnsi="Arial" w:cs="Arial"/>
+          <w:sz w:val="24"/>
+          <w:szCs w:val="24"/>
+        </w:rPr>
+      </w:pPr>
+      <w:r>
+        <w:rPr>
+          <w:rFonts w:ascii="Arial" w:eastAsia="Arial" w:hAnsi="Arial" w:cs="Arial"/>
+          <w:sz w:val="24"/>
+          <w:szCs w:val="24"/>
+        </w:rPr>
+        <w:t xml:space="preserve">– Instalación de GNS3 (GUI) + GNS3 VM en VirtualBox (6 GB RAM, 2 </w:t>
+      </w:r>
+      <w:proofErr w:type="spellStart"/>
+      <w:r>
+        <w:rPr>
+          <w:rFonts w:ascii="Arial" w:eastAsia="Arial" w:hAnsi="Arial" w:cs="Arial"/>
+          <w:sz w:val="24"/>
+          <w:szCs w:val="24"/>
+        </w:rPr>
+        <w:t>vCPU</w:t>
+      </w:r>
+      <w:proofErr w:type="spellEnd"/>
+      <w:r>
+        <w:rPr>
+          <w:rFonts w:ascii="Arial" w:eastAsia="Arial" w:hAnsi="Arial" w:cs="Arial"/>
+          <w:sz w:val="24"/>
+          <w:szCs w:val="24"/>
+        </w:rPr>
+        <w:t>, virtualización anidada activada).</w:t>
+      </w:r>
+    </w:p>
+    <w:p>
+      <w:pPr>
+        <w:spacing w:after="40"/>
+        <w:ind w:left="454"/>
+        <w:jc w:val="center"/>
+        <w:rPr>
+          <w:sz w:val="24"/>
+          <w:szCs w:val="24"/>
+        </w:rPr>
+      </w:pPr>
+      <w:r>
+        <w:rPr>
+          <w:noProof/>
+          <w:sz w:val="24"/>
+          <w:szCs w:val="24"/>
+        </w:rPr>
+        <w:drawing>
+          <wp:inline distT="0" distB="0" distL="0" distR="0">
+            <wp:extent cx="3209925" cy="2133600"/>
+            <wp:effectExtent l="0" t="0" r="9525" b="0"/>
+            <wp:docPr id="2" name="Imagen 2"/>
+            <wp:cNvGraphicFramePr>
+              <a:graphicFrameLocks xmlns:a="http://schemas.openxmlformats.org/drawingml/2006/main" noChangeAspect="1"/>
+            </wp:cNvGraphicFramePr>
+            <a:graphic xmlns:a="http://schemas.openxmlformats.org/drawingml/2006/main">
+              <a:graphicData uri="http://schemas.openxmlformats.org/drawingml/2006/picture">
+                <pic:pic xmlns:pic="http://schemas.openxmlformats.org/drawingml/2006/picture">
+                  <pic:nvPicPr>
+                    <pic:cNvPr id="2" name="en verde.JPG"/>
+                    <pic:cNvPicPr/>
+                  </pic:nvPicPr>
+                  <pic:blipFill>
+                    <a:blip r:embed="rId12">
+                      <a:extLst>
+                        <a:ext uri="{28A0092B-C50C-407E-A947-70E740481C1C}">
+                          <a14:useLocalDpi xmlns:a14="http://schemas.microsoft.com/office/drawing/2010/main" val="0"/>
+                        </a:ext>
+                      </a:extLst>
+                    </a:blip>
+                    <a:stretch>
+                      <a:fillRect/>
+                    </a:stretch>
+                  </pic:blipFill>
+                  <pic:spPr>
+                    <a:xfrm>
+                      <a:off x="0" y="0"/>
+                      <a:ext cx="3209925" cy="2133600"/>
+                    </a:xfrm>
+                    <a:prstGeom prst="rect">
+                      <a:avLst/>
+                    </a:prstGeom>
+                  </pic:spPr>
+                </pic:pic>
+              </a:graphicData>
+            </a:graphic>
+          </wp:inline>
+        </w:drawing>
+      </w:r>
+    </w:p>
+    <w:p>
+      <w:pPr>
+        <w:spacing w:line="360" w:lineRule="auto"/>
+        <w:jc w:val="center"/>
+        <w:rPr>
+          <w:color w:val="000000"/>
+        </w:rPr>
+      </w:pPr>
+      <w:r>
+        <w:rPr>
+          <w:color w:val="000000"/>
+        </w:rPr>
+        <w:t xml:space="preserve">Ilustración </w:t>
+      </w:r>
+      <w:r>
+        <w:rPr>
+          <w:color w:val="000000"/>
+        </w:rPr>
+        <w:t>5</w:t>
+      </w:r>
+      <w:r>
+        <w:rPr>
+          <w:color w:val="000000"/>
+        </w:rPr>
+        <w:t xml:space="preserve">: </w:t>
+      </w:r>
+      <w:r>
+        <w:rPr>
+          <w:color w:val="000000"/>
+        </w:rPr>
+        <w:t>GNS3</w:t>
+      </w:r>
+    </w:p>
+    <w:p>
+      <w:pPr>
+        <w:spacing w:after="40"/>
+        <w:ind w:left="454"/>
+        <w:rPr>
+          <w:sz w:val="24"/>
+          <w:szCs w:val="24"/>
+        </w:rPr>
+      </w:pPr>
+      <w:r>
+        <w:rPr>
+          <w:rFonts w:ascii="Arial" w:eastAsia="Arial" w:hAnsi="Arial" w:cs="Arial"/>
+          <w:sz w:val="24"/>
+          <w:szCs w:val="24"/>
+        </w:rPr>
+        <w:t xml:space="preserve">– Añadida la plantilla de </w:t>
+      </w:r>
+      <w:proofErr w:type="spellStart"/>
+      <w:r>
+        <w:rPr>
+          <w:rFonts w:ascii="Arial" w:eastAsia="Arial" w:hAnsi="Arial" w:cs="Arial"/>
+          <w:sz w:val="24"/>
+          <w:szCs w:val="24"/>
+        </w:rPr>
+        <w:t>pfSense</w:t>
+      </w:r>
+      <w:proofErr w:type="spellEnd"/>
+      <w:r>
+        <w:rPr>
+          <w:rFonts w:ascii="Arial" w:eastAsia="Arial" w:hAnsi="Arial" w:cs="Arial"/>
+          <w:sz w:val="24"/>
+          <w:szCs w:val="24"/>
+        </w:rPr>
+        <w:t xml:space="preserve"> (</w:t>
+      </w:r>
+      <w:proofErr w:type="spellStart"/>
+      <w:r>
+        <w:rPr>
+          <w:rFonts w:ascii="Arial" w:eastAsia="Arial" w:hAnsi="Arial" w:cs="Arial"/>
+          <w:sz w:val="24"/>
+          <w:szCs w:val="24"/>
+        </w:rPr>
+        <w:t>appliance</w:t>
+      </w:r>
+      <w:proofErr w:type="spellEnd"/>
+      <w:r>
+        <w:rPr>
+          <w:rFonts w:ascii="Arial" w:eastAsia="Arial" w:hAnsi="Arial" w:cs="Arial"/>
+          <w:sz w:val="24"/>
+          <w:szCs w:val="24"/>
+        </w:rPr>
+        <w:t xml:space="preserve"> QEMU) e instalación de </w:t>
+      </w:r>
+      <w:proofErr w:type="spellStart"/>
+      <w:r>
+        <w:rPr>
+          <w:rFonts w:ascii="Arial" w:eastAsia="Arial" w:hAnsi="Arial" w:cs="Arial"/>
+          <w:sz w:val="24"/>
+          <w:szCs w:val="24"/>
+        </w:rPr>
+        <w:t>pfSense</w:t>
+      </w:r>
+      <w:proofErr w:type="spellEnd"/>
+      <w:r>
+        <w:rPr>
+          <w:rFonts w:ascii="Arial" w:eastAsia="Arial" w:hAnsi="Arial" w:cs="Arial"/>
+          <w:sz w:val="24"/>
+          <w:szCs w:val="24"/>
+        </w:rPr>
+        <w:t xml:space="preserve"> CE 2.9.0.</w:t>
+      </w:r>
+    </w:p>
+    <w:p>
+      <w:pPr>
+        <w:spacing w:after="40"/>
+        <w:ind w:left="454"/>
+        <w:rPr>
+          <w:rFonts w:ascii="Arial" w:eastAsia="Arial" w:hAnsi="Arial" w:cs="Arial"/>
+          <w:sz w:val="24"/>
+          <w:szCs w:val="24"/>
+        </w:rPr>
+      </w:pPr>
+      <w:r>
+        <w:rPr>
+          <w:rFonts w:ascii="Arial" w:eastAsia="Arial" w:hAnsi="Arial" w:cs="Arial"/>
+          <w:sz w:val="24"/>
+          <w:szCs w:val="24"/>
+        </w:rPr>
+        <w:t xml:space="preserve">– Nodo </w:t>
+      </w:r>
+      <w:proofErr w:type="spellStart"/>
+      <w:r>
+        <w:rPr>
+          <w:rFonts w:ascii="Arial" w:eastAsia="Arial" w:hAnsi="Arial" w:cs="Arial"/>
+          <w:sz w:val="24"/>
+          <w:szCs w:val="24"/>
+        </w:rPr>
+        <w:t>pfSense</w:t>
+      </w:r>
+      <w:proofErr w:type="spellEnd"/>
+      <w:r>
+        <w:rPr>
+          <w:rFonts w:ascii="Arial" w:eastAsia="Arial" w:hAnsi="Arial" w:cs="Arial"/>
+          <w:sz w:val="24"/>
+          <w:szCs w:val="24"/>
+        </w:rPr>
+        <w:t xml:space="preserve"> con 6 interfaces (em0–em5): em0 = WAN conectada a un nodo NAT (salida a internet); em1 = LAN/troncal (192.168.1.1/24).</w:t>
+      </w:r>
+    </w:p>
+    <w:p>
+      <w:pPr>
+        <w:spacing w:after="40"/>
+        <w:ind w:left="454"/>
+        <w:jc w:val="center"/>
+        <w:rPr>
+          <w:sz w:val="24"/>
+          <w:szCs w:val="24"/>
+        </w:rPr>
+      </w:pPr>
+      <w:r>
+        <w:rPr>
+          <w:noProof/>
+          <w:sz w:val="24"/>
+          <w:szCs w:val="24"/>
+        </w:rPr>
+        <w:drawing>
+          <wp:inline distT="0" distB="0" distL="0" distR="0">
+            <wp:extent cx="3829050" cy="2424443"/>
+            <wp:effectExtent l="0" t="0" r="0" b="0"/>
+            <wp:docPr id="3" name="Imagen 3"/>
+            <wp:cNvGraphicFramePr>
+              <a:graphicFrameLocks xmlns:a="http://schemas.openxmlformats.org/drawingml/2006/main" noChangeAspect="1"/>
+            </wp:cNvGraphicFramePr>
+            <a:graphic xmlns:a="http://schemas.openxmlformats.org/drawingml/2006/main">
+              <a:graphicData uri="http://schemas.openxmlformats.org/drawingml/2006/picture">
+                <pic:pic xmlns:pic="http://schemas.openxmlformats.org/drawingml/2006/picture">
+                  <pic:nvPicPr>
+                    <pic:cNvPr id="3" name="qvm en verde.JPG"/>
+                    <pic:cNvPicPr/>
+                  </pic:nvPicPr>
+                  <pic:blipFill>
+                    <a:blip r:embed="rId13" cstate="print">
+                      <a:extLst>
+                        <a:ext uri="{28A0092B-C50C-407E-A947-70E740481C1C}">
+                          <a14:useLocalDpi xmlns:a14="http://schemas.microsoft.com/office/drawing/2010/main" val="0"/>
+                        </a:ext>
+                      </a:extLst>
+                    </a:blip>
+                    <a:stretch>
+                      <a:fillRect/>
+                    </a:stretch>
+                  </pic:blipFill>
+                  <pic:spPr>
+                    <a:xfrm>
+                      <a:off x="0" y="0"/>
+                      <a:ext cx="3841765" cy="2432494"/>
+                    </a:xfrm>
+                    <a:prstGeom prst="rect">
+                      <a:avLst/>
+                    </a:prstGeom>
+                  </pic:spPr>
+                </pic:pic>
+              </a:graphicData>
+            </a:graphic>
+          </wp:inline>
+        </w:drawing>
+      </w:r>
+    </w:p>
+    <w:p>
+      <w:pPr>
+        <w:spacing w:line="360" w:lineRule="auto"/>
+        <w:jc w:val="center"/>
+        <w:rPr>
+          <w:color w:val="000000"/>
+        </w:rPr>
+      </w:pPr>
+      <w:r>
+        <w:rPr>
+          <w:color w:val="000000"/>
+        </w:rPr>
+        <w:t xml:space="preserve">Ilustración </w:t>
+      </w:r>
+      <w:r>
+        <w:rPr>
+          <w:color w:val="000000"/>
+        </w:rPr>
+        <w:t>6</w:t>
+      </w:r>
+      <w:r>
+        <w:rPr>
+          <w:color w:val="000000"/>
+        </w:rPr>
+        <w:t xml:space="preserve">: </w:t>
+      </w:r>
+      <w:proofErr w:type="spellStart"/>
+      <w:r>
+        <w:rPr>
+          <w:color w:val="000000"/>
+        </w:rPr>
+        <w:t>Pfsense</w:t>
+      </w:r>
+      <w:proofErr w:type="spellEnd"/>
+    </w:p>
+    <w:p>
+      <w:pPr>
+        <w:spacing w:after="40"/>
+        <w:ind w:left="454"/>
+        <w:jc w:val="center"/>
+        <w:rPr>
+          <w:sz w:val="24"/>
+          <w:szCs w:val="24"/>
+        </w:rPr>
+      </w:pPr>
+    </w:p>
+    <w:p>
+      <w:pPr>
+        <w:spacing w:after="40"/>
+        <w:ind w:left="454"/>
+        <w:jc w:val="center"/>
+        <w:rPr>
+          <w:sz w:val="24"/>
+          <w:szCs w:val="24"/>
+        </w:rPr>
+      </w:pPr>
+      <w:r>
+        <w:rPr>
+          <w:noProof/>
+          <w:sz w:val="24"/>
+          <w:szCs w:val="24"/>
+        </w:rPr>
+        <w:drawing>
+          <wp:inline distT="0" distB="0" distL="0" distR="0">
+            <wp:extent cx="4292565" cy="2695575"/>
+            <wp:effectExtent l="0" t="0" r="0" b="0"/>
+            <wp:docPr id="4" name="Imagen 4"/>
+            <wp:cNvGraphicFramePr>
+              <a:graphicFrameLocks xmlns:a="http://schemas.openxmlformats.org/drawingml/2006/main" noChangeAspect="1"/>
+            </wp:cNvGraphicFramePr>
+            <a:graphic xmlns:a="http://schemas.openxmlformats.org/drawingml/2006/main">
+              <a:graphicData uri="http://schemas.openxmlformats.org/drawingml/2006/picture">
+                <pic:pic xmlns:pic="http://schemas.openxmlformats.org/drawingml/2006/picture">
+                  <pic:nvPicPr>
+                    <pic:cNvPr id="4" name="pfsense abierto.JPG"/>
+                    <pic:cNvPicPr/>
+                  </pic:nvPicPr>
+                  <pic:blipFill>
+                    <a:blip r:embed="rId14">
+                      <a:extLst>
+                        <a:ext uri="{28A0092B-C50C-407E-A947-70E740481C1C}">
+                          <a14:useLocalDpi xmlns:a14="http://schemas.microsoft.com/office/drawing/2010/main" val="0"/>
+                        </a:ext>
+                      </a:extLst>
+                    </a:blip>
+                    <a:stretch>
+                      <a:fillRect/>
+                    </a:stretch>
+                  </pic:blipFill>
+                  <pic:spPr>
+                    <a:xfrm>
+                      <a:off x="0" y="0"/>
+                      <a:ext cx="4303859" cy="2702667"/>
+                    </a:xfrm>
+                    <a:prstGeom prst="rect">
+                      <a:avLst/>
+                    </a:prstGeom>
+                  </pic:spPr>
+                </pic:pic>
+              </a:graphicData>
+            </a:graphic>
+          </wp:inline>
+        </w:drawing>
+      </w:r>
+    </w:p>
+    <w:p>
+      <w:pPr>
+        <w:spacing w:line="360" w:lineRule="auto"/>
+        <w:jc w:val="center"/>
+        <w:rPr>
+          <w:color w:val="000000"/>
+        </w:rPr>
+      </w:pPr>
+      <w:r>
+        <w:rPr>
+          <w:color w:val="000000"/>
+        </w:rPr>
+        <w:t xml:space="preserve">Ilustración </w:t>
+      </w:r>
+      <w:r>
+        <w:rPr>
+          <w:color w:val="000000"/>
+        </w:rPr>
+        <w:t>7</w:t>
+      </w:r>
+      <w:r>
+        <w:rPr>
+          <w:color w:val="000000"/>
+        </w:rPr>
+        <w:t xml:space="preserve">: </w:t>
+      </w:r>
+      <w:r>
+        <w:rPr>
+          <w:color w:val="000000"/>
+        </w:rPr>
+        <w:t xml:space="preserve">Instalación en </w:t>
+      </w:r>
+      <w:proofErr w:type="spellStart"/>
+      <w:r>
+        <w:rPr>
+          <w:color w:val="000000"/>
+        </w:rPr>
+        <w:t>pfsense</w:t>
+      </w:r>
+      <w:proofErr w:type="spellEnd"/>
+    </w:p>
+    <w:p>
+      <w:pPr>
+        <w:spacing w:after="40"/>
+        <w:ind w:left="454"/>
+        <w:jc w:val="center"/>
+        <w:rPr>
+          <w:sz w:val="24"/>
+          <w:szCs w:val="24"/>
+        </w:rPr>
+      </w:pPr>
+    </w:p>
+    <w:p>
+      <w:pPr>
+        <w:spacing w:after="40"/>
+        <w:rPr>
+          <w:sz w:val="24"/>
+          <w:szCs w:val="24"/>
+        </w:rPr>
+      </w:pPr>
+      <w:r>
+        <w:rPr>
+          <w:rFonts w:ascii="Arial" w:eastAsia="Arial" w:hAnsi="Arial" w:cs="Arial"/>
+          <w:b/>
+          <w:bCs/>
+          <w:sz w:val="24"/>
+          <w:szCs w:val="24"/>
+        </w:rPr>
+        <w:t>Incidencias controladas:</w:t>
+      </w:r>
+    </w:p>
+    <w:p>
+      <w:pPr>
+        <w:pStyle w:val="Prrafodelista"/>
+        <w:numPr>
+          <w:ilvl w:val="0"/>
+          <w:numId w:val="3"/>
+        </w:numPr>
+        <w:spacing w:after="40"/>
+        <w:rPr>
+          <w:rFonts w:ascii="Arial" w:eastAsia="Arial" w:hAnsi="Arial" w:cs="Arial"/>
+          <w:sz w:val="24"/>
+          <w:szCs w:val="24"/>
+        </w:rPr>
+      </w:pPr>
+      <w:r>
+        <w:rPr>
+          <w:rFonts w:ascii="Arial" w:eastAsia="Arial" w:hAnsi="Arial" w:cs="Arial"/>
+          <w:sz w:val="24"/>
+          <w:szCs w:val="24"/>
+        </w:rPr>
+        <w:t xml:space="preserve">"DHCP server </w:t>
+      </w:r>
+      <w:proofErr w:type="spellStart"/>
+      <w:r>
+        <w:rPr>
+          <w:rFonts w:ascii="Arial" w:eastAsia="Arial" w:hAnsi="Arial" w:cs="Arial"/>
+          <w:sz w:val="24"/>
+          <w:szCs w:val="24"/>
+        </w:rPr>
+        <w:t>already</w:t>
+      </w:r>
+      <w:proofErr w:type="spellEnd"/>
+      <w:r>
+        <w:rPr>
+          <w:rFonts w:ascii="Arial" w:eastAsia="Arial" w:hAnsi="Arial" w:cs="Arial"/>
+          <w:sz w:val="24"/>
+          <w:szCs w:val="24"/>
+        </w:rPr>
+        <w:t xml:space="preserve"> </w:t>
+      </w:r>
+      <w:proofErr w:type="spellStart"/>
+      <w:r>
+        <w:rPr>
+          <w:rFonts w:ascii="Arial" w:eastAsia="Arial" w:hAnsi="Arial" w:cs="Arial"/>
+          <w:sz w:val="24"/>
+          <w:szCs w:val="24"/>
+        </w:rPr>
+        <w:t>exists</w:t>
+      </w:r>
+      <w:proofErr w:type="spellEnd"/>
+      <w:r>
+        <w:rPr>
+          <w:rFonts w:ascii="Arial" w:eastAsia="Arial" w:hAnsi="Arial" w:cs="Arial"/>
+          <w:sz w:val="24"/>
+          <w:szCs w:val="24"/>
+        </w:rPr>
+        <w:t>" al habilitar el GNS3 VM (conflicto en el adaptador host-</w:t>
+      </w:r>
+      <w:proofErr w:type="spellStart"/>
+      <w:r>
+        <w:rPr>
+          <w:rFonts w:ascii="Arial" w:eastAsia="Arial" w:hAnsi="Arial" w:cs="Arial"/>
+          <w:sz w:val="24"/>
+          <w:szCs w:val="24"/>
+        </w:rPr>
+        <w:t>only</w:t>
+      </w:r>
+      <w:proofErr w:type="spellEnd"/>
+      <w:r>
+        <w:rPr>
+          <w:rFonts w:ascii="Arial" w:eastAsia="Arial" w:hAnsi="Arial" w:cs="Arial"/>
+          <w:sz w:val="24"/>
+          <w:szCs w:val="24"/>
+        </w:rPr>
+        <w:t xml:space="preserve"> de VirtualBox). Solución: eliminado el DHCP duplicado con </w:t>
+      </w:r>
+      <w:proofErr w:type="spellStart"/>
+      <w:r>
+        <w:rPr>
+          <w:rFonts w:ascii="Arial" w:eastAsia="Arial" w:hAnsi="Arial" w:cs="Arial"/>
+          <w:sz w:val="24"/>
+          <w:szCs w:val="24"/>
+        </w:rPr>
+        <w:t>VBoxManage</w:t>
+      </w:r>
+      <w:proofErr w:type="spellEnd"/>
+      <w:r>
+        <w:rPr>
+          <w:rFonts w:ascii="Arial" w:eastAsia="Arial" w:hAnsi="Arial" w:cs="Arial"/>
+          <w:sz w:val="24"/>
+          <w:szCs w:val="24"/>
+        </w:rPr>
+        <w:t xml:space="preserve"> </w:t>
+      </w:r>
+      <w:proofErr w:type="spellStart"/>
+      <w:r>
+        <w:rPr>
+          <w:rFonts w:ascii="Arial" w:eastAsia="Arial" w:hAnsi="Arial" w:cs="Arial"/>
+          <w:sz w:val="24"/>
+          <w:szCs w:val="24"/>
+        </w:rPr>
+        <w:t>dhcpserver</w:t>
+      </w:r>
+      <w:proofErr w:type="spellEnd"/>
+      <w:r>
+        <w:rPr>
+          <w:rFonts w:ascii="Arial" w:eastAsia="Arial" w:hAnsi="Arial" w:cs="Arial"/>
+          <w:sz w:val="24"/>
+          <w:szCs w:val="24"/>
+        </w:rPr>
+        <w:t xml:space="preserve"> </w:t>
+      </w:r>
+      <w:proofErr w:type="spellStart"/>
+      <w:r>
+        <w:rPr>
+          <w:rFonts w:ascii="Arial" w:eastAsia="Arial" w:hAnsi="Arial" w:cs="Arial"/>
+          <w:sz w:val="24"/>
+          <w:szCs w:val="24"/>
+        </w:rPr>
+        <w:t>remove</w:t>
+      </w:r>
+      <w:proofErr w:type="spellEnd"/>
+      <w:r>
+        <w:rPr>
+          <w:rFonts w:ascii="Arial" w:eastAsia="Arial" w:hAnsi="Arial" w:cs="Arial"/>
+          <w:sz w:val="24"/>
+          <w:szCs w:val="24"/>
+        </w:rPr>
+        <w:t xml:space="preserve"> para que GNS3 crease el suyo.</w:t>
+      </w:r>
+    </w:p>
+    <w:p>
+      <w:pPr>
+        <w:spacing w:after="40"/>
+        <w:ind w:left="454"/>
+        <w:rPr>
+          <w:sz w:val="24"/>
+          <w:szCs w:val="24"/>
+        </w:rPr>
+      </w:pPr>
+      <w:r>
+        <w:rPr>
+          <w:rFonts w:ascii="Arial" w:eastAsia="Arial" w:hAnsi="Arial" w:cs="Arial"/>
+          <w:sz w:val="24"/>
+          <w:szCs w:val="24"/>
+        </w:rPr>
+        <w:t>2. Sin aceleración KVM (/</w:t>
+      </w:r>
+      <w:proofErr w:type="spellStart"/>
+      <w:r>
+        <w:rPr>
+          <w:rFonts w:ascii="Arial" w:eastAsia="Arial" w:hAnsi="Arial" w:cs="Arial"/>
+          <w:sz w:val="24"/>
+          <w:szCs w:val="24"/>
+        </w:rPr>
+        <w:t>dev</w:t>
+      </w:r>
+      <w:proofErr w:type="spellEnd"/>
+      <w:r>
+        <w:rPr>
+          <w:rFonts w:ascii="Arial" w:eastAsia="Arial" w:hAnsi="Arial" w:cs="Arial"/>
+          <w:sz w:val="24"/>
+          <w:szCs w:val="24"/>
+        </w:rPr>
+        <w:t>/</w:t>
+      </w:r>
+      <w:proofErr w:type="spellStart"/>
+      <w:r>
+        <w:rPr>
+          <w:rFonts w:ascii="Arial" w:eastAsia="Arial" w:hAnsi="Arial" w:cs="Arial"/>
+          <w:sz w:val="24"/>
+          <w:szCs w:val="24"/>
+        </w:rPr>
+        <w:t>kvm</w:t>
+      </w:r>
+      <w:proofErr w:type="spellEnd"/>
+      <w:r>
+        <w:rPr>
+          <w:rFonts w:ascii="Arial" w:eastAsia="Arial" w:hAnsi="Arial" w:cs="Arial"/>
+          <w:sz w:val="24"/>
+          <w:szCs w:val="24"/>
+        </w:rPr>
+        <w:t xml:space="preserve"> inexistente; sin virtualización anidada efectiva en el host). Solución: </w:t>
+      </w:r>
+      <w:proofErr w:type="spellStart"/>
+      <w:r>
+        <w:rPr>
+          <w:rFonts w:ascii="Arial" w:eastAsia="Arial" w:hAnsi="Arial" w:cs="Arial"/>
+          <w:sz w:val="24"/>
+          <w:szCs w:val="24"/>
+        </w:rPr>
+        <w:t>enable_kvm</w:t>
+      </w:r>
+      <w:proofErr w:type="spellEnd"/>
+      <w:r>
+        <w:rPr>
+          <w:rFonts w:ascii="Arial" w:eastAsia="Arial" w:hAnsi="Arial" w:cs="Arial"/>
+          <w:sz w:val="24"/>
+          <w:szCs w:val="24"/>
+        </w:rPr>
+        <w:t xml:space="preserve"> = false en gns3_server.conf; </w:t>
+      </w:r>
+      <w:proofErr w:type="spellStart"/>
+      <w:r>
+        <w:rPr>
+          <w:rFonts w:ascii="Arial" w:eastAsia="Arial" w:hAnsi="Arial" w:cs="Arial"/>
+          <w:sz w:val="24"/>
+          <w:szCs w:val="24"/>
+        </w:rPr>
+        <w:t>pfSense</w:t>
+      </w:r>
+      <w:proofErr w:type="spellEnd"/>
+      <w:r>
+        <w:rPr>
+          <w:rFonts w:ascii="Arial" w:eastAsia="Arial" w:hAnsi="Arial" w:cs="Arial"/>
+          <w:sz w:val="24"/>
+          <w:szCs w:val="24"/>
+        </w:rPr>
+        <w:t xml:space="preserve"> se ejecuta por emulación (más lento pero funcional).</w:t>
+      </w:r>
+    </w:p>
+    <w:p>
+      <w:pPr>
+        <w:spacing w:after="40"/>
+        <w:ind w:left="454"/>
+        <w:rPr>
+          <w:rFonts w:ascii="Arial" w:eastAsia="Arial" w:hAnsi="Arial" w:cs="Arial"/>
+          <w:sz w:val="24"/>
+          <w:szCs w:val="24"/>
+        </w:rPr>
+      </w:pPr>
+      <w:r>
+        <w:rPr>
+          <w:rFonts w:ascii="Arial" w:eastAsia="Arial" w:hAnsi="Arial" w:cs="Arial"/>
+          <w:sz w:val="24"/>
+          <w:szCs w:val="24"/>
+        </w:rPr>
+        <w:t xml:space="preserve">3. El instalador de </w:t>
+      </w:r>
+      <w:proofErr w:type="spellStart"/>
+      <w:r>
+        <w:rPr>
+          <w:rFonts w:ascii="Arial" w:eastAsia="Arial" w:hAnsi="Arial" w:cs="Arial"/>
+          <w:sz w:val="24"/>
+          <w:szCs w:val="24"/>
+        </w:rPr>
+        <w:t>pfSense</w:t>
+      </w:r>
+      <w:proofErr w:type="spellEnd"/>
+      <w:r>
+        <w:rPr>
+          <w:rFonts w:ascii="Arial" w:eastAsia="Arial" w:hAnsi="Arial" w:cs="Arial"/>
+          <w:sz w:val="24"/>
+          <w:szCs w:val="24"/>
+        </w:rPr>
+        <w:t xml:space="preserve"> 2.9.0 es online y requería conexión con </w:t>
+      </w:r>
+      <w:proofErr w:type="spellStart"/>
+      <w:r>
+        <w:rPr>
+          <w:rFonts w:ascii="Arial" w:eastAsia="Arial" w:hAnsi="Arial" w:cs="Arial"/>
+          <w:sz w:val="24"/>
+          <w:szCs w:val="24"/>
+        </w:rPr>
+        <w:t>Netgate</w:t>
+      </w:r>
+      <w:proofErr w:type="spellEnd"/>
+      <w:r>
+        <w:rPr>
+          <w:rFonts w:ascii="Arial" w:eastAsia="Arial" w:hAnsi="Arial" w:cs="Arial"/>
+          <w:sz w:val="24"/>
+          <w:szCs w:val="24"/>
+        </w:rPr>
+        <w:t>. Solución: WAN (em0) conectada al nodo NAT para dar internet; instalada la edición CE (sin suscripción Plus).</w:t>
+      </w:r>
+    </w:p>
+    <w:p>
+      <w:pPr>
+        <w:spacing w:after="40"/>
+        <w:ind w:left="454"/>
+        <w:jc w:val="center"/>
+        <w:rPr>
+          <w:sz w:val="24"/>
+          <w:szCs w:val="24"/>
+        </w:rPr>
+      </w:pPr>
+      <w:r>
+        <w:rPr>
+          <w:noProof/>
+          <w:sz w:val="24"/>
+          <w:szCs w:val="24"/>
+        </w:rPr>
+        <w:drawing>
+          <wp:inline distT="0" distB="0" distL="0" distR="0">
+            <wp:extent cx="4276725" cy="2712162"/>
+            <wp:effectExtent l="0" t="0" r="0" b="0"/>
+            <wp:docPr id="5" name="Imagen 5"/>
+            <wp:cNvGraphicFramePr>
+              <a:graphicFrameLocks xmlns:a="http://schemas.openxmlformats.org/drawingml/2006/main" noChangeAspect="1"/>
+            </wp:cNvGraphicFramePr>
+            <a:graphic xmlns:a="http://schemas.openxmlformats.org/drawingml/2006/main">
+              <a:graphicData uri="http://schemas.openxmlformats.org/drawingml/2006/picture">
+                <pic:pic xmlns:pic="http://schemas.openxmlformats.org/drawingml/2006/picture">
+                  <pic:nvPicPr>
+                    <pic:cNvPr id="5" name="no funciona la red.JPG"/>
+                    <pic:cNvPicPr/>
+                  </pic:nvPicPr>
+                  <pic:blipFill>
+                    <a:blip r:embed="rId15">
+                      <a:extLst>
+                        <a:ext uri="{28A0092B-C50C-407E-A947-70E740481C1C}">
+                          <a14:useLocalDpi xmlns:a14="http://schemas.microsoft.com/office/drawing/2010/main" val="0"/>
+                        </a:ext>
+                      </a:extLst>
+                    </a:blip>
+                    <a:stretch>
+                      <a:fillRect/>
+                    </a:stretch>
+                  </pic:blipFill>
+                  <pic:spPr>
+                    <a:xfrm>
+                      <a:off x="0" y="0"/>
+                      <a:ext cx="4292008" cy="2721854"/>
+                    </a:xfrm>
+                    <a:prstGeom prst="rect">
+                      <a:avLst/>
+                    </a:prstGeom>
+                  </pic:spPr>
+                </pic:pic>
+              </a:graphicData>
+            </a:graphic>
+          </wp:inline>
+        </w:drawing>
+      </w:r>
+    </w:p>
+    <w:p>
+      <w:pPr>
+        <w:spacing w:line="360" w:lineRule="auto"/>
+        <w:jc w:val="center"/>
+        <w:rPr>
+          <w:color w:val="000000"/>
+        </w:rPr>
+      </w:pPr>
+      <w:r>
+        <w:rPr>
+          <w:color w:val="000000"/>
+        </w:rPr>
+        <w:t xml:space="preserve">Ilustración </w:t>
+      </w:r>
+      <w:r>
+        <w:rPr>
+          <w:color w:val="000000"/>
+        </w:rPr>
+        <w:t>8</w:t>
+      </w:r>
+      <w:r>
+        <w:rPr>
+          <w:color w:val="000000"/>
+        </w:rPr>
+        <w:t xml:space="preserve">: </w:t>
+      </w:r>
+      <w:r>
+        <w:rPr>
+          <w:color w:val="000000"/>
+        </w:rPr>
+        <w:t xml:space="preserve">Conexión red </w:t>
+      </w:r>
+      <w:proofErr w:type="spellStart"/>
+      <w:r>
+        <w:rPr>
+          <w:color w:val="000000"/>
+        </w:rPr>
+        <w:t>pfsense</w:t>
+      </w:r>
+      <w:proofErr w:type="spellEnd"/>
+    </w:p>
+    <w:p>
+      <w:pPr>
+        <w:spacing w:after="40"/>
+        <w:ind w:left="454"/>
+        <w:rPr>
+          <w:sz w:val="24"/>
+          <w:szCs w:val="24"/>
+        </w:rPr>
+      </w:pPr>
+    </w:p>
+    <w:p>
+      <w:pPr>
+        <w:spacing w:after="60"/>
+        <w:rPr>
+          <w:sz w:val="24"/>
+          <w:szCs w:val="24"/>
+        </w:rPr>
+      </w:pPr>
+      <w:r>
+        <w:rPr>
+          <w:rFonts w:ascii="Arial" w:eastAsia="Arial" w:hAnsi="Arial" w:cs="Arial"/>
+          <w:b/>
+          <w:bCs/>
+          <w:sz w:val="24"/>
+          <w:szCs w:val="24"/>
+        </w:rPr>
+        <w:t xml:space="preserve">Requisitos mínimos: </w:t>
+      </w:r>
+      <w:r>
+        <w:rPr>
+          <w:rFonts w:ascii="Arial" w:eastAsia="Arial" w:hAnsi="Arial" w:cs="Arial"/>
+          <w:sz w:val="24"/>
+          <w:szCs w:val="24"/>
+        </w:rPr>
+        <w:t xml:space="preserve">VirtualBox + GNS3 3.x, GNS3 VM (6 GB / 2 </w:t>
+      </w:r>
+      <w:proofErr w:type="spellStart"/>
+      <w:r>
+        <w:rPr>
+          <w:rFonts w:ascii="Arial" w:eastAsia="Arial" w:hAnsi="Arial" w:cs="Arial"/>
+          <w:sz w:val="24"/>
+          <w:szCs w:val="24"/>
+        </w:rPr>
+        <w:t>vCPU</w:t>
+      </w:r>
+      <w:proofErr w:type="spellEnd"/>
+      <w:r>
+        <w:rPr>
+          <w:rFonts w:ascii="Arial" w:eastAsia="Arial" w:hAnsi="Arial" w:cs="Arial"/>
+          <w:sz w:val="24"/>
+          <w:szCs w:val="24"/>
+        </w:rPr>
+        <w:t xml:space="preserve">), </w:t>
+      </w:r>
+      <w:proofErr w:type="spellStart"/>
+      <w:r>
+        <w:rPr>
+          <w:rFonts w:ascii="Arial" w:eastAsia="Arial" w:hAnsi="Arial" w:cs="Arial"/>
+          <w:sz w:val="24"/>
+          <w:szCs w:val="24"/>
+        </w:rPr>
+        <w:t>pfSense</w:t>
+      </w:r>
+      <w:proofErr w:type="spellEnd"/>
+      <w:r>
+        <w:rPr>
+          <w:rFonts w:ascii="Arial" w:eastAsia="Arial" w:hAnsi="Arial" w:cs="Arial"/>
+          <w:sz w:val="24"/>
+          <w:szCs w:val="24"/>
+        </w:rPr>
+        <w:t xml:space="preserve"> CE 2.9.0, ~8 GB de RAM libres.</w:t>
+      </w:r>
+    </w:p>
+    <w:p>
+      <w:pPr>
+        <w:pStyle w:val="Ttulo1"/>
+        <w:spacing w:before="240"/>
+        <w:rPr>
+          <w:sz w:val="24"/>
+          <w:szCs w:val="24"/>
+        </w:rPr>
+      </w:pPr>
+      <w:r>
+        <w:rPr>
+          <w:rFonts w:ascii="Arial" w:eastAsia="Arial" w:hAnsi="Arial" w:cs="Arial"/>
+          <w:sz w:val="24"/>
+          <w:szCs w:val="24"/>
+        </w:rPr>
+        <w:t>Desarrollo de la solución</w:t>
+      </w:r>
+    </w:p>
+    <w:p>
+      <w:pPr>
+        <w:pStyle w:val="Ttulo2"/>
+        <w:spacing w:before="160"/>
+        <w:rPr>
+          <w:sz w:val="24"/>
+          <w:szCs w:val="24"/>
+        </w:rPr>
+      </w:pPr>
+      <w:r>
+        <w:rPr>
+          <w:rFonts w:ascii="Arial" w:eastAsia="Arial" w:hAnsi="Arial" w:cs="Arial"/>
+          <w:sz w:val="24"/>
+          <w:szCs w:val="24"/>
+        </w:rPr>
+        <w:t>R01F01T02 — Etiquetado 802.1Q en el conmutador</w:t>
+      </w:r>
+    </w:p>
+    <w:p>
+      <w:pPr>
+        <w:spacing w:after="60"/>
+        <w:rPr>
+          <w:sz w:val="24"/>
+          <w:szCs w:val="24"/>
+        </w:rPr>
+      </w:pPr>
+      <w:r>
+        <w:rPr>
+          <w:rFonts w:ascii="Arial" w:eastAsia="Arial" w:hAnsi="Arial" w:cs="Arial"/>
+          <w:b/>
+          <w:bCs/>
+          <w:sz w:val="24"/>
+          <w:szCs w:val="24"/>
+        </w:rPr>
+        <w:t xml:space="preserve">Objetivo: </w:t>
+      </w:r>
+      <w:r>
+        <w:rPr>
+          <w:rFonts w:ascii="Arial" w:eastAsia="Arial" w:hAnsi="Arial" w:cs="Arial"/>
+          <w:sz w:val="24"/>
+          <w:szCs w:val="24"/>
+        </w:rPr>
+        <w:t xml:space="preserve">transportar las </w:t>
+      </w:r>
+      <w:proofErr w:type="spellStart"/>
+      <w:r>
+        <w:rPr>
+          <w:rFonts w:ascii="Arial" w:eastAsia="Arial" w:hAnsi="Arial" w:cs="Arial"/>
+          <w:sz w:val="24"/>
+          <w:szCs w:val="24"/>
+        </w:rPr>
+        <w:t>VLANs</w:t>
+      </w:r>
+      <w:proofErr w:type="spellEnd"/>
+      <w:r>
+        <w:rPr>
+          <w:rFonts w:ascii="Arial" w:eastAsia="Arial" w:hAnsi="Arial" w:cs="Arial"/>
+          <w:sz w:val="24"/>
+          <w:szCs w:val="24"/>
+        </w:rPr>
+        <w:t xml:space="preserve"> de las zonas de confianza hacia el cortafuegos por un enlace troncal 802.1Q.</w:t>
+      </w:r>
+    </w:p>
+    <w:p>
+      <w:pPr>
+        <w:spacing w:after="40"/>
+        <w:rPr>
+          <w:sz w:val="24"/>
+          <w:szCs w:val="24"/>
+        </w:rPr>
+      </w:pPr>
+      <w:r>
+        <w:rPr>
+          <w:rFonts w:ascii="Arial" w:eastAsia="Arial" w:hAnsi="Arial" w:cs="Arial"/>
+          <w:b/>
+          <w:bCs/>
+          <w:sz w:val="24"/>
+          <w:szCs w:val="24"/>
+        </w:rPr>
+        <w:t>Configuración realizada:</w:t>
+      </w:r>
+    </w:p>
+    <w:p>
+      <w:pPr>
+        <w:spacing w:after="40"/>
+        <w:ind w:left="454"/>
+        <w:rPr>
+          <w:sz w:val="24"/>
+          <w:szCs w:val="24"/>
+        </w:rPr>
+      </w:pPr>
+      <w:r>
+        <w:rPr>
+          <w:rFonts w:ascii="Arial" w:eastAsia="Arial" w:hAnsi="Arial" w:cs="Arial"/>
+          <w:sz w:val="24"/>
+          <w:szCs w:val="24"/>
+        </w:rPr>
+        <w:t xml:space="preserve">– Ethernet </w:t>
+      </w:r>
+      <w:proofErr w:type="spellStart"/>
+      <w:r>
+        <w:rPr>
+          <w:rFonts w:ascii="Arial" w:eastAsia="Arial" w:hAnsi="Arial" w:cs="Arial"/>
+          <w:sz w:val="24"/>
+          <w:szCs w:val="24"/>
+        </w:rPr>
+        <w:t>switch</w:t>
+      </w:r>
+      <w:proofErr w:type="spellEnd"/>
+      <w:r>
+        <w:rPr>
+          <w:rFonts w:ascii="Arial" w:eastAsia="Arial" w:hAnsi="Arial" w:cs="Arial"/>
+          <w:sz w:val="24"/>
+          <w:szCs w:val="24"/>
+        </w:rPr>
+        <w:t xml:space="preserve"> (Switch1) en GNS3.</w:t>
+      </w:r>
+    </w:p>
+    <w:p>
+      <w:pPr>
+        <w:spacing w:after="40"/>
+        <w:ind w:left="454"/>
+        <w:rPr>
+          <w:sz w:val="24"/>
+          <w:szCs w:val="24"/>
+        </w:rPr>
+      </w:pPr>
+      <w:r>
+        <w:rPr>
+          <w:rFonts w:ascii="Arial" w:eastAsia="Arial" w:hAnsi="Arial" w:cs="Arial"/>
+          <w:sz w:val="24"/>
+          <w:szCs w:val="24"/>
+        </w:rPr>
+        <w:t xml:space="preserve">– Puerto hacia </w:t>
+      </w:r>
+      <w:proofErr w:type="spellStart"/>
+      <w:r>
+        <w:rPr>
+          <w:rFonts w:ascii="Arial" w:eastAsia="Arial" w:hAnsi="Arial" w:cs="Arial"/>
+          <w:sz w:val="24"/>
+          <w:szCs w:val="24"/>
+        </w:rPr>
+        <w:t>pfSense</w:t>
+      </w:r>
+      <w:proofErr w:type="spellEnd"/>
+      <w:r>
+        <w:rPr>
+          <w:rFonts w:ascii="Arial" w:eastAsia="Arial" w:hAnsi="Arial" w:cs="Arial"/>
+          <w:sz w:val="24"/>
+          <w:szCs w:val="24"/>
+        </w:rPr>
+        <w:t xml:space="preserve"> (em1): tipo dot1q (troncal) — transporta todas las </w:t>
+      </w:r>
+      <w:proofErr w:type="spellStart"/>
+      <w:r>
+        <w:rPr>
+          <w:rFonts w:ascii="Arial" w:eastAsia="Arial" w:hAnsi="Arial" w:cs="Arial"/>
+          <w:sz w:val="24"/>
+          <w:szCs w:val="24"/>
+        </w:rPr>
+        <w:t>VLANs</w:t>
+      </w:r>
+      <w:proofErr w:type="spellEnd"/>
+      <w:r>
+        <w:rPr>
+          <w:rFonts w:ascii="Arial" w:eastAsia="Arial" w:hAnsi="Arial" w:cs="Arial"/>
+          <w:sz w:val="24"/>
+          <w:szCs w:val="24"/>
+        </w:rPr>
+        <w:t xml:space="preserve"> etiquetadas.</w:t>
+      </w:r>
+    </w:p>
+    <w:p>
+      <w:pPr>
+        <w:spacing w:after="40"/>
+        <w:ind w:left="454"/>
+        <w:rPr>
+          <w:sz w:val="24"/>
+          <w:szCs w:val="24"/>
+        </w:rPr>
+      </w:pPr>
+      <w:r>
+        <w:rPr>
+          <w:rFonts w:ascii="Arial" w:eastAsia="Arial" w:hAnsi="Arial" w:cs="Arial"/>
+          <w:sz w:val="24"/>
+          <w:szCs w:val="24"/>
+        </w:rPr>
+        <w:t xml:space="preserve">– Puerto hacia PC1 (VPCS): tipo </w:t>
+      </w:r>
+      <w:proofErr w:type="spellStart"/>
+      <w:r>
+        <w:rPr>
+          <w:rFonts w:ascii="Arial" w:eastAsia="Arial" w:hAnsi="Arial" w:cs="Arial"/>
+          <w:sz w:val="24"/>
+          <w:szCs w:val="24"/>
+        </w:rPr>
+        <w:t>access</w:t>
+      </w:r>
+      <w:proofErr w:type="spellEnd"/>
+      <w:r>
+        <w:rPr>
+          <w:rFonts w:ascii="Arial" w:eastAsia="Arial" w:hAnsi="Arial" w:cs="Arial"/>
+          <w:sz w:val="24"/>
+          <w:szCs w:val="24"/>
+        </w:rPr>
+        <w:t>, VLAN 10 (zona Usuarios).</w:t>
+      </w:r>
+    </w:p>
+    <w:p>
+      <w:pPr>
+        <w:spacing w:after="60"/>
+        <w:rPr>
+          <w:rFonts w:ascii="Arial" w:eastAsia="Arial" w:hAnsi="Arial" w:cs="Arial"/>
+          <w:sz w:val="24"/>
+          <w:szCs w:val="24"/>
+        </w:rPr>
+      </w:pPr>
+      <w:r>
+        <w:rPr>
+          <w:rFonts w:ascii="Arial" w:eastAsia="Arial" w:hAnsi="Arial" w:cs="Arial"/>
+          <w:b/>
+          <w:bCs/>
+          <w:sz w:val="24"/>
+          <w:szCs w:val="24"/>
+        </w:rPr>
+        <w:t xml:space="preserve">Evidencia: </w:t>
+      </w:r>
+      <w:r>
+        <w:rPr>
+          <w:rFonts w:ascii="Arial" w:eastAsia="Arial" w:hAnsi="Arial" w:cs="Arial"/>
+          <w:sz w:val="24"/>
+          <w:szCs w:val="24"/>
+        </w:rPr>
+        <w:t xml:space="preserve">configuración de puertos del </w:t>
+      </w:r>
+      <w:proofErr w:type="spellStart"/>
+      <w:r>
+        <w:rPr>
+          <w:rFonts w:ascii="Arial" w:eastAsia="Arial" w:hAnsi="Arial" w:cs="Arial"/>
+          <w:sz w:val="24"/>
+          <w:szCs w:val="24"/>
+        </w:rPr>
+        <w:t>switch</w:t>
+      </w:r>
+      <w:proofErr w:type="spellEnd"/>
+      <w:r>
+        <w:rPr>
+          <w:rFonts w:ascii="Arial" w:eastAsia="Arial" w:hAnsi="Arial" w:cs="Arial"/>
+          <w:sz w:val="24"/>
+          <w:szCs w:val="24"/>
+        </w:rPr>
+        <w:t xml:space="preserve"> en GNS3 </w:t>
+      </w:r>
+    </w:p>
+    <w:p>
+      <w:pPr>
+        <w:spacing w:after="60"/>
+        <w:rPr>
+          <w:sz w:val="24"/>
+          <w:szCs w:val="24"/>
+        </w:rPr>
+      </w:pPr>
+      <w:r>
+        <w:rPr>
+          <w:noProof/>
+          <w:sz w:val="24"/>
+          <w:szCs w:val="24"/>
+        </w:rPr>
+        <w:drawing>
+          <wp:inline distT="0" distB="0" distL="0" distR="0">
+            <wp:extent cx="4905375" cy="2603229"/>
+            <wp:effectExtent l="0" t="0" r="0" b="6985"/>
+            <wp:docPr id="6" name="Imagen 6"/>
+            <wp:cNvGraphicFramePr>
+              <a:graphicFrameLocks xmlns:a="http://schemas.openxmlformats.org/drawingml/2006/main" noChangeAspect="1"/>
+            </wp:cNvGraphicFramePr>
+            <a:graphic xmlns:a="http://schemas.openxmlformats.org/drawingml/2006/main">
+              <a:graphicData uri="http://schemas.openxmlformats.org/drawingml/2006/picture">
+                <pic:pic xmlns:pic="http://schemas.openxmlformats.org/drawingml/2006/picture">
+                  <pic:nvPicPr>
+                    <pic:cNvPr id="6" name="Topologia.JPG"/>
+                    <pic:cNvPicPr/>
+                  </pic:nvPicPr>
+                  <pic:blipFill>
+                    <a:blip r:embed="rId16" cstate="print">
+                      <a:extLst>
+                        <a:ext uri="{28A0092B-C50C-407E-A947-70E740481C1C}">
+                          <a14:useLocalDpi xmlns:a14="http://schemas.microsoft.com/office/drawing/2010/main" val="0"/>
+                        </a:ext>
+                      </a:extLst>
+                    </a:blip>
+                    <a:stretch>
+                      <a:fillRect/>
+                    </a:stretch>
+                  </pic:blipFill>
+                  <pic:spPr>
+                    <a:xfrm>
+                      <a:off x="0" y="0"/>
+                      <a:ext cx="4911229" cy="2606335"/>
+                    </a:xfrm>
+                    <a:prstGeom prst="rect">
+                      <a:avLst/>
+                    </a:prstGeom>
+                  </pic:spPr>
+                </pic:pic>
+              </a:graphicData>
+            </a:graphic>
+          </wp:inline>
+        </w:drawing>
+      </w:r>
+    </w:p>
+    <w:p>
+      <w:pPr>
+        <w:spacing w:line="360" w:lineRule="auto"/>
+        <w:jc w:val="center"/>
+        <w:rPr>
+          <w:color w:val="000000"/>
+        </w:rPr>
+      </w:pPr>
+      <w:r>
+        <w:rPr>
+          <w:color w:val="000000"/>
+        </w:rPr>
+        <w:t xml:space="preserve">Ilustración </w:t>
+      </w:r>
+      <w:r>
+        <w:rPr>
+          <w:color w:val="000000"/>
+        </w:rPr>
+        <w:t>9</w:t>
+      </w:r>
+      <w:r>
+        <w:rPr>
+          <w:color w:val="000000"/>
+        </w:rPr>
+        <w:t xml:space="preserve">: </w:t>
+      </w:r>
+      <w:r>
+        <w:rPr>
+          <w:color w:val="000000"/>
+        </w:rPr>
+        <w:t>Proceso topología</w:t>
       </w:r>
       <w:bookmarkStart w:id="0" w:name="_GoBack"/>
       <w:bookmarkEnd w:id="0"/>
     </w:p>
     <w:p>
       <w:pPr>
+        <w:spacing w:after="60"/>
+        <w:rPr>
+          <w:sz w:val="24"/>
+          <w:szCs w:val="24"/>
+        </w:rPr>
+      </w:pPr>
+      <w:r>
+        <w:rPr>
+          <w:rFonts w:ascii="Arial" w:eastAsia="Arial" w:hAnsi="Arial" w:cs="Arial"/>
+          <w:b/>
+          <w:bCs/>
+          <w:sz w:val="24"/>
+          <w:szCs w:val="24"/>
+        </w:rPr>
+        <w:t xml:space="preserve">Prueba (P): </w:t>
+      </w:r>
+      <w:r>
+        <w:rPr>
+          <w:rFonts w:ascii="Arial" w:eastAsia="Arial" w:hAnsi="Arial" w:cs="Arial"/>
+          <w:sz w:val="24"/>
+          <w:szCs w:val="24"/>
+        </w:rPr>
+        <w:t>Se</w:t>
+      </w:r>
+      <w:r>
+        <w:rPr>
+          <w:rFonts w:ascii="Arial" w:eastAsia="Arial" w:hAnsi="Arial" w:cs="Arial"/>
+          <w:sz w:val="24"/>
+          <w:szCs w:val="24"/>
+        </w:rPr>
+        <w:t xml:space="preserve"> validará con el ping de PC1 a su </w:t>
+      </w:r>
+      <w:proofErr w:type="spellStart"/>
+      <w:r>
+        <w:rPr>
+          <w:rFonts w:ascii="Arial" w:eastAsia="Arial" w:hAnsi="Arial" w:cs="Arial"/>
+          <w:sz w:val="24"/>
+          <w:szCs w:val="24"/>
+        </w:rPr>
+        <w:t>gateway</w:t>
+      </w:r>
+      <w:proofErr w:type="spellEnd"/>
+      <w:r>
+        <w:rPr>
+          <w:rFonts w:ascii="Arial" w:eastAsia="Arial" w:hAnsi="Arial" w:cs="Arial"/>
+          <w:sz w:val="24"/>
+          <w:szCs w:val="24"/>
+        </w:rPr>
+        <w:t xml:space="preserve"> tras crear la VLAN 10 en </w:t>
+      </w:r>
+      <w:proofErr w:type="spellStart"/>
+      <w:r>
+        <w:rPr>
+          <w:rFonts w:ascii="Arial" w:eastAsia="Arial" w:hAnsi="Arial" w:cs="Arial"/>
+          <w:sz w:val="24"/>
+          <w:szCs w:val="24"/>
+        </w:rPr>
+        <w:t>pfSense</w:t>
+      </w:r>
+      <w:proofErr w:type="spellEnd"/>
+      <w:r>
+        <w:rPr>
+          <w:rFonts w:ascii="Arial" w:eastAsia="Arial" w:hAnsi="Arial" w:cs="Arial"/>
+          <w:sz w:val="24"/>
+          <w:szCs w:val="24"/>
+        </w:rPr>
+        <w:t xml:space="preserve"> (R01F01T01).</w:t>
+      </w:r>
+    </w:p>
+    <w:p>
+      <w:pPr>
+        <w:spacing w:after="60"/>
+        <w:rPr>
+          <w:sz w:val="24"/>
+          <w:szCs w:val="24"/>
+        </w:rPr>
+      </w:pPr>
+      <w:r>
+        <w:rPr>
+          <w:rFonts w:ascii="Arial" w:eastAsia="Arial" w:hAnsi="Arial" w:cs="Arial"/>
+          <w:b/>
+          <w:bCs/>
+          <w:sz w:val="24"/>
+          <w:szCs w:val="24"/>
+        </w:rPr>
+        <w:t xml:space="preserve">Incidencias: </w:t>
+      </w:r>
+      <w:r>
+        <w:rPr>
+          <w:rFonts w:ascii="Arial" w:eastAsia="Arial" w:hAnsi="Arial" w:cs="Arial"/>
+          <w:sz w:val="24"/>
+          <w:szCs w:val="24"/>
+        </w:rPr>
+        <w:t>ninguna.</w:t>
+      </w:r>
+    </w:p>
+    <w:p>
+      <w:pPr>
         <w:spacing w:line="360" w:lineRule="auto"/>
         <w:jc w:val="both"/>
         <w:rPr>
@@ -20487,13 +21973,6 @@
           <w:szCs w:val="32"/>
         </w:rPr>
       </w:pPr>
-      <w:r>
-        <w:rPr>
-          <w:rFonts w:ascii="Arial" w:eastAsia="Arial" w:hAnsi="Arial" w:cs="Arial"/>
-          <w:color w:val="000000"/>
-        </w:rPr>
-        <w:t>La metodología seguida es iterativa</w:t>
-      </w:r>
     </w:p>
     <w:p>
       <w:pPr>
@@ -20686,46 +22165,52 @@
           <w:szCs w:val="32"/>
         </w:rPr>
       </w:pPr>
-    </w:p>
-    <w:p>
-      <w:pPr>
-        <w:spacing w:line="360" w:lineRule="auto"/>
-        <w:jc w:val="both"/>
+      <w:r>
         <w:rPr>
           <w:rFonts w:ascii="Arial" w:eastAsia="Arial" w:hAnsi="Arial" w:cs="Arial"/>
           <w:color w:val="000000"/>
           <w:sz w:val="32"/>
           <w:szCs w:val="32"/>
         </w:rPr>
-      </w:pPr>
-      <w:r>
+        <w:t>DESPLIEGUE E INSTALACIÓN</w:t>
+      </w:r>
+    </w:p>
+    <w:p>
+      <w:pPr>
+        <w:spacing w:line="360" w:lineRule="auto"/>
+        <w:jc w:val="both"/>
+        <w:rPr>
+          <w:rFonts w:ascii="Arial" w:eastAsia="Arial" w:hAnsi="Arial" w:cs="Arial"/>
+          <w:color w:val="000000"/>
+        </w:rPr>
+      </w:pPr>
+      <w:r>
+        <w:rPr>
+          <w:rFonts w:ascii="Arial" w:eastAsia="Arial" w:hAnsi="Arial" w:cs="Arial"/>
+          <w:b/>
+          <w:bCs/>
+          <w:color w:val="000000"/>
+        </w:rPr>
+        <w:t>Metodología usada</w:t>
+      </w:r>
+    </w:p>
+    <w:p>
+      <w:pPr>
+        <w:spacing w:line="360" w:lineRule="auto"/>
+        <w:jc w:val="both"/>
         <w:rPr>
           <w:rFonts w:ascii="Arial" w:eastAsia="Arial" w:hAnsi="Arial" w:cs="Arial"/>
           <w:color w:val="000000"/>
           <w:sz w:val="32"/>
           <w:szCs w:val="32"/>
         </w:rPr>
-        <w:lastRenderedPageBreak/>
-        <w:t>DESPLIEGUE E INSTALACIÓN</w:t>
-      </w:r>
-    </w:p>
-    <w:p>
-      <w:pPr>
-        <w:spacing w:line="360" w:lineRule="auto"/>
-        <w:jc w:val="both"/>
-        <w:rPr>
-          <w:rFonts w:ascii="Arial" w:eastAsia="Arial" w:hAnsi="Arial" w:cs="Arial"/>
-          <w:color w:val="000000"/>
-        </w:rPr>
-      </w:pPr>
-      <w:r>
-        <w:rPr>
-          <w:rFonts w:ascii="Arial" w:eastAsia="Arial" w:hAnsi="Arial" w:cs="Arial"/>
-          <w:b/>
-          <w:bCs/>
-          <w:color w:val="000000"/>
-        </w:rPr>
-        <w:t>Metodología usada</w:t>
+      </w:pPr>
+      <w:r>
+        <w:rPr>
+          <w:rFonts w:ascii="Arial" w:eastAsia="Arial" w:hAnsi="Arial" w:cs="Arial"/>
+          <w:color w:val="000000"/>
+        </w:rPr>
+        <w:t>La metodología seguida es iterativa</w:t>
       </w:r>
     </w:p>
     <w:p>
@@ -20739,13 +22224,6 @@
           <w:szCs w:val="32"/>
         </w:rPr>
       </w:pPr>
-      <w:r>
-        <w:rPr>
-          <w:rFonts w:ascii="Arial" w:eastAsia="Arial" w:hAnsi="Arial" w:cs="Arial"/>
-          <w:color w:val="000000"/>
-        </w:rPr>
-        <w:t>La metodología seguida es iterativa</w:t>
-      </w:r>
     </w:p>
     <w:p>
       <w:pPr>
@@ -20938,125 +22416,112 @@
           <w:szCs w:val="32"/>
         </w:rPr>
       </w:pPr>
-    </w:p>
-    <w:p>
-      <w:pPr>
-        <w:spacing w:line="360" w:lineRule="auto"/>
-        <w:jc w:val="both"/>
+      <w:r>
         <w:rPr>
           <w:rFonts w:ascii="Arial" w:eastAsia="Arial" w:hAnsi="Arial" w:cs="Arial"/>
           <w:color w:val="000000"/>
           <w:sz w:val="32"/>
           <w:szCs w:val="32"/>
         </w:rPr>
-      </w:pPr>
-      <w:r>
+        <w:t>TRABAJOS FUTUROS</w:t>
+      </w:r>
+    </w:p>
+    <w:p>
+      <w:pPr>
+        <w:spacing w:line="360" w:lineRule="auto"/>
+        <w:jc w:val="both"/>
+        <w:rPr>
+          <w:rFonts w:ascii="Arial" w:eastAsia="Arial" w:hAnsi="Arial" w:cs="Arial"/>
+          <w:color w:val="000000"/>
+        </w:rPr>
+      </w:pPr>
+      <w:r>
+        <w:rPr>
+          <w:rFonts w:ascii="Arial" w:eastAsia="Arial" w:hAnsi="Arial" w:cs="Arial"/>
+          <w:color w:val="000000"/>
+        </w:rPr>
+        <w:t>Trabajos de ampliación y mejora proyectados.</w:t>
+      </w:r>
+    </w:p>
+    <w:p>
+      <w:pPr>
+        <w:spacing w:line="360" w:lineRule="auto"/>
+        <w:rPr>
+          <w:color w:val="000000"/>
+        </w:rPr>
+      </w:pPr>
+      <w:r>
+        <w:br w:type="page"/>
+      </w:r>
+    </w:p>
+    <w:p>
+      <w:pPr>
+        <w:spacing w:line="360" w:lineRule="auto"/>
+        <w:jc w:val="both"/>
         <w:rPr>
           <w:rFonts w:ascii="Arial" w:eastAsia="Arial" w:hAnsi="Arial" w:cs="Arial"/>
           <w:color w:val="000000"/>
           <w:sz w:val="32"/>
           <w:szCs w:val="32"/>
         </w:rPr>
-        <w:lastRenderedPageBreak/>
-        <w:t>TRABAJOS FUTUROS</w:t>
-      </w:r>
-    </w:p>
-    <w:p>
-      <w:pPr>
-        <w:spacing w:line="360" w:lineRule="auto"/>
-        <w:jc w:val="both"/>
-        <w:rPr>
-          <w:rFonts w:ascii="Arial" w:eastAsia="Arial" w:hAnsi="Arial" w:cs="Arial"/>
-          <w:color w:val="000000"/>
-        </w:rPr>
-      </w:pPr>
-      <w:r>
-        <w:rPr>
-          <w:rFonts w:ascii="Arial" w:eastAsia="Arial" w:hAnsi="Arial" w:cs="Arial"/>
-          <w:color w:val="000000"/>
-        </w:rPr>
-        <w:t>Trabajos de ampliación y mejora proyectados.</w:t>
-      </w:r>
-    </w:p>
-    <w:p>
-      <w:pPr>
-        <w:spacing w:line="360" w:lineRule="auto"/>
-        <w:rPr>
-          <w:color w:val="000000"/>
-        </w:rPr>
-      </w:pPr>
-      <w:r>
-        <w:br w:type="page"/>
-      </w:r>
-    </w:p>
-    <w:p>
-      <w:pPr>
-        <w:spacing w:line="360" w:lineRule="auto"/>
-        <w:jc w:val="both"/>
+      </w:pPr>
+      <w:r>
         <w:rPr>
           <w:rFonts w:ascii="Arial" w:eastAsia="Arial" w:hAnsi="Arial" w:cs="Arial"/>
           <w:color w:val="000000"/>
           <w:sz w:val="32"/>
           <w:szCs w:val="32"/>
         </w:rPr>
-      </w:pPr>
-      <w:r>
+        <w:lastRenderedPageBreak/>
+        <w:t>CONCLUSIONES</w:t>
+      </w:r>
+    </w:p>
+    <w:p>
+      <w:pPr>
+        <w:spacing w:line="360" w:lineRule="auto"/>
+        <w:jc w:val="both"/>
+        <w:rPr>
+          <w:rFonts w:ascii="Arial" w:eastAsia="Arial" w:hAnsi="Arial" w:cs="Arial"/>
+          <w:color w:val="000000"/>
+        </w:rPr>
+      </w:pPr>
+      <w:r>
+        <w:rPr>
+          <w:rFonts w:ascii="Arial" w:eastAsia="Arial" w:hAnsi="Arial" w:cs="Arial"/>
+          <w:color w:val="000000"/>
+        </w:rPr>
+        <w:t>Conclusión profesional del proyecto.</w:t>
+      </w:r>
+    </w:p>
+    <w:p>
+      <w:pPr>
+        <w:spacing w:line="360" w:lineRule="auto"/>
+        <w:rPr>
+          <w:color w:val="000000"/>
+        </w:rPr>
+      </w:pPr>
+      <w:r>
+        <w:br w:type="page"/>
+      </w:r>
+    </w:p>
+    <w:p>
+      <w:pPr>
+        <w:spacing w:line="360" w:lineRule="auto"/>
+        <w:jc w:val="both"/>
         <w:rPr>
           <w:rFonts w:ascii="Arial" w:eastAsia="Arial" w:hAnsi="Arial" w:cs="Arial"/>
           <w:color w:val="000000"/>
           <w:sz w:val="32"/>
           <w:szCs w:val="32"/>
         </w:rPr>
-        <w:lastRenderedPageBreak/>
-        <w:t>CONCLUSIONES</w:t>
-      </w:r>
-    </w:p>
-    <w:p>
-      <w:pPr>
-        <w:spacing w:line="360" w:lineRule="auto"/>
-        <w:jc w:val="both"/>
-        <w:rPr>
-          <w:rFonts w:ascii="Arial" w:eastAsia="Arial" w:hAnsi="Arial" w:cs="Arial"/>
-          <w:color w:val="000000"/>
-        </w:rPr>
-      </w:pPr>
-      <w:r>
-        <w:rPr>
-          <w:rFonts w:ascii="Arial" w:eastAsia="Arial" w:hAnsi="Arial" w:cs="Arial"/>
-          <w:color w:val="000000"/>
-        </w:rPr>
-        <w:t>Conclusión profesional del proyecto.</w:t>
-      </w:r>
-    </w:p>
-    <w:p>
-      <w:pPr>
-        <w:spacing w:line="360" w:lineRule="auto"/>
-        <w:rPr>
-          <w:color w:val="000000"/>
-        </w:rPr>
-      </w:pPr>
-      <w:r>
-        <w:br w:type="page"/>
-      </w:r>
-    </w:p>
-    <w:p>
-      <w:pPr>
-        <w:spacing w:line="360" w:lineRule="auto"/>
-        <w:jc w:val="both"/>
+      </w:pPr>
+      <w:r>
         <w:rPr>
           <w:rFonts w:ascii="Arial" w:eastAsia="Arial" w:hAnsi="Arial" w:cs="Arial"/>
           <w:color w:val="000000"/>
           <w:sz w:val="32"/>
           <w:szCs w:val="32"/>
         </w:rPr>
-      </w:pPr>
-      <w:r>
-        <w:rPr>
-          <w:rFonts w:ascii="Arial" w:eastAsia="Arial" w:hAnsi="Arial" w:cs="Arial"/>
-          <w:color w:val="000000"/>
-          <w:sz w:val="32"/>
-          <w:szCs w:val="32"/>
-        </w:rPr>
         <w:lastRenderedPageBreak/>
         <w:t>REFERENCIAS</w:t>
       </w:r>
@@ -22029,8 +23494,8 @@
       </w:r>
     </w:p>
     <w:sectPr>
-      <w:headerReference w:type="default" r:id="rId12"/>
-      <w:footerReference w:type="default" r:id="rId13"/>
+      <w:headerReference w:type="default" r:id="rId17"/>
+      <w:footerReference w:type="default" r:id="rId18"/>
       <w:pgSz w:w="11906" w:h="16838"/>
       <w:pgMar w:top="1440" w:right="1440" w:bottom="1440" w:left="1440" w:header="426" w:footer="720" w:gutter="0"/>
       <w:pgNumType w:start="1"/>
@@ -22641,11 +24106,103 @@
       </w:rPr>
     </w:lvl>
   </w:abstractNum>
+  <w:abstractNum w:abstractNumId="2" w15:restartNumberingAfterBreak="0">
+    <w:nsid w:val="619321DB"/>
+    <w:multiLevelType w:val="hybridMultilevel"/>
+    <w:tmpl w:val="F72CDAE4"/>
+    <w:lvl w:ilvl="0" w:tplc="E244E3A6">
+      <w:start w:val="1"/>
+      <w:numFmt w:val="decimal"/>
+      <w:lvlText w:val="%1."/>
+      <w:lvlJc w:val="left"/>
+      <w:pPr>
+        <w:ind w:left="814" w:hanging="360"/>
+      </w:pPr>
+      <w:rPr>
+        <w:rFonts w:hint="default"/>
+      </w:rPr>
+    </w:lvl>
+    <w:lvl w:ilvl="1" w:tplc="0C0A0019" w:tentative="1">
+      <w:start w:val="1"/>
+      <w:numFmt w:val="lowerLetter"/>
+      <w:lvlText w:val="%2."/>
+      <w:lvlJc w:val="left"/>
+      <w:pPr>
+        <w:ind w:left="1534" w:hanging="360"/>
+      </w:pPr>
+    </w:lvl>
+    <w:lvl w:ilvl="2" w:tplc="0C0A001B" w:tentative="1">
+      <w:start w:val="1"/>
+      <w:numFmt w:val="lowerRoman"/>
+      <w:lvlText w:val="%3."/>
+      <w:lvlJc w:val="right"/>
+      <w:pPr>
+        <w:ind w:left="2254" w:hanging="180"/>
+      </w:pPr>
+    </w:lvl>
+    <w:lvl w:ilvl="3" w:tplc="0C0A000F" w:tentative="1">
+      <w:start w:val="1"/>
+      <w:numFmt w:val="decimal"/>
+      <w:lvlText w:val="%4."/>
+      <w:lvlJc w:val="left"/>
+      <w:pPr>
+        <w:ind w:left="2974" w:hanging="360"/>
+      </w:pPr>
+    </w:lvl>
+    <w:lvl w:ilvl="4" w:tplc="0C0A0019" w:tentative="1">
+      <w:start w:val="1"/>
+      <w:numFmt w:val="lowerLetter"/>
+      <w:lvlText w:val="%5."/>
+      <w:lvlJc w:val="left"/>
+      <w:pPr>
+        <w:ind w:left="3694" w:hanging="360"/>
+      </w:pPr>
+    </w:lvl>
+    <w:lvl w:ilvl="5" w:tplc="0C0A001B" w:tentative="1">
+      <w:start w:val="1"/>
+      <w:numFmt w:val="lowerRoman"/>
+      <w:lvlText w:val="%6."/>
+      <w:lvlJc w:val="right"/>
+      <w:pPr>
+        <w:ind w:left="4414" w:hanging="180"/>
+      </w:pPr>
+    </w:lvl>
+    <w:lvl w:ilvl="6" w:tplc="0C0A000F" w:tentative="1">
+      <w:start w:val="1"/>
+      <w:numFmt w:val="decimal"/>
+      <w:lvlText w:val="%7."/>
+      <w:lvlJc w:val="left"/>
+      <w:pPr>
+        <w:ind w:left="5134" w:hanging="360"/>
+      </w:pPr>
+    </w:lvl>
+    <w:lvl w:ilvl="7" w:tplc="0C0A0019" w:tentative="1">
+      <w:start w:val="1"/>
+      <w:numFmt w:val="lowerLetter"/>
+      <w:lvlText w:val="%8."/>
+      <w:lvlJc w:val="left"/>
+      <w:pPr>
+        <w:ind w:left="5854" w:hanging="360"/>
+      </w:pPr>
+    </w:lvl>
+    <w:lvl w:ilvl="8" w:tplc="0C0A001B" w:tentative="1">
+      <w:start w:val="1"/>
+      <w:numFmt w:val="lowerRoman"/>
+      <w:lvlText w:val="%9."/>
+      <w:lvlJc w:val="right"/>
+      <w:pPr>
+        <w:ind w:left="6574" w:hanging="180"/>
+      </w:pPr>
+    </w:lvl>
+  </w:abstractNum>
   <w:num w:numId="1">
     <w:abstractNumId w:val="1"/>
   </w:num>
   <w:num w:numId="2">
     <w:abstractNumId w:val="0"/>
+  </w:num>
+  <w:num w:numId="3">
+    <w:abstractNumId w:val="2"/>
   </w:num>
 </w:numbering>
 </file>

</xml_diff>

<commit_message>
Bitacora: VLAN 10 validada y acceso web de gestion
</commit_message>
<xml_diff>
--- a/Prememorias/Pre_2.docx
+++ b/Prememorias/Pre_2.docx
@@ -21502,21 +21502,14 @@
     </w:p>
     <w:p>
       <w:pPr>
-        <w:pStyle w:val="Ttulo1"/>
-        <w:spacing w:before="240"/>
-        <w:rPr>
-          <w:sz w:val="24"/>
-          <w:szCs w:val="24"/>
-        </w:rPr>
-      </w:pPr>
-      <w:r>
-        <w:rPr>
-          <w:rFonts w:ascii="Arial" w:eastAsia="Arial" w:hAnsi="Arial" w:cs="Arial"/>
-          <w:sz w:val="24"/>
-          <w:szCs w:val="24"/>
-        </w:rPr>
-        <w:t>Desarrollo de la solución</w:t>
-      </w:r>
+        <w:pStyle w:val="Ttulo2"/>
+        <w:spacing w:before="160"/>
+        <w:rPr>
+          <w:rFonts w:ascii="Arial" w:eastAsia="Arial" w:hAnsi="Arial" w:cs="Arial"/>
+          <w:sz w:val="24"/>
+          <w:szCs w:val="24"/>
+        </w:rPr>
+      </w:pPr>
     </w:p>
     <w:p>
       <w:pPr>
@@ -21861,8 +21854,382 @@
         </w:rPr>
         <w:t>Proceso topología</w:t>
       </w:r>
+    </w:p>
+    <w:p>
+      <w:pPr>
+        <w:spacing w:after="60"/>
+        <w:rPr>
+          <w:sz w:val="24"/>
+          <w:szCs w:val="24"/>
+        </w:rPr>
+      </w:pPr>
+      <w:r>
+        <w:rPr>
+          <w:rFonts w:ascii="Arial" w:eastAsia="Arial" w:hAnsi="Arial" w:cs="Arial"/>
+          <w:b/>
+          <w:bCs/>
+          <w:sz w:val="24"/>
+          <w:szCs w:val="24"/>
+        </w:rPr>
+        <w:t xml:space="preserve">Prueba (P): </w:t>
+      </w:r>
+      <w:r>
+        <w:rPr>
+          <w:rFonts w:ascii="Arial" w:eastAsia="Arial" w:hAnsi="Arial" w:cs="Arial"/>
+          <w:sz w:val="24"/>
+          <w:szCs w:val="24"/>
+        </w:rPr>
+        <w:t>Se</w:t>
+      </w:r>
+      <w:r>
+        <w:rPr>
+          <w:rFonts w:ascii="Arial" w:eastAsia="Arial" w:hAnsi="Arial" w:cs="Arial"/>
+          <w:sz w:val="24"/>
+          <w:szCs w:val="24"/>
+        </w:rPr>
+        <w:t xml:space="preserve"> validará con el ping de PC1 a su </w:t>
+      </w:r>
+      <w:proofErr w:type="spellStart"/>
+      <w:r>
+        <w:rPr>
+          <w:rFonts w:ascii="Arial" w:eastAsia="Arial" w:hAnsi="Arial" w:cs="Arial"/>
+          <w:sz w:val="24"/>
+          <w:szCs w:val="24"/>
+        </w:rPr>
+        <w:t>gateway</w:t>
+      </w:r>
+      <w:proofErr w:type="spellEnd"/>
+      <w:r>
+        <w:rPr>
+          <w:rFonts w:ascii="Arial" w:eastAsia="Arial" w:hAnsi="Arial" w:cs="Arial"/>
+          <w:sz w:val="24"/>
+          <w:szCs w:val="24"/>
+        </w:rPr>
+        <w:t xml:space="preserve"> tras crear la VLAN 10 en </w:t>
+      </w:r>
+      <w:proofErr w:type="spellStart"/>
+      <w:r>
+        <w:rPr>
+          <w:rFonts w:ascii="Arial" w:eastAsia="Arial" w:hAnsi="Arial" w:cs="Arial"/>
+          <w:sz w:val="24"/>
+          <w:szCs w:val="24"/>
+        </w:rPr>
+        <w:t>pfSense</w:t>
+      </w:r>
+      <w:proofErr w:type="spellEnd"/>
+      <w:r>
+        <w:rPr>
+          <w:rFonts w:ascii="Arial" w:eastAsia="Arial" w:hAnsi="Arial" w:cs="Arial"/>
+          <w:sz w:val="24"/>
+          <w:szCs w:val="24"/>
+        </w:rPr>
+        <w:t xml:space="preserve"> (R01F01T01).</w:t>
+      </w:r>
+    </w:p>
+    <w:p>
+      <w:pPr>
+        <w:spacing w:after="60"/>
+        <w:rPr>
+          <w:sz w:val="24"/>
+          <w:szCs w:val="24"/>
+        </w:rPr>
+      </w:pPr>
+      <w:r>
+        <w:rPr>
+          <w:rFonts w:ascii="Arial" w:eastAsia="Arial" w:hAnsi="Arial" w:cs="Arial"/>
+          <w:b/>
+          <w:bCs/>
+          <w:sz w:val="24"/>
+          <w:szCs w:val="24"/>
+        </w:rPr>
+        <w:t xml:space="preserve">Incidencias: </w:t>
+      </w:r>
+      <w:r>
+        <w:rPr>
+          <w:rFonts w:ascii="Arial" w:eastAsia="Arial" w:hAnsi="Arial" w:cs="Arial"/>
+          <w:sz w:val="24"/>
+          <w:szCs w:val="24"/>
+        </w:rPr>
+        <w:t>ninguna.</w:t>
+      </w:r>
+    </w:p>
+    <w:p>
+      <w:pPr>
+        <w:spacing w:line="360" w:lineRule="auto"/>
+        <w:jc w:val="both"/>
+        <w:rPr>
+          <w:rFonts w:ascii="Arial" w:eastAsia="Arial" w:hAnsi="Arial" w:cs="Arial"/>
+          <w:color w:val="000000"/>
+          <w:sz w:val="32"/>
+          <w:szCs w:val="32"/>
+          <w:u w:val="single"/>
+        </w:rPr>
+      </w:pPr>
+    </w:p>
+    <w:p>
+      <w:pPr>
+        <w:pStyle w:val="Ttulo2"/>
+        <w:spacing w:before="160"/>
+        <w:rPr>
+          <w:sz w:val="24"/>
+          <w:szCs w:val="24"/>
+        </w:rPr>
+      </w:pPr>
+      <w:r>
+        <w:rPr>
+          <w:rFonts w:ascii="Arial" w:eastAsia="Arial" w:hAnsi="Arial" w:cs="Arial"/>
+          <w:sz w:val="24"/>
+          <w:szCs w:val="24"/>
+        </w:rPr>
+        <w:t xml:space="preserve">R01F01T01 Creación de </w:t>
+      </w:r>
+      <w:proofErr w:type="spellStart"/>
+      <w:r>
+        <w:rPr>
+          <w:rFonts w:ascii="Arial" w:eastAsia="Arial" w:hAnsi="Arial" w:cs="Arial"/>
+          <w:sz w:val="24"/>
+          <w:szCs w:val="24"/>
+        </w:rPr>
+        <w:t>VLANs</w:t>
+      </w:r>
+      <w:proofErr w:type="spellEnd"/>
+      <w:r>
+        <w:rPr>
+          <w:rFonts w:ascii="Arial" w:eastAsia="Arial" w:hAnsi="Arial" w:cs="Arial"/>
+          <w:sz w:val="24"/>
+          <w:szCs w:val="24"/>
+        </w:rPr>
+        <w:t xml:space="preserve"> y direccionamiento (VLAN 10)</w:t>
+      </w:r>
+    </w:p>
+    <w:p>
+      <w:pPr>
+        <w:spacing w:after="60"/>
+        <w:rPr>
+          <w:sz w:val="24"/>
+          <w:szCs w:val="24"/>
+        </w:rPr>
+      </w:pPr>
+      <w:r>
+        <w:rPr>
+          <w:rFonts w:ascii="Arial" w:eastAsia="Arial" w:hAnsi="Arial" w:cs="Arial"/>
+          <w:b/>
+          <w:bCs/>
+          <w:sz w:val="24"/>
+          <w:szCs w:val="24"/>
+        </w:rPr>
+        <w:t xml:space="preserve">Objetivo: </w:t>
+      </w:r>
+      <w:r>
+        <w:rPr>
+          <w:rFonts w:ascii="Arial" w:eastAsia="Arial" w:hAnsi="Arial" w:cs="Arial"/>
+          <w:sz w:val="24"/>
+          <w:szCs w:val="24"/>
+        </w:rPr>
+        <w:t>crear la VLAN 10 (Usuarios) sobre em1 y asignarle direccionamiento 10.10.10.1/24.</w:t>
+      </w:r>
+    </w:p>
+    <w:p>
+      <w:pPr>
+        <w:spacing w:after="40"/>
+        <w:rPr>
+          <w:sz w:val="24"/>
+          <w:szCs w:val="24"/>
+        </w:rPr>
+      </w:pPr>
+      <w:r>
+        <w:rPr>
+          <w:rFonts w:ascii="Arial" w:eastAsia="Arial" w:hAnsi="Arial" w:cs="Arial"/>
+          <w:b/>
+          <w:bCs/>
+          <w:sz w:val="24"/>
+          <w:szCs w:val="24"/>
+        </w:rPr>
+        <w:t>Configuración realizada:</w:t>
+      </w:r>
+    </w:p>
+    <w:p>
+      <w:pPr>
+        <w:spacing w:after="40"/>
+        <w:ind w:left="454"/>
+        <w:rPr>
+          <w:sz w:val="24"/>
+          <w:szCs w:val="24"/>
+        </w:rPr>
+      </w:pPr>
+      <w:r>
+        <w:rPr>
+          <w:rFonts w:ascii="Arial" w:eastAsia="Arial" w:hAnsi="Arial" w:cs="Arial"/>
+          <w:sz w:val="24"/>
+          <w:szCs w:val="24"/>
+        </w:rPr>
+        <w:t xml:space="preserve">– </w:t>
+      </w:r>
+      <w:proofErr w:type="spellStart"/>
+      <w:r>
+        <w:rPr>
+          <w:rFonts w:ascii="Arial" w:eastAsia="Arial" w:hAnsi="Arial" w:cs="Arial"/>
+          <w:sz w:val="24"/>
+          <w:szCs w:val="24"/>
+        </w:rPr>
+        <w:t>pfSense</w:t>
+      </w:r>
+      <w:proofErr w:type="spellEnd"/>
+      <w:r>
+        <w:rPr>
+          <w:rFonts w:ascii="Arial" w:eastAsia="Arial" w:hAnsi="Arial" w:cs="Arial"/>
+          <w:sz w:val="24"/>
+          <w:szCs w:val="24"/>
+        </w:rPr>
+        <w:t xml:space="preserve"> (consola) opción 1 "</w:t>
+      </w:r>
+      <w:proofErr w:type="spellStart"/>
+      <w:r>
+        <w:rPr>
+          <w:rFonts w:ascii="Arial" w:eastAsia="Arial" w:hAnsi="Arial" w:cs="Arial"/>
+          <w:sz w:val="24"/>
+          <w:szCs w:val="24"/>
+        </w:rPr>
+        <w:t>Assign</w:t>
+      </w:r>
+      <w:proofErr w:type="spellEnd"/>
+      <w:r>
+        <w:rPr>
+          <w:rFonts w:ascii="Arial" w:eastAsia="Arial" w:hAnsi="Arial" w:cs="Arial"/>
+          <w:sz w:val="24"/>
+          <w:szCs w:val="24"/>
+        </w:rPr>
+        <w:t xml:space="preserve"> Interfaces": VLAN con </w:t>
+      </w:r>
+      <w:proofErr w:type="spellStart"/>
+      <w:r>
+        <w:rPr>
+          <w:rFonts w:ascii="Arial" w:eastAsia="Arial" w:hAnsi="Arial" w:cs="Arial"/>
+          <w:sz w:val="24"/>
+          <w:szCs w:val="24"/>
+        </w:rPr>
+        <w:t>parent</w:t>
+      </w:r>
+      <w:proofErr w:type="spellEnd"/>
+      <w:r>
+        <w:rPr>
+          <w:rFonts w:ascii="Arial" w:eastAsia="Arial" w:hAnsi="Arial" w:cs="Arial"/>
+          <w:sz w:val="24"/>
+          <w:szCs w:val="24"/>
+        </w:rPr>
+        <w:t xml:space="preserve"> em1, tag 10, asignada como LAN (em1.10).</w:t>
+      </w:r>
+    </w:p>
+    <w:p>
+      <w:pPr>
+        <w:spacing w:after="40"/>
+        <w:ind w:left="454"/>
+        <w:rPr>
+          <w:sz w:val="24"/>
+          <w:szCs w:val="24"/>
+        </w:rPr>
+      </w:pPr>
+      <w:r>
+        <w:rPr>
+          <w:rFonts w:ascii="Arial" w:eastAsia="Arial" w:hAnsi="Arial" w:cs="Arial"/>
+          <w:sz w:val="24"/>
+          <w:szCs w:val="24"/>
+        </w:rPr>
+        <w:lastRenderedPageBreak/>
+        <w:t xml:space="preserve">– </w:t>
+      </w:r>
+      <w:proofErr w:type="spellStart"/>
+      <w:r>
+        <w:rPr>
+          <w:rFonts w:ascii="Arial" w:eastAsia="Arial" w:hAnsi="Arial" w:cs="Arial"/>
+          <w:sz w:val="24"/>
+          <w:szCs w:val="24"/>
+        </w:rPr>
+        <w:t>pfSense</w:t>
+      </w:r>
+      <w:proofErr w:type="spellEnd"/>
+      <w:r>
+        <w:rPr>
+          <w:rFonts w:ascii="Arial" w:eastAsia="Arial" w:hAnsi="Arial" w:cs="Arial"/>
+          <w:sz w:val="24"/>
+          <w:szCs w:val="24"/>
+        </w:rPr>
+        <w:t xml:space="preserve"> (consola) opción 2 "Set interface IP": em1.10 = 10.10.10.1/24; servidor DHCP habilitado (rango 10.10.10.100–200).</w:t>
+      </w:r>
+    </w:p>
+    <w:p>
+      <w:pPr>
+        <w:spacing w:after="40"/>
+        <w:ind w:left="454"/>
+        <w:rPr>
+          <w:sz w:val="24"/>
+          <w:szCs w:val="24"/>
+        </w:rPr>
+      </w:pPr>
+      <w:r>
+        <w:rPr>
+          <w:rFonts w:ascii="Arial" w:eastAsia="Arial" w:hAnsi="Arial" w:cs="Arial"/>
+          <w:sz w:val="24"/>
+          <w:szCs w:val="24"/>
+        </w:rPr>
+        <w:t xml:space="preserve">– </w:t>
+      </w:r>
+      <w:proofErr w:type="spellStart"/>
+      <w:r>
+        <w:rPr>
+          <w:rFonts w:ascii="Arial" w:eastAsia="Arial" w:hAnsi="Arial" w:cs="Arial"/>
+          <w:sz w:val="24"/>
+          <w:szCs w:val="24"/>
+        </w:rPr>
+        <w:t>Switch</w:t>
+      </w:r>
+      <w:proofErr w:type="spellEnd"/>
+      <w:r>
+        <w:rPr>
+          <w:rFonts w:ascii="Arial" w:eastAsia="Arial" w:hAnsi="Arial" w:cs="Arial"/>
+          <w:sz w:val="24"/>
+          <w:szCs w:val="24"/>
+        </w:rPr>
+        <w:t xml:space="preserve"> (GNS3): puerto a </w:t>
+      </w:r>
+      <w:proofErr w:type="spellStart"/>
+      <w:r>
+        <w:rPr>
+          <w:rFonts w:ascii="Arial" w:eastAsia="Arial" w:hAnsi="Arial" w:cs="Arial"/>
+          <w:sz w:val="24"/>
+          <w:szCs w:val="24"/>
+        </w:rPr>
+        <w:t>pfSense</w:t>
+      </w:r>
+      <w:proofErr w:type="spellEnd"/>
+      <w:r>
+        <w:rPr>
+          <w:rFonts w:ascii="Arial" w:eastAsia="Arial" w:hAnsi="Arial" w:cs="Arial"/>
+          <w:sz w:val="24"/>
+          <w:szCs w:val="24"/>
+        </w:rPr>
+        <w:t xml:space="preserve"> = dot1q VLAN 1 (troncal); puerto a PC1 = </w:t>
+      </w:r>
       <w:bookmarkStart w:id="0" w:name="_GoBack"/>
       <w:bookmarkEnd w:id="0"/>
+      <w:proofErr w:type="spellStart"/>
+      <w:r>
+        <w:rPr>
+          <w:rFonts w:ascii="Arial" w:eastAsia="Arial" w:hAnsi="Arial" w:cs="Arial"/>
+          <w:sz w:val="24"/>
+          <w:szCs w:val="24"/>
+        </w:rPr>
+        <w:t>access</w:t>
+      </w:r>
+      <w:proofErr w:type="spellEnd"/>
+      <w:r>
+        <w:rPr>
+          <w:rFonts w:ascii="Arial" w:eastAsia="Arial" w:hAnsi="Arial" w:cs="Arial"/>
+          <w:sz w:val="24"/>
+          <w:szCs w:val="24"/>
+        </w:rPr>
+        <w:t xml:space="preserve"> VLAN 10.</w:t>
+      </w:r>
     </w:p>
     <w:p>
       <w:pPr>
@@ -21880,59 +22247,69 @@
           <w:sz w:val="24"/>
           <w:szCs w:val="24"/>
         </w:rPr>
-        <w:t xml:space="preserve">Prueba (P): </w:t>
-      </w:r>
-      <w:r>
-        <w:rPr>
-          <w:rFonts w:ascii="Arial" w:eastAsia="Arial" w:hAnsi="Arial" w:cs="Arial"/>
-          <w:sz w:val="24"/>
-          <w:szCs w:val="24"/>
-        </w:rPr>
-        <w:t>Se</w:t>
-      </w:r>
-      <w:r>
-        <w:rPr>
-          <w:rFonts w:ascii="Arial" w:eastAsia="Arial" w:hAnsi="Arial" w:cs="Arial"/>
-          <w:sz w:val="24"/>
-          <w:szCs w:val="24"/>
-        </w:rPr>
-        <w:t xml:space="preserve"> validará con el ping de PC1 a su </w:t>
-      </w:r>
-      <w:proofErr w:type="spellStart"/>
-      <w:r>
-        <w:rPr>
-          <w:rFonts w:ascii="Arial" w:eastAsia="Arial" w:hAnsi="Arial" w:cs="Arial"/>
-          <w:sz w:val="24"/>
-          <w:szCs w:val="24"/>
-        </w:rPr>
-        <w:t>gateway</w:t>
-      </w:r>
-      <w:proofErr w:type="spellEnd"/>
-      <w:r>
-        <w:rPr>
-          <w:rFonts w:ascii="Arial" w:eastAsia="Arial" w:hAnsi="Arial" w:cs="Arial"/>
-          <w:sz w:val="24"/>
-          <w:szCs w:val="24"/>
-        </w:rPr>
-        <w:t xml:space="preserve"> tras crear la VLAN 10 en </w:t>
-      </w:r>
-      <w:proofErr w:type="spellStart"/>
-      <w:r>
-        <w:rPr>
-          <w:rFonts w:ascii="Arial" w:eastAsia="Arial" w:hAnsi="Arial" w:cs="Arial"/>
-          <w:sz w:val="24"/>
-          <w:szCs w:val="24"/>
-        </w:rPr>
-        <w:t>pfSense</w:t>
-      </w:r>
-      <w:proofErr w:type="spellEnd"/>
-      <w:r>
-        <w:rPr>
-          <w:rFonts w:ascii="Arial" w:eastAsia="Arial" w:hAnsi="Arial" w:cs="Arial"/>
-          <w:sz w:val="24"/>
-          <w:szCs w:val="24"/>
-        </w:rPr>
-        <w:t xml:space="preserve"> (R01F01T01).</w:t>
+        <w:t xml:space="preserve">Evidencia: </w:t>
+      </w:r>
+      <w:r>
+        <w:rPr>
+          <w:rFonts w:ascii="Arial" w:eastAsia="Arial" w:hAnsi="Arial" w:cs="Arial"/>
+          <w:sz w:val="24"/>
+          <w:szCs w:val="24"/>
+        </w:rPr>
+        <w:t xml:space="preserve">configuración de puertos del </w:t>
+      </w:r>
+      <w:proofErr w:type="spellStart"/>
+      <w:r>
+        <w:rPr>
+          <w:rFonts w:ascii="Arial" w:eastAsia="Arial" w:hAnsi="Arial" w:cs="Arial"/>
+          <w:sz w:val="24"/>
+          <w:szCs w:val="24"/>
+        </w:rPr>
+        <w:t>switch</w:t>
+      </w:r>
+      <w:proofErr w:type="spellEnd"/>
+      <w:r>
+        <w:rPr>
+          <w:rFonts w:ascii="Arial" w:eastAsia="Arial" w:hAnsi="Arial" w:cs="Arial"/>
+          <w:sz w:val="24"/>
+          <w:szCs w:val="24"/>
+        </w:rPr>
+        <w:t>; salida de "</w:t>
+      </w:r>
+      <w:proofErr w:type="spellStart"/>
+      <w:r>
+        <w:rPr>
+          <w:rFonts w:ascii="Arial" w:eastAsia="Arial" w:hAnsi="Arial" w:cs="Arial"/>
+          <w:sz w:val="24"/>
+          <w:szCs w:val="24"/>
+        </w:rPr>
+        <w:t>ip</w:t>
+      </w:r>
+      <w:proofErr w:type="spellEnd"/>
+      <w:r>
+        <w:rPr>
+          <w:rFonts w:ascii="Arial" w:eastAsia="Arial" w:hAnsi="Arial" w:cs="Arial"/>
+          <w:sz w:val="24"/>
+          <w:szCs w:val="24"/>
+        </w:rPr>
+        <w:t xml:space="preserve"> </w:t>
+      </w:r>
+      <w:proofErr w:type="spellStart"/>
+      <w:r>
+        <w:rPr>
+          <w:rFonts w:ascii="Arial" w:eastAsia="Arial" w:hAnsi="Arial" w:cs="Arial"/>
+          <w:sz w:val="24"/>
+          <w:szCs w:val="24"/>
+        </w:rPr>
+        <w:t>dhcp</w:t>
+      </w:r>
+      <w:proofErr w:type="spellEnd"/>
+      <w:r>
+        <w:rPr>
+          <w:rFonts w:ascii="Arial" w:eastAsia="Arial" w:hAnsi="Arial" w:cs="Arial"/>
+          <w:sz w:val="24"/>
+          <w:szCs w:val="24"/>
+        </w:rPr>
+        <w:t>" y "ping" en PC1 (Ilustración X).</w:t>
       </w:r>
     </w:p>
     <w:p>
@@ -21951,15 +22328,341 @@
           <w:sz w:val="24"/>
           <w:szCs w:val="24"/>
         </w:rPr>
-        <w:t xml:space="preserve">Incidencias: </w:t>
-      </w:r>
-      <w:r>
-        <w:rPr>
-          <w:rFonts w:ascii="Arial" w:eastAsia="Arial" w:hAnsi="Arial" w:cs="Arial"/>
-          <w:sz w:val="24"/>
-          <w:szCs w:val="24"/>
-        </w:rPr>
-        <w:t>ninguna.</w:t>
+        <w:t xml:space="preserve">Prueba (P): </w:t>
+      </w:r>
+      <w:r>
+        <w:rPr>
+          <w:rFonts w:ascii="Arial" w:eastAsia="Arial" w:hAnsi="Arial" w:cs="Arial"/>
+          <w:sz w:val="24"/>
+          <w:szCs w:val="24"/>
+        </w:rPr>
+        <w:t>PC1 (VPCS) obtiene 10.10.10.100 por DHCP y hace ping a 10.10.10.1 → Resultado: correcto (~3–5 ms).</w:t>
+      </w:r>
+    </w:p>
+    <w:p>
+      <w:pPr>
+        <w:spacing w:after="40"/>
+        <w:rPr>
+          <w:sz w:val="24"/>
+          <w:szCs w:val="24"/>
+        </w:rPr>
+      </w:pPr>
+      <w:r>
+        <w:rPr>
+          <w:rFonts w:ascii="Arial" w:eastAsia="Arial" w:hAnsi="Arial" w:cs="Arial"/>
+          <w:b/>
+          <w:bCs/>
+          <w:sz w:val="24"/>
+          <w:szCs w:val="24"/>
+        </w:rPr>
+        <w:t>Incidencias controladas:</w:t>
+      </w:r>
+    </w:p>
+    <w:p>
+      <w:pPr>
+        <w:spacing w:after="40"/>
+        <w:ind w:left="454"/>
+        <w:rPr>
+          <w:sz w:val="24"/>
+          <w:szCs w:val="24"/>
+        </w:rPr>
+      </w:pPr>
+      <w:r>
+        <w:rPr>
+          <w:rFonts w:ascii="Arial" w:eastAsia="Arial" w:hAnsi="Arial" w:cs="Arial"/>
+          <w:sz w:val="24"/>
+          <w:szCs w:val="24"/>
+        </w:rPr>
+        <w:t>1. Al fijar la IP se respondió "y" a "</w:t>
+      </w:r>
+      <w:proofErr w:type="spellStart"/>
+      <w:r>
+        <w:rPr>
+          <w:rFonts w:ascii="Arial" w:eastAsia="Arial" w:hAnsi="Arial" w:cs="Arial"/>
+          <w:sz w:val="24"/>
+          <w:szCs w:val="24"/>
+        </w:rPr>
+        <w:t>via</w:t>
+      </w:r>
+      <w:proofErr w:type="spellEnd"/>
+      <w:r>
+        <w:rPr>
+          <w:rFonts w:ascii="Arial" w:eastAsia="Arial" w:hAnsi="Arial" w:cs="Arial"/>
+          <w:sz w:val="24"/>
+          <w:szCs w:val="24"/>
+        </w:rPr>
+        <w:t xml:space="preserve"> DHCP?" en vez de "n"; la interfaz quedó como cliente DHCP sin IP fija. Solución: repetir la opción 2 con "n" y fijar 10.10.10.1/24 + rango DHCP.</w:t>
+      </w:r>
+    </w:p>
+    <w:p>
+      <w:pPr>
+        <w:spacing w:after="40"/>
+        <w:ind w:left="454"/>
+        <w:rPr>
+          <w:sz w:val="24"/>
+          <w:szCs w:val="24"/>
+        </w:rPr>
+      </w:pPr>
+      <w:r>
+        <w:rPr>
+          <w:rFonts w:ascii="Arial" w:eastAsia="Arial" w:hAnsi="Arial" w:cs="Arial"/>
+          <w:sz w:val="24"/>
+          <w:szCs w:val="24"/>
+        </w:rPr>
+        <w:t xml:space="preserve">2. Sin conectividad inicial: los puertos del </w:t>
+      </w:r>
+      <w:proofErr w:type="spellStart"/>
+      <w:r>
+        <w:rPr>
+          <w:rFonts w:ascii="Arial" w:eastAsia="Arial" w:hAnsi="Arial" w:cs="Arial"/>
+          <w:sz w:val="24"/>
+          <w:szCs w:val="24"/>
+        </w:rPr>
+        <w:t>switch</w:t>
+      </w:r>
+      <w:proofErr w:type="spellEnd"/>
+      <w:r>
+        <w:rPr>
+          <w:rFonts w:ascii="Arial" w:eastAsia="Arial" w:hAnsi="Arial" w:cs="Arial"/>
+          <w:sz w:val="24"/>
+          <w:szCs w:val="24"/>
+        </w:rPr>
+        <w:t xml:space="preserve"> estaban en </w:t>
+      </w:r>
+      <w:proofErr w:type="spellStart"/>
+      <w:r>
+        <w:rPr>
+          <w:rFonts w:ascii="Arial" w:eastAsia="Arial" w:hAnsi="Arial" w:cs="Arial"/>
+          <w:sz w:val="24"/>
+          <w:szCs w:val="24"/>
+        </w:rPr>
+        <w:t>access</w:t>
+      </w:r>
+      <w:proofErr w:type="spellEnd"/>
+      <w:r>
+        <w:rPr>
+          <w:rFonts w:ascii="Arial" w:eastAsia="Arial" w:hAnsi="Arial" w:cs="Arial"/>
+          <w:sz w:val="24"/>
+          <w:szCs w:val="24"/>
+        </w:rPr>
+        <w:t xml:space="preserve"> VLAN 1 por defecto y, al configurarlos, quedaron invertidos (dot1q/</w:t>
+      </w:r>
+      <w:proofErr w:type="spellStart"/>
+      <w:r>
+        <w:rPr>
+          <w:rFonts w:ascii="Arial" w:eastAsia="Arial" w:hAnsi="Arial" w:cs="Arial"/>
+          <w:sz w:val="24"/>
+          <w:szCs w:val="24"/>
+        </w:rPr>
+        <w:t>access</w:t>
+      </w:r>
+      <w:proofErr w:type="spellEnd"/>
+      <w:r>
+        <w:rPr>
+          <w:rFonts w:ascii="Arial" w:eastAsia="Arial" w:hAnsi="Arial" w:cs="Arial"/>
+          <w:sz w:val="24"/>
+          <w:szCs w:val="24"/>
+        </w:rPr>
+        <w:t xml:space="preserve"> en el puerto equivocado). Detectado con el </w:t>
+      </w:r>
+      <w:proofErr w:type="spellStart"/>
+      <w:r>
+        <w:rPr>
+          <w:rFonts w:ascii="Arial" w:eastAsia="Arial" w:hAnsi="Arial" w:cs="Arial"/>
+          <w:sz w:val="24"/>
+          <w:szCs w:val="24"/>
+        </w:rPr>
+        <w:t>tooltip</w:t>
+      </w:r>
+      <w:proofErr w:type="spellEnd"/>
+      <w:r>
+        <w:rPr>
+          <w:rFonts w:ascii="Arial" w:eastAsia="Arial" w:hAnsi="Arial" w:cs="Arial"/>
+          <w:sz w:val="24"/>
+          <w:szCs w:val="24"/>
+        </w:rPr>
+        <w:t xml:space="preserve"> del enlace (</w:t>
+      </w:r>
+      <w:proofErr w:type="spellStart"/>
+      <w:r>
+        <w:rPr>
+          <w:rFonts w:ascii="Arial" w:eastAsia="Arial" w:hAnsi="Arial" w:cs="Arial"/>
+          <w:sz w:val="24"/>
+          <w:szCs w:val="24"/>
+        </w:rPr>
+        <w:t>pfSense</w:t>
+      </w:r>
+      <w:proofErr w:type="spellEnd"/>
+      <w:r>
+        <w:rPr>
+          <w:rFonts w:ascii="Arial" w:eastAsia="Arial" w:hAnsi="Arial" w:cs="Arial"/>
+          <w:sz w:val="24"/>
+          <w:szCs w:val="24"/>
+        </w:rPr>
+        <w:t xml:space="preserve"> em1 = </w:t>
+      </w:r>
+      <w:proofErr w:type="spellStart"/>
+      <w:r>
+        <w:rPr>
+          <w:rFonts w:ascii="Arial" w:eastAsia="Arial" w:hAnsi="Arial" w:cs="Arial"/>
+          <w:sz w:val="24"/>
+          <w:szCs w:val="24"/>
+        </w:rPr>
+        <w:t>switch</w:t>
+      </w:r>
+      <w:proofErr w:type="spellEnd"/>
+      <w:r>
+        <w:rPr>
+          <w:rFonts w:ascii="Arial" w:eastAsia="Arial" w:hAnsi="Arial" w:cs="Arial"/>
+          <w:sz w:val="24"/>
+          <w:szCs w:val="24"/>
+        </w:rPr>
+        <w:t xml:space="preserve"> </w:t>
+      </w:r>
+      <w:proofErr w:type="spellStart"/>
+      <w:r>
+        <w:rPr>
+          <w:rFonts w:ascii="Arial" w:eastAsia="Arial" w:hAnsi="Arial" w:cs="Arial"/>
+          <w:sz w:val="24"/>
+          <w:szCs w:val="24"/>
+        </w:rPr>
+        <w:t>port</w:t>
+      </w:r>
+      <w:proofErr w:type="spellEnd"/>
+      <w:r>
+        <w:rPr>
+          <w:rFonts w:ascii="Arial" w:eastAsia="Arial" w:hAnsi="Arial" w:cs="Arial"/>
+          <w:sz w:val="24"/>
+          <w:szCs w:val="24"/>
+        </w:rPr>
+        <w:t xml:space="preserve"> 0; PC1 = </w:t>
+      </w:r>
+      <w:proofErr w:type="spellStart"/>
+      <w:r>
+        <w:rPr>
+          <w:rFonts w:ascii="Arial" w:eastAsia="Arial" w:hAnsi="Arial" w:cs="Arial"/>
+          <w:sz w:val="24"/>
+          <w:szCs w:val="24"/>
+        </w:rPr>
+        <w:t>switch</w:t>
+      </w:r>
+      <w:proofErr w:type="spellEnd"/>
+      <w:r>
+        <w:rPr>
+          <w:rFonts w:ascii="Arial" w:eastAsia="Arial" w:hAnsi="Arial" w:cs="Arial"/>
+          <w:sz w:val="24"/>
+          <w:szCs w:val="24"/>
+        </w:rPr>
+        <w:t xml:space="preserve"> </w:t>
+      </w:r>
+      <w:proofErr w:type="spellStart"/>
+      <w:r>
+        <w:rPr>
+          <w:rFonts w:ascii="Arial" w:eastAsia="Arial" w:hAnsi="Arial" w:cs="Arial"/>
+          <w:sz w:val="24"/>
+          <w:szCs w:val="24"/>
+        </w:rPr>
+        <w:t>port</w:t>
+      </w:r>
+      <w:proofErr w:type="spellEnd"/>
+      <w:r>
+        <w:rPr>
+          <w:rFonts w:ascii="Arial" w:eastAsia="Arial" w:hAnsi="Arial" w:cs="Arial"/>
+          <w:sz w:val="24"/>
+          <w:szCs w:val="24"/>
+        </w:rPr>
+        <w:t xml:space="preserve"> 1). Solución: </w:t>
+      </w:r>
+      <w:proofErr w:type="spellStart"/>
+      <w:r>
+        <w:rPr>
+          <w:rFonts w:ascii="Arial" w:eastAsia="Arial" w:hAnsi="Arial" w:cs="Arial"/>
+          <w:sz w:val="24"/>
+          <w:szCs w:val="24"/>
+        </w:rPr>
+        <w:t>port</w:t>
+      </w:r>
+      <w:proofErr w:type="spellEnd"/>
+      <w:r>
+        <w:rPr>
+          <w:rFonts w:ascii="Arial" w:eastAsia="Arial" w:hAnsi="Arial" w:cs="Arial"/>
+          <w:sz w:val="24"/>
+          <w:szCs w:val="24"/>
+        </w:rPr>
+        <w:t xml:space="preserve"> 0 = dot1q VLAN 1, </w:t>
+      </w:r>
+      <w:proofErr w:type="spellStart"/>
+      <w:r>
+        <w:rPr>
+          <w:rFonts w:ascii="Arial" w:eastAsia="Arial" w:hAnsi="Arial" w:cs="Arial"/>
+          <w:sz w:val="24"/>
+          <w:szCs w:val="24"/>
+        </w:rPr>
+        <w:t>port</w:t>
+      </w:r>
+      <w:proofErr w:type="spellEnd"/>
+      <w:r>
+        <w:rPr>
+          <w:rFonts w:ascii="Arial" w:eastAsia="Arial" w:hAnsi="Arial" w:cs="Arial"/>
+          <w:sz w:val="24"/>
+          <w:szCs w:val="24"/>
+        </w:rPr>
+        <w:t xml:space="preserve"> 1 = </w:t>
+      </w:r>
+      <w:proofErr w:type="spellStart"/>
+      <w:r>
+        <w:rPr>
+          <w:rFonts w:ascii="Arial" w:eastAsia="Arial" w:hAnsi="Arial" w:cs="Arial"/>
+          <w:sz w:val="24"/>
+          <w:szCs w:val="24"/>
+        </w:rPr>
+        <w:t>access</w:t>
+      </w:r>
+      <w:proofErr w:type="spellEnd"/>
+      <w:r>
+        <w:rPr>
+          <w:rFonts w:ascii="Arial" w:eastAsia="Arial" w:hAnsi="Arial" w:cs="Arial"/>
+          <w:sz w:val="24"/>
+          <w:szCs w:val="24"/>
+        </w:rPr>
+        <w:t xml:space="preserve"> VLAN 10.</w:t>
+      </w:r>
+    </w:p>
+    <w:p>
+      <w:pPr>
+        <w:spacing w:after="60"/>
+        <w:rPr>
+          <w:sz w:val="24"/>
+          <w:szCs w:val="24"/>
+        </w:rPr>
+      </w:pPr>
+      <w:r>
+        <w:rPr>
+          <w:rFonts w:ascii="Arial" w:eastAsia="Arial" w:hAnsi="Arial" w:cs="Arial"/>
+          <w:b/>
+          <w:bCs/>
+          <w:sz w:val="24"/>
+          <w:szCs w:val="24"/>
+        </w:rPr>
+        <w:t xml:space="preserve">Pendiente: </w:t>
+      </w:r>
+      <w:proofErr w:type="spellStart"/>
+      <w:r>
+        <w:rPr>
+          <w:rFonts w:ascii="Arial" w:eastAsia="Arial" w:hAnsi="Arial" w:cs="Arial"/>
+          <w:sz w:val="24"/>
+          <w:szCs w:val="24"/>
+        </w:rPr>
+        <w:t>VLANs</w:t>
+      </w:r>
+      <w:proofErr w:type="spellEnd"/>
+      <w:r>
+        <w:rPr>
+          <w:rFonts w:ascii="Arial" w:eastAsia="Arial" w:hAnsi="Arial" w:cs="Arial"/>
+          <w:sz w:val="24"/>
+          <w:szCs w:val="24"/>
+        </w:rPr>
+        <w:t xml:space="preserve"> 20, 30, 40 y 50 (mismo patrón, vía interfaz web).</w:t>
       </w:r>
     </w:p>
     <w:p>
@@ -21968,9 +22671,77 @@
         <w:jc w:val="both"/>
         <w:rPr>
           <w:rFonts w:ascii="Arial" w:eastAsia="Arial" w:hAnsi="Arial" w:cs="Arial"/>
-          <w:color w:val="000000"/>
+          <w:i/>
+          <w:color w:val="FF0000"/>
           <w:sz w:val="32"/>
           <w:szCs w:val="32"/>
+        </w:rPr>
+      </w:pPr>
+    </w:p>
+    <w:p>
+      <w:pPr>
+        <w:pStyle w:val="Ttulo2"/>
+        <w:spacing w:before="160"/>
+        <w:rPr>
+          <w:i/>
+          <w:color w:val="FF0000"/>
+          <w:sz w:val="24"/>
+          <w:szCs w:val="24"/>
+        </w:rPr>
+      </w:pPr>
+      <w:r>
+        <w:rPr>
+          <w:rFonts w:ascii="Arial" w:eastAsia="Arial" w:hAnsi="Arial" w:cs="Arial"/>
+          <w:i/>
+          <w:color w:val="FF0000"/>
+          <w:sz w:val="32"/>
+          <w:szCs w:val="32"/>
+        </w:rPr>
+        <w:t xml:space="preserve">Meter las imágenes con sus pies, desde </w:t>
+      </w:r>
+      <w:r>
+        <w:rPr>
+          <w:rFonts w:ascii="Arial" w:eastAsia="Arial" w:hAnsi="Arial" w:cs="Arial"/>
+          <w:i/>
+          <w:color w:val="FF0000"/>
+          <w:sz w:val="24"/>
+          <w:szCs w:val="24"/>
+        </w:rPr>
+        <w:t xml:space="preserve">R01F01T01 Creación de </w:t>
+      </w:r>
+      <w:proofErr w:type="spellStart"/>
+      <w:r>
+        <w:rPr>
+          <w:rFonts w:ascii="Arial" w:eastAsia="Arial" w:hAnsi="Arial" w:cs="Arial"/>
+          <w:i/>
+          <w:color w:val="FF0000"/>
+          <w:sz w:val="24"/>
+          <w:szCs w:val="24"/>
+        </w:rPr>
+        <w:t>VLANs</w:t>
+      </w:r>
+      <w:proofErr w:type="spellEnd"/>
+      <w:r>
+        <w:rPr>
+          <w:rFonts w:ascii="Arial" w:eastAsia="Arial" w:hAnsi="Arial" w:cs="Arial"/>
+          <w:i/>
+          <w:color w:val="FF0000"/>
+          <w:sz w:val="24"/>
+          <w:szCs w:val="24"/>
+        </w:rPr>
+        <w:t xml:space="preserve"> y direccionamiento (VLAN 10)</w:t>
+      </w:r>
+    </w:p>
+    <w:p>
+      <w:pPr>
+        <w:spacing w:line="360" w:lineRule="auto"/>
+        <w:jc w:val="both"/>
+        <w:rPr>
+          <w:rFonts w:ascii="Arial" w:eastAsia="Arial" w:hAnsi="Arial" w:cs="Arial"/>
+          <w:color w:val="000000"/>
+          <w:sz w:val="32"/>
+          <w:szCs w:val="32"/>
+          <w:u w:val="single"/>
         </w:rPr>
       </w:pPr>
     </w:p>

</xml_diff>

<commit_message>
R02 microsegmentacion + R05 contencion zona critica (prueba OK)
</commit_message>
<xml_diff>
--- a/Prememorias/Pre_2.docx
+++ b/Prememorias/Pre_2.docx
@@ -14231,6 +14231,18 @@
         </w:rPr>
       </w:pPr>
     </w:p>
+    <w:p>
+      <w:pPr>
+        <w:spacing w:line="360" w:lineRule="auto"/>
+        <w:jc w:val="both"/>
+        <w:rPr>
+          <w:rFonts w:ascii="Arial" w:eastAsia="Arial" w:hAnsi="Arial" w:cs="Arial"/>
+          <w:color w:val="000000"/>
+          <w:sz w:val="24"/>
+          <w:szCs w:val="24"/>
+        </w:rPr>
+      </w:pPr>
+    </w:p>
     <w:tbl>
       <w:tblPr>
         <w:tblStyle w:val="Tablaconcuadrcula"/>
@@ -14267,6 +14279,7 @@
                 <w:sz w:val="24"/>
                 <w:szCs w:val="24"/>
               </w:rPr>
+              <w:lastRenderedPageBreak/>
               <w:t xml:space="preserve">Interfaz </w:t>
             </w:r>
             <w:proofErr w:type="spellStart"/>
@@ -14409,7 +14422,6 @@
                 <w:sz w:val="24"/>
                 <w:szCs w:val="24"/>
               </w:rPr>
-              <w:lastRenderedPageBreak/>
               <w:t>em0</w:t>
             </w:r>
           </w:p>
@@ -15664,6 +15676,7 @@
           <w:sz w:val="24"/>
           <w:szCs w:val="24"/>
         </w:rPr>
+        <w:lastRenderedPageBreak/>
         <w:t>Descripción: distribución cortafuegos/</w:t>
       </w:r>
       <w:proofErr w:type="spellStart"/>
@@ -15718,7 +15731,6 @@
           <w:sz w:val="24"/>
           <w:szCs w:val="24"/>
         </w:rPr>
-        <w:lastRenderedPageBreak/>
         <w:t xml:space="preserve">Uso en el proyecto: actúa como punto de aplicación de políticas (PEP) de la arquitectura Zero Trust. Concentra el enrutamiento entre </w:t>
       </w:r>
       <w:proofErr w:type="spellStart"/>
@@ -16136,6 +16148,7 @@
           <w:sz w:val="24"/>
           <w:szCs w:val="24"/>
         </w:rPr>
+        <w:lastRenderedPageBreak/>
         <w:t xml:space="preserve">IPsec / IKEv2 - </w:t>
       </w:r>
       <w:proofErr w:type="spellStart"/>
@@ -16174,7 +16187,6 @@
           <w:sz w:val="24"/>
           <w:szCs w:val="24"/>
         </w:rPr>
-        <w:lastRenderedPageBreak/>
         <w:t>Descripción: conjunto de protocolos de VPN estandarizado, tradicional en entornos corporativos y de administración pública/defensa.</w:t>
       </w:r>
     </w:p>
@@ -16484,6 +16496,7 @@
           <w:sz w:val="24"/>
           <w:szCs w:val="24"/>
         </w:rPr>
+        <w:lastRenderedPageBreak/>
         <w:t xml:space="preserve">Uso en el proyecto: versiona configuraciones, documentación y evidencias. Los </w:t>
       </w:r>
       <w:proofErr w:type="spellStart"/>
@@ -22542,34 +22555,7 @@
           <w:szCs w:val="24"/>
         </w:rPr>
         <w:lastRenderedPageBreak/>
-        <w:t xml:space="preserve">Ilustración </w:t>
-      </w:r>
-      <w:r>
-        <w:rPr>
-          <w:rFonts w:ascii="Arial" w:hAnsi="Arial" w:cs="Arial"/>
-          <w:color w:val="000000"/>
-          <w:sz w:val="24"/>
-          <w:szCs w:val="24"/>
-        </w:rPr>
-        <w:t>10</w:t>
-      </w:r>
-      <w:r>
-        <w:rPr>
-          <w:rFonts w:ascii="Arial" w:hAnsi="Arial" w:cs="Arial"/>
-          <w:color w:val="000000"/>
-          <w:sz w:val="24"/>
-          <w:szCs w:val="24"/>
-        </w:rPr>
-        <w:t xml:space="preserve">: </w:t>
-      </w:r>
-      <w:r>
-        <w:rPr>
-          <w:rFonts w:ascii="Arial" w:hAnsi="Arial" w:cs="Arial"/>
-          <w:color w:val="000000"/>
-          <w:sz w:val="24"/>
-          <w:szCs w:val="24"/>
-        </w:rPr>
-        <w:t>Creando Vlan10</w:t>
+        <w:t>Ilustración 10: Creando Vlan10</w:t>
       </w:r>
     </w:p>
     <w:p>
@@ -22876,34 +22862,7 @@
           <w:sz w:val="24"/>
           <w:szCs w:val="24"/>
         </w:rPr>
-        <w:t xml:space="preserve">Ilustración </w:t>
-      </w:r>
-      <w:r>
-        <w:rPr>
-          <w:rFonts w:ascii="Arial" w:hAnsi="Arial" w:cs="Arial"/>
-          <w:color w:val="000000"/>
-          <w:sz w:val="24"/>
-          <w:szCs w:val="24"/>
-        </w:rPr>
-        <w:t>10</w:t>
-      </w:r>
-      <w:r>
-        <w:rPr>
-          <w:rFonts w:ascii="Arial" w:hAnsi="Arial" w:cs="Arial"/>
-          <w:color w:val="000000"/>
-          <w:sz w:val="24"/>
-          <w:szCs w:val="24"/>
-        </w:rPr>
-        <w:t xml:space="preserve">: </w:t>
-      </w:r>
-      <w:r>
-        <w:rPr>
-          <w:rFonts w:ascii="Arial" w:hAnsi="Arial" w:cs="Arial"/>
-          <w:color w:val="000000"/>
-          <w:sz w:val="24"/>
-          <w:szCs w:val="24"/>
-        </w:rPr>
-        <w:t xml:space="preserve">Configurando </w:t>
+        <w:t xml:space="preserve">Ilustración 10: Configurando </w:t>
       </w:r>
       <w:proofErr w:type="spellStart"/>
       <w:r>
@@ -23036,34 +22995,7 @@
           <w:sz w:val="24"/>
           <w:szCs w:val="24"/>
         </w:rPr>
-        <w:t xml:space="preserve">Ilustración </w:t>
-      </w:r>
-      <w:r>
-        <w:rPr>
-          <w:rFonts w:ascii="Arial" w:hAnsi="Arial" w:cs="Arial"/>
-          <w:color w:val="000000"/>
-          <w:sz w:val="24"/>
-          <w:szCs w:val="24"/>
-        </w:rPr>
-        <w:t>11</w:t>
-      </w:r>
-      <w:r>
-        <w:rPr>
-          <w:rFonts w:ascii="Arial" w:hAnsi="Arial" w:cs="Arial"/>
-          <w:color w:val="000000"/>
-          <w:sz w:val="24"/>
-          <w:szCs w:val="24"/>
-        </w:rPr>
-        <w:t xml:space="preserve">: </w:t>
-      </w:r>
-      <w:r>
-        <w:rPr>
-          <w:rFonts w:ascii="Arial" w:hAnsi="Arial" w:cs="Arial"/>
-          <w:color w:val="000000"/>
-          <w:sz w:val="24"/>
-          <w:szCs w:val="24"/>
-        </w:rPr>
-        <w:t>Ping funcional</w:t>
+        <w:t>Ilustración 11: Ping funcional</w:t>
       </w:r>
     </w:p>
     <w:p>
@@ -23460,34 +23392,7 @@
           <w:szCs w:val="24"/>
         </w:rPr>
         <w:lastRenderedPageBreak/>
-        <w:t xml:space="preserve">Ilustración </w:t>
-      </w:r>
-      <w:r>
-        <w:rPr>
-          <w:rFonts w:ascii="Arial" w:hAnsi="Arial" w:cs="Arial"/>
-          <w:color w:val="000000"/>
-          <w:sz w:val="24"/>
-          <w:szCs w:val="24"/>
-        </w:rPr>
-        <w:t>12</w:t>
-      </w:r>
-      <w:r>
-        <w:rPr>
-          <w:rFonts w:ascii="Arial" w:hAnsi="Arial" w:cs="Arial"/>
-          <w:color w:val="000000"/>
-          <w:sz w:val="24"/>
-          <w:szCs w:val="24"/>
-        </w:rPr>
-        <w:t xml:space="preserve">: </w:t>
-      </w:r>
-      <w:r>
-        <w:rPr>
-          <w:rFonts w:ascii="Arial" w:hAnsi="Arial" w:cs="Arial"/>
-          <w:color w:val="000000"/>
-          <w:sz w:val="24"/>
-          <w:szCs w:val="24"/>
-        </w:rPr>
-        <w:t xml:space="preserve">Entra a </w:t>
+        <w:t xml:space="preserve">Ilustración 12: Entra a </w:t>
       </w:r>
       <w:proofErr w:type="spellStart"/>
       <w:r>
@@ -23515,6 +23420,7 @@
     <w:p>
       <w:pPr>
         <w:spacing w:before="100" w:beforeAutospacing="1" w:after="100" w:afterAutospacing="1" w:line="360" w:lineRule="auto"/>
+        <w:ind w:left="720" w:hanging="720"/>
         <w:rPr>
           <w:rFonts w:ascii="Arial" w:eastAsia="Times New Roman" w:hAnsi="Arial" w:cs="Arial"/>
           <w:sz w:val="24"/>
@@ -23635,6 +23541,139 @@
     </w:p>
     <w:p>
       <w:pPr>
+        <w:spacing w:before="100" w:beforeAutospacing="1" w:after="100" w:afterAutospacing="1" w:line="360" w:lineRule="auto"/>
+        <w:jc w:val="center"/>
+        <w:rPr>
+          <w:rFonts w:ascii="Arial" w:eastAsia="Times New Roman" w:hAnsi="Arial" w:cs="Arial"/>
+          <w:sz w:val="24"/>
+          <w:szCs w:val="24"/>
+          <w:lang w:val="es-ES"/>
+        </w:rPr>
+      </w:pPr>
+      <w:r>
+        <w:rPr>
+          <w:rFonts w:ascii="Arial" w:eastAsia="Times New Roman" w:hAnsi="Arial" w:cs="Arial"/>
+          <w:noProof/>
+          <w:sz w:val="24"/>
+          <w:szCs w:val="24"/>
+          <w:lang w:val="es-ES"/>
+        </w:rPr>
+        <w:drawing>
+          <wp:inline distT="0" distB="0" distL="0" distR="0">
+            <wp:extent cx="3835400" cy="2766706"/>
+            <wp:effectExtent l="0" t="0" r="0" b="0"/>
+            <wp:docPr id="11" name="Imagen 11"/>
+            <wp:cNvGraphicFramePr>
+              <a:graphicFrameLocks xmlns:a="http://schemas.openxmlformats.org/drawingml/2006/main" noChangeAspect="1"/>
+            </wp:cNvGraphicFramePr>
+            <a:graphic xmlns:a="http://schemas.openxmlformats.org/drawingml/2006/main">
+              <a:graphicData uri="http://schemas.openxmlformats.org/drawingml/2006/picture">
+                <pic:pic xmlns:pic="http://schemas.openxmlformats.org/drawingml/2006/picture">
+                  <pic:nvPicPr>
+                    <pic:cNvPr id="11" name="vlan interfaz.JPG"/>
+                    <pic:cNvPicPr/>
+                  </pic:nvPicPr>
+                  <pic:blipFill>
+                    <a:blip r:embed="rId21" cstate="print">
+                      <a:extLst>
+                        <a:ext uri="{28A0092B-C50C-407E-A947-70E740481C1C}">
+                          <a14:useLocalDpi xmlns:a14="http://schemas.microsoft.com/office/drawing/2010/main" val="0"/>
+                        </a:ext>
+                      </a:extLst>
+                    </a:blip>
+                    <a:stretch>
+                      <a:fillRect/>
+                    </a:stretch>
+                  </pic:blipFill>
+                  <pic:spPr>
+                    <a:xfrm>
+                      <a:off x="0" y="0"/>
+                      <a:ext cx="3849349" cy="2776768"/>
+                    </a:xfrm>
+                    <a:prstGeom prst="rect">
+                      <a:avLst/>
+                    </a:prstGeom>
+                  </pic:spPr>
+                </pic:pic>
+              </a:graphicData>
+            </a:graphic>
+          </wp:inline>
+        </w:drawing>
+      </w:r>
+    </w:p>
+    <w:p>
+      <w:pPr>
+        <w:spacing w:line="360" w:lineRule="auto"/>
+        <w:jc w:val="center"/>
+        <w:rPr>
+          <w:rFonts w:ascii="Arial" w:hAnsi="Arial" w:cs="Arial"/>
+          <w:color w:val="000000"/>
+          <w:sz w:val="24"/>
+          <w:szCs w:val="24"/>
+        </w:rPr>
+      </w:pPr>
+      <w:r>
+        <w:rPr>
+          <w:rFonts w:ascii="Arial" w:hAnsi="Arial" w:cs="Arial"/>
+          <w:color w:val="000000"/>
+          <w:sz w:val="24"/>
+          <w:szCs w:val="24"/>
+        </w:rPr>
+        <w:t>Ilustración 1</w:t>
+      </w:r>
+      <w:r>
+        <w:rPr>
+          <w:rFonts w:ascii="Arial" w:hAnsi="Arial" w:cs="Arial"/>
+          <w:color w:val="000000"/>
+          <w:sz w:val="24"/>
+          <w:szCs w:val="24"/>
+        </w:rPr>
+        <w:t>3</w:t>
+      </w:r>
+      <w:r>
+        <w:rPr>
+          <w:rFonts w:ascii="Arial" w:hAnsi="Arial" w:cs="Arial"/>
+          <w:color w:val="000000"/>
+          <w:sz w:val="24"/>
+          <w:szCs w:val="24"/>
+        </w:rPr>
+        <w:t xml:space="preserve">: </w:t>
+      </w:r>
+      <w:r>
+        <w:rPr>
+          <w:rFonts w:ascii="Arial" w:hAnsi="Arial" w:cs="Arial"/>
+          <w:color w:val="000000"/>
+          <w:sz w:val="24"/>
+          <w:szCs w:val="24"/>
+        </w:rPr>
+        <w:t xml:space="preserve">Redes en </w:t>
+      </w:r>
+      <w:proofErr w:type="spellStart"/>
+      <w:r>
+        <w:rPr>
+          <w:rFonts w:ascii="Arial" w:hAnsi="Arial" w:cs="Arial"/>
+          <w:color w:val="000000"/>
+          <w:sz w:val="24"/>
+          <w:szCs w:val="24"/>
+        </w:rPr>
+        <w:t>pfsense</w:t>
+      </w:r>
+      <w:proofErr w:type="spellEnd"/>
+    </w:p>
+    <w:p>
+      <w:pPr>
+        <w:spacing w:before="100" w:beforeAutospacing="1" w:after="100" w:afterAutospacing="1" w:line="360" w:lineRule="auto"/>
+        <w:jc w:val="center"/>
+        <w:rPr>
+          <w:rFonts w:ascii="Arial" w:eastAsia="Times New Roman" w:hAnsi="Arial" w:cs="Arial"/>
+          <w:sz w:val="24"/>
+          <w:szCs w:val="24"/>
+          <w:lang w:val="es-ES"/>
+        </w:rPr>
+      </w:pPr>
+    </w:p>
+    <w:p>
+      <w:pPr>
         <w:numPr>
           <w:ilvl w:val="0"/>
           <w:numId w:val="4"/>
@@ -23909,6 +23948,139 @@
     </w:p>
     <w:p>
       <w:pPr>
+        <w:spacing w:before="100" w:beforeAutospacing="1" w:after="100" w:afterAutospacing="1" w:line="360" w:lineRule="auto"/>
+        <w:jc w:val="center"/>
+        <w:rPr>
+          <w:rFonts w:ascii="Arial" w:eastAsia="Times New Roman" w:hAnsi="Arial" w:cs="Arial"/>
+          <w:sz w:val="24"/>
+          <w:szCs w:val="24"/>
+          <w:lang w:val="es-ES"/>
+        </w:rPr>
+      </w:pPr>
+      <w:r>
+        <w:rPr>
+          <w:rFonts w:ascii="Arial" w:eastAsia="Times New Roman" w:hAnsi="Arial" w:cs="Arial"/>
+          <w:noProof/>
+          <w:sz w:val="24"/>
+          <w:szCs w:val="24"/>
+          <w:lang w:val="es-ES"/>
+        </w:rPr>
+        <w:lastRenderedPageBreak/>
+        <w:drawing>
+          <wp:inline distT="0" distB="0" distL="0" distR="0">
+            <wp:extent cx="3462867" cy="2610386"/>
+            <wp:effectExtent l="0" t="0" r="4445" b="0"/>
+            <wp:docPr id="17" name="Imagen 17"/>
+            <wp:cNvGraphicFramePr>
+              <a:graphicFrameLocks xmlns:a="http://schemas.openxmlformats.org/drawingml/2006/main" noChangeAspect="1"/>
+            </wp:cNvGraphicFramePr>
+            <a:graphic xmlns:a="http://schemas.openxmlformats.org/drawingml/2006/main">
+              <a:graphicData uri="http://schemas.openxmlformats.org/drawingml/2006/picture">
+                <pic:pic xmlns:pic="http://schemas.openxmlformats.org/drawingml/2006/picture">
+                  <pic:nvPicPr>
+                    <pic:cNvPr id="17" name="habilitada ip.JPG"/>
+                    <pic:cNvPicPr/>
+                  </pic:nvPicPr>
+                  <pic:blipFill>
+                    <a:blip r:embed="rId22" cstate="print">
+                      <a:extLst>
+                        <a:ext uri="{28A0092B-C50C-407E-A947-70E740481C1C}">
+                          <a14:useLocalDpi xmlns:a14="http://schemas.microsoft.com/office/drawing/2010/main" val="0"/>
+                        </a:ext>
+                      </a:extLst>
+                    </a:blip>
+                    <a:stretch>
+                      <a:fillRect/>
+                    </a:stretch>
+                  </pic:blipFill>
+                  <pic:spPr>
+                    <a:xfrm>
+                      <a:off x="0" y="0"/>
+                      <a:ext cx="3475386" cy="2619823"/>
+                    </a:xfrm>
+                    <a:prstGeom prst="rect">
+                      <a:avLst/>
+                    </a:prstGeom>
+                  </pic:spPr>
+                </pic:pic>
+              </a:graphicData>
+            </a:graphic>
+          </wp:inline>
+        </w:drawing>
+      </w:r>
+    </w:p>
+    <w:p>
+      <w:pPr>
+        <w:spacing w:line="360" w:lineRule="auto"/>
+        <w:jc w:val="center"/>
+        <w:rPr>
+          <w:rFonts w:ascii="Arial" w:hAnsi="Arial" w:cs="Arial"/>
+          <w:color w:val="000000"/>
+          <w:sz w:val="24"/>
+          <w:szCs w:val="24"/>
+        </w:rPr>
+      </w:pPr>
+      <w:r>
+        <w:rPr>
+          <w:rFonts w:ascii="Arial" w:hAnsi="Arial" w:cs="Arial"/>
+          <w:color w:val="000000"/>
+          <w:sz w:val="24"/>
+          <w:szCs w:val="24"/>
+        </w:rPr>
+        <w:t>Ilustración 1</w:t>
+      </w:r>
+      <w:r>
+        <w:rPr>
+          <w:rFonts w:ascii="Arial" w:hAnsi="Arial" w:cs="Arial"/>
+          <w:color w:val="000000"/>
+          <w:sz w:val="24"/>
+          <w:szCs w:val="24"/>
+        </w:rPr>
+        <w:t>4</w:t>
+      </w:r>
+      <w:r>
+        <w:rPr>
+          <w:rFonts w:ascii="Arial" w:hAnsi="Arial" w:cs="Arial"/>
+          <w:color w:val="000000"/>
+          <w:sz w:val="24"/>
+          <w:szCs w:val="24"/>
+        </w:rPr>
+        <w:t xml:space="preserve">: </w:t>
+      </w:r>
+      <w:proofErr w:type="spellStart"/>
+      <w:r>
+        <w:rPr>
+          <w:rFonts w:ascii="Arial" w:hAnsi="Arial" w:cs="Arial"/>
+          <w:color w:val="000000"/>
+          <w:sz w:val="24"/>
+          <w:szCs w:val="24"/>
+        </w:rPr>
+        <w:t>Ip</w:t>
+      </w:r>
+      <w:proofErr w:type="spellEnd"/>
+      <w:r>
+        <w:rPr>
+          <w:rFonts w:ascii="Arial" w:hAnsi="Arial" w:cs="Arial"/>
+          <w:color w:val="000000"/>
+          <w:sz w:val="24"/>
+          <w:szCs w:val="24"/>
+        </w:rPr>
+        <w:t xml:space="preserve"> en </w:t>
+      </w:r>
+      <w:proofErr w:type="spellStart"/>
+      <w:r>
+        <w:rPr>
+          <w:rFonts w:ascii="Arial" w:hAnsi="Arial" w:cs="Arial"/>
+          <w:color w:val="000000"/>
+          <w:sz w:val="24"/>
+          <w:szCs w:val="24"/>
+        </w:rPr>
+        <w:t>pfsense</w:t>
+      </w:r>
+      <w:proofErr w:type="spellEnd"/>
+    </w:p>
+    <w:p>
+      <w:pPr>
         <w:numPr>
           <w:ilvl w:val="1"/>
           <w:numId w:val="4"/>
@@ -23957,6 +24129,128 @@
     </w:p>
     <w:p>
       <w:pPr>
+        <w:spacing w:before="100" w:beforeAutospacing="1" w:after="100" w:afterAutospacing="1" w:line="360" w:lineRule="auto"/>
+        <w:ind w:left="720"/>
+        <w:jc w:val="center"/>
+        <w:rPr>
+          <w:rFonts w:ascii="Arial" w:eastAsia="Times New Roman" w:hAnsi="Arial" w:cs="Arial"/>
+          <w:sz w:val="24"/>
+          <w:szCs w:val="24"/>
+          <w:lang w:val="es-ES"/>
+        </w:rPr>
+      </w:pPr>
+      <w:r>
+        <w:rPr>
+          <w:rFonts w:ascii="Arial" w:eastAsia="Times New Roman" w:hAnsi="Arial" w:cs="Arial"/>
+          <w:noProof/>
+          <w:sz w:val="24"/>
+          <w:szCs w:val="24"/>
+          <w:lang w:val="es-ES"/>
+        </w:rPr>
+        <w:drawing>
+          <wp:inline distT="0" distB="0" distL="0" distR="0">
+            <wp:extent cx="3217333" cy="2358641"/>
+            <wp:effectExtent l="0" t="0" r="2540" b="3810"/>
+            <wp:docPr id="18" name="Imagen 18"/>
+            <wp:cNvGraphicFramePr>
+              <a:graphicFrameLocks xmlns:a="http://schemas.openxmlformats.org/drawingml/2006/main" noChangeAspect="1"/>
+            </wp:cNvGraphicFramePr>
+            <a:graphic xmlns:a="http://schemas.openxmlformats.org/drawingml/2006/main">
+              <a:graphicData uri="http://schemas.openxmlformats.org/drawingml/2006/picture">
+                <pic:pic xmlns:pic="http://schemas.openxmlformats.org/drawingml/2006/picture">
+                  <pic:nvPicPr>
+                    <pic:cNvPr id="18" name="ahora el dhcp.JPG"/>
+                    <pic:cNvPicPr/>
+                  </pic:nvPicPr>
+                  <pic:blipFill>
+                    <a:blip r:embed="rId23" cstate="print">
+                      <a:extLst>
+                        <a:ext uri="{28A0092B-C50C-407E-A947-70E740481C1C}">
+                          <a14:useLocalDpi xmlns:a14="http://schemas.microsoft.com/office/drawing/2010/main" val="0"/>
+                        </a:ext>
+                      </a:extLst>
+                    </a:blip>
+                    <a:stretch>
+                      <a:fillRect/>
+                    </a:stretch>
+                  </pic:blipFill>
+                  <pic:spPr>
+                    <a:xfrm>
+                      <a:off x="0" y="0"/>
+                      <a:ext cx="3225277" cy="2364465"/>
+                    </a:xfrm>
+                    <a:prstGeom prst="rect">
+                      <a:avLst/>
+                    </a:prstGeom>
+                  </pic:spPr>
+                </pic:pic>
+              </a:graphicData>
+            </a:graphic>
+          </wp:inline>
+        </w:drawing>
+      </w:r>
+    </w:p>
+    <w:p>
+      <w:pPr>
+        <w:spacing w:line="360" w:lineRule="auto"/>
+        <w:jc w:val="center"/>
+        <w:rPr>
+          <w:rFonts w:ascii="Arial" w:hAnsi="Arial" w:cs="Arial"/>
+          <w:color w:val="000000"/>
+          <w:sz w:val="24"/>
+          <w:szCs w:val="24"/>
+        </w:rPr>
+      </w:pPr>
+      <w:r>
+        <w:rPr>
+          <w:rFonts w:ascii="Arial" w:hAnsi="Arial" w:cs="Arial"/>
+          <w:color w:val="000000"/>
+          <w:sz w:val="24"/>
+          <w:szCs w:val="24"/>
+        </w:rPr>
+        <w:t>Ilustración 1</w:t>
+      </w:r>
+      <w:r>
+        <w:rPr>
+          <w:rFonts w:ascii="Arial" w:hAnsi="Arial" w:cs="Arial"/>
+          <w:color w:val="000000"/>
+          <w:sz w:val="24"/>
+          <w:szCs w:val="24"/>
+        </w:rPr>
+        <w:t>5</w:t>
+      </w:r>
+      <w:r>
+        <w:rPr>
+          <w:rFonts w:ascii="Arial" w:hAnsi="Arial" w:cs="Arial"/>
+          <w:color w:val="000000"/>
+          <w:sz w:val="24"/>
+          <w:szCs w:val="24"/>
+        </w:rPr>
+        <w:t xml:space="preserve">: </w:t>
+      </w:r>
+      <w:r>
+        <w:rPr>
+          <w:rFonts w:ascii="Arial" w:hAnsi="Arial" w:cs="Arial"/>
+          <w:color w:val="000000"/>
+          <w:sz w:val="24"/>
+          <w:szCs w:val="24"/>
+        </w:rPr>
+        <w:t xml:space="preserve">DHCP en </w:t>
+      </w:r>
+      <w:proofErr w:type="spellStart"/>
+      <w:r>
+        <w:rPr>
+          <w:rFonts w:ascii="Arial" w:hAnsi="Arial" w:cs="Arial"/>
+          <w:color w:val="000000"/>
+          <w:sz w:val="24"/>
+          <w:szCs w:val="24"/>
+        </w:rPr>
+        <w:t>pfsense</w:t>
+      </w:r>
+      <w:proofErr w:type="spellEnd"/>
+    </w:p>
+    <w:p>
+      <w:pPr>
         <w:numPr>
           <w:ilvl w:val="0"/>
           <w:numId w:val="4"/>
@@ -24007,7 +24301,7 @@
           <w:szCs w:val="24"/>
           <w:lang w:val="es-ES"/>
         </w:rPr>
-        <w:t xml:space="preserve"> con WAN/LAN/OPT1–OPT4; configuración de cada interfaz; pestañas de DHCP (Ilustración X).</w:t>
+        <w:t xml:space="preserve"> con WAN/LAN/OPT1–OPT4; configuración de cada interfaz; pestañas de DHCP</w:t>
       </w:r>
     </w:p>
     <w:p>
@@ -24033,7 +24327,7 @@
           <w:szCs w:val="24"/>
           <w:lang w:val="es-ES"/>
         </w:rPr>
-        <w:t>Incidencia (controlada):</w:t>
+        <w:t>Resultado:</w:t>
       </w:r>
       <w:r>
         <w:rPr>
@@ -24042,7 +24336,27 @@
           <w:szCs w:val="24"/>
           <w:lang w:val="es-ES"/>
         </w:rPr>
-        <w:t xml:space="preserve"> durante la asignación, por una descripción ambigua se cambió por error la interfaz LAN a la VLAN 20, lo que habría dejado la gestión sin acceso (entra por la VLAN 10). Se detectó </w:t>
+        <w:t xml:space="preserve"> R01F01 completo. Las cinco zonas (</w:t>
+      </w:r>
+      <w:proofErr w:type="spellStart"/>
+      <w:r>
+        <w:rPr>
+          <w:rFonts w:ascii="Arial" w:eastAsia="Times New Roman" w:hAnsi="Arial" w:cs="Arial"/>
+          <w:sz w:val="24"/>
+          <w:szCs w:val="24"/>
+          <w:lang w:val="es-ES"/>
+        </w:rPr>
+        <w:t>VLANs</w:t>
+      </w:r>
+      <w:proofErr w:type="spellEnd"/>
+      <w:r>
+        <w:rPr>
+          <w:rFonts w:ascii="Arial" w:eastAsia="Times New Roman" w:hAnsi="Arial" w:cs="Arial"/>
+          <w:sz w:val="24"/>
+          <w:szCs w:val="24"/>
+          <w:lang w:val="es-ES"/>
+        </w:rPr>
+        <w:t xml:space="preserve"> 10–50) quedan creadas, direccionadas y con DHCP. Las interfaces OPT nacen </w:t>
       </w:r>
       <w:r>
         <w:rPr>
@@ -24053,52 +24367,8 @@
           <w:szCs w:val="24"/>
           <w:lang w:val="es-ES"/>
         </w:rPr>
-        <w:t>antes de guardar</w:t>
-      </w:r>
-      <w:r>
-        <w:rPr>
-          <w:rFonts w:ascii="Arial" w:eastAsia="Times New Roman" w:hAnsi="Arial" w:cs="Arial"/>
-          <w:sz w:val="24"/>
-          <w:szCs w:val="24"/>
-          <w:lang w:val="es-ES"/>
-        </w:rPr>
-        <w:t xml:space="preserve"> y se corrigió: la LAN se devolvió a la VLAN 10 y las </w:t>
-      </w:r>
-      <w:proofErr w:type="spellStart"/>
-      <w:r>
-        <w:rPr>
-          <w:rFonts w:ascii="Arial" w:eastAsia="Times New Roman" w:hAnsi="Arial" w:cs="Arial"/>
-          <w:sz w:val="24"/>
-          <w:szCs w:val="24"/>
-          <w:lang w:val="es-ES"/>
-        </w:rPr>
-        <w:t>VLANs</w:t>
-      </w:r>
-      <w:proofErr w:type="spellEnd"/>
-      <w:r>
-        <w:rPr>
-          <w:rFonts w:ascii="Arial" w:eastAsia="Times New Roman" w:hAnsi="Arial" w:cs="Arial"/>
-          <w:sz w:val="24"/>
-          <w:szCs w:val="24"/>
-          <w:lang w:val="es-ES"/>
-        </w:rPr>
-        <w:t xml:space="preserve"> nuevas se añadieron correctamente como interfaces OPT.</w:t>
-      </w:r>
-    </w:p>
-    <w:p>
-      <w:pPr>
-        <w:numPr>
-          <w:ilvl w:val="0"/>
-          <w:numId w:val="4"/>
-        </w:numPr>
-        <w:spacing w:before="100" w:beforeAutospacing="1" w:after="100" w:afterAutospacing="1" w:line="360" w:lineRule="auto"/>
-        <w:rPr>
-          <w:rFonts w:ascii="Arial" w:eastAsia="Times New Roman" w:hAnsi="Arial" w:cs="Arial"/>
-          <w:sz w:val="24"/>
-          <w:szCs w:val="24"/>
-          <w:lang w:val="es-ES"/>
-        </w:rPr>
-      </w:pPr>
+        <w:t xml:space="preserve">sin reglas </w:t>
+      </w:r>
       <w:r>
         <w:rPr>
           <w:rFonts w:ascii="Arial" w:eastAsia="Times New Roman" w:hAnsi="Arial" w:cs="Arial"/>
@@ -24108,7 +24378,8 @@
           <w:szCs w:val="24"/>
           <w:lang w:val="es-ES"/>
         </w:rPr>
-        <w:t>Resultado:</w:t>
+        <w:lastRenderedPageBreak/>
+        <w:t>(denegación por defecto)</w:t>
       </w:r>
       <w:r>
         <w:rPr>
@@ -24117,28 +24388,19 @@
           <w:szCs w:val="24"/>
           <w:lang w:val="es-ES"/>
         </w:rPr>
-        <w:t xml:space="preserve"> R01F01 completo. Las cinco zonas (</w:t>
-      </w:r>
-      <w:proofErr w:type="spellStart"/>
-      <w:r>
+        <w:t>, que constituye la línea base del modelo Zero Trust; la conectividad y el aislamiento entre zonas se validarán en R02.</w:t>
+      </w:r>
+    </w:p>
+    <w:p>
+      <w:pPr>
+        <w:spacing w:before="100" w:beforeAutospacing="1" w:after="100" w:afterAutospacing="1" w:line="240" w:lineRule="auto"/>
         <w:rPr>
           <w:rFonts w:ascii="Arial" w:eastAsia="Times New Roman" w:hAnsi="Arial" w:cs="Arial"/>
           <w:sz w:val="24"/>
           <w:szCs w:val="24"/>
           <w:lang w:val="es-ES"/>
         </w:rPr>
-        <w:t>VLANs</w:t>
-      </w:r>
-      <w:proofErr w:type="spellEnd"/>
-      <w:r>
-        <w:rPr>
-          <w:rFonts w:ascii="Arial" w:eastAsia="Times New Roman" w:hAnsi="Arial" w:cs="Arial"/>
-          <w:sz w:val="24"/>
-          <w:szCs w:val="24"/>
-          <w:lang w:val="es-ES"/>
-        </w:rPr>
-        <w:t xml:space="preserve"> 10–50) quedan creadas, direccionadas y con DHCP. Las interfaces OPT nacen </w:t>
-      </w:r>
+      </w:pPr>
       <w:r>
         <w:rPr>
           <w:rFonts w:ascii="Arial" w:eastAsia="Times New Roman" w:hAnsi="Arial" w:cs="Arial"/>
@@ -24148,330 +24410,1635 @@
           <w:szCs w:val="24"/>
           <w:lang w:val="es-ES"/>
         </w:rPr>
-        <w:t>sin reglas (denegación por defecto)</w:t>
-      </w:r>
-      <w:r>
+        <w:t>R02 — Microsegmentación (denegación por defecto y mínimo privilegio)</w:t>
+      </w:r>
+    </w:p>
+    <w:p>
+      <w:pPr>
+        <w:numPr>
+          <w:ilvl w:val="0"/>
+          <w:numId w:val="5"/>
+        </w:numPr>
+        <w:spacing w:before="100" w:beforeAutospacing="1" w:after="100" w:afterAutospacing="1" w:line="240" w:lineRule="auto"/>
         <w:rPr>
           <w:rFonts w:ascii="Arial" w:eastAsia="Times New Roman" w:hAnsi="Arial" w:cs="Arial"/>
           <w:sz w:val="24"/>
           <w:szCs w:val="24"/>
           <w:lang w:val="es-ES"/>
         </w:rPr>
-        <w:t>, que constituye la línea base del modelo Zero Trust; la conectividad y el aislamiento entre zonas se validarán en R02.</w:t>
-      </w:r>
-    </w:p>
-    <w:p>
-      <w:pPr>
-        <w:spacing w:line="360" w:lineRule="auto"/>
-        <w:jc w:val="both"/>
-        <w:rPr>
-          <w:rFonts w:ascii="Arial" w:eastAsia="Arial" w:hAnsi="Arial" w:cs="Arial"/>
-          <w:i/>
-          <w:color w:val="FF0000"/>
-          <w:sz w:val="24"/>
-          <w:szCs w:val="24"/>
-        </w:rPr>
-      </w:pPr>
-      <w:r>
-        <w:rPr>
-          <w:rFonts w:ascii="Arial" w:eastAsia="Arial" w:hAnsi="Arial" w:cs="Arial"/>
-          <w:i/>
-          <w:color w:val="FF0000"/>
-          <w:sz w:val="24"/>
-          <w:szCs w:val="24"/>
-        </w:rPr>
-        <w:t xml:space="preserve">Meter imágenes de </w:t>
-      </w:r>
+      </w:pPr>
       <w:r>
         <w:rPr>
           <w:rFonts w:ascii="Arial" w:eastAsia="Times New Roman" w:hAnsi="Arial" w:cs="Arial"/>
           <w:b/>
           <w:bCs/>
-          <w:i/>
-          <w:color w:val="FF0000"/>
           <w:sz w:val="24"/>
           <w:szCs w:val="24"/>
           <w:lang w:val="es-ES"/>
         </w:rPr>
-        <w:t>R01F01T01 (continuación)</w:t>
-      </w:r>
-    </w:p>
-    <w:p>
-      <w:pPr>
-        <w:spacing w:line="360" w:lineRule="auto"/>
-        <w:jc w:val="both"/>
-        <w:rPr>
-          <w:rFonts w:ascii="Arial" w:eastAsia="Arial" w:hAnsi="Arial" w:cs="Arial"/>
-          <w:color w:val="000000"/>
-          <w:sz w:val="24"/>
-          <w:szCs w:val="24"/>
-          <w:u w:val="single"/>
-        </w:rPr>
-      </w:pPr>
-    </w:p>
-    <w:p>
-      <w:pPr>
-        <w:spacing w:line="360" w:lineRule="auto"/>
-        <w:jc w:val="both"/>
-        <w:rPr>
-          <w:rFonts w:ascii="Arial" w:eastAsia="Arial" w:hAnsi="Arial" w:cs="Arial"/>
-          <w:color w:val="000000"/>
-          <w:sz w:val="24"/>
-          <w:szCs w:val="24"/>
-        </w:rPr>
-      </w:pPr>
-    </w:p>
-    <w:p>
-      <w:pPr>
-        <w:spacing w:line="360" w:lineRule="auto"/>
-        <w:jc w:val="both"/>
-        <w:rPr>
-          <w:rFonts w:ascii="Arial" w:eastAsia="Arial" w:hAnsi="Arial" w:cs="Arial"/>
-          <w:color w:val="000000"/>
-          <w:sz w:val="24"/>
-          <w:szCs w:val="24"/>
-        </w:rPr>
-      </w:pPr>
-    </w:p>
-    <w:p>
-      <w:pPr>
-        <w:spacing w:line="360" w:lineRule="auto"/>
-        <w:jc w:val="both"/>
-        <w:rPr>
-          <w:rFonts w:ascii="Arial" w:eastAsia="Arial" w:hAnsi="Arial" w:cs="Arial"/>
-          <w:color w:val="000000"/>
-          <w:sz w:val="24"/>
-          <w:szCs w:val="24"/>
-        </w:rPr>
-      </w:pPr>
-    </w:p>
-    <w:p>
-      <w:pPr>
-        <w:spacing w:line="360" w:lineRule="auto"/>
-        <w:jc w:val="both"/>
-        <w:rPr>
-          <w:rFonts w:ascii="Arial" w:eastAsia="Arial" w:hAnsi="Arial" w:cs="Arial"/>
-          <w:color w:val="000000"/>
-          <w:sz w:val="24"/>
-          <w:szCs w:val="24"/>
-        </w:rPr>
-      </w:pPr>
-      <w:r>
-        <w:rPr>
-          <w:rFonts w:ascii="Arial" w:eastAsia="Arial" w:hAnsi="Arial" w:cs="Arial"/>
-          <w:color w:val="000000"/>
-          <w:sz w:val="24"/>
-          <w:szCs w:val="24"/>
-        </w:rPr>
-        <w:t>DESPLIEGUE E INSTALACIÓN</w:t>
-      </w:r>
-    </w:p>
-    <w:p>
-      <w:pPr>
-        <w:spacing w:line="360" w:lineRule="auto"/>
-        <w:jc w:val="both"/>
-        <w:rPr>
-          <w:rFonts w:ascii="Arial" w:eastAsia="Arial" w:hAnsi="Arial" w:cs="Arial"/>
-          <w:color w:val="000000"/>
-          <w:sz w:val="24"/>
-          <w:szCs w:val="24"/>
-        </w:rPr>
-      </w:pPr>
-      <w:r>
-        <w:rPr>
-          <w:rFonts w:ascii="Arial" w:eastAsia="Arial" w:hAnsi="Arial" w:cs="Arial"/>
+        <w:t>Objetivo:</w:t>
+      </w:r>
+      <w:r>
+        <w:rPr>
+          <w:rFonts w:ascii="Arial" w:eastAsia="Times New Roman" w:hAnsi="Arial" w:cs="Arial"/>
+          <w:sz w:val="24"/>
+          <w:szCs w:val="24"/>
+          <w:lang w:val="es-ES"/>
+        </w:rPr>
+        <w:t xml:space="preserve"> aplicar una política de denegación por defecto y permitir únicamente los flujos estrictamente necesarios entre zonas.</w:t>
+      </w:r>
+    </w:p>
+    <w:p>
+      <w:pPr>
+        <w:numPr>
+          <w:ilvl w:val="0"/>
+          <w:numId w:val="5"/>
+        </w:numPr>
+        <w:spacing w:before="100" w:beforeAutospacing="1" w:after="100" w:afterAutospacing="1" w:line="240" w:lineRule="auto"/>
+        <w:rPr>
+          <w:rFonts w:ascii="Arial" w:eastAsia="Times New Roman" w:hAnsi="Arial" w:cs="Arial"/>
+          <w:sz w:val="24"/>
+          <w:szCs w:val="24"/>
+          <w:lang w:val="es-ES"/>
+        </w:rPr>
+      </w:pPr>
+      <w:r>
+        <w:rPr>
+          <w:rFonts w:ascii="Arial" w:eastAsia="Times New Roman" w:hAnsi="Arial" w:cs="Arial"/>
           <w:b/>
           <w:bCs/>
-          <w:color w:val="000000"/>
-          <w:sz w:val="24"/>
-          <w:szCs w:val="24"/>
-        </w:rPr>
-        <w:t>Metodología usada</w:t>
-      </w:r>
-    </w:p>
-    <w:p>
-      <w:pPr>
-        <w:spacing w:line="360" w:lineRule="auto"/>
-        <w:jc w:val="both"/>
-        <w:rPr>
-          <w:rFonts w:ascii="Arial" w:eastAsia="Arial" w:hAnsi="Arial" w:cs="Arial"/>
-          <w:color w:val="000000"/>
-          <w:sz w:val="24"/>
-          <w:szCs w:val="24"/>
-        </w:rPr>
-      </w:pPr>
-      <w:r>
-        <w:rPr>
-          <w:rFonts w:ascii="Arial" w:eastAsia="Arial" w:hAnsi="Arial" w:cs="Arial"/>
-          <w:color w:val="000000"/>
-          <w:sz w:val="24"/>
-          <w:szCs w:val="24"/>
-        </w:rPr>
-        <w:t>La metodología seguida es iterativa</w:t>
-      </w:r>
-    </w:p>
-    <w:p>
-      <w:pPr>
-        <w:spacing w:line="360" w:lineRule="auto"/>
-        <w:jc w:val="both"/>
-        <w:rPr>
-          <w:rFonts w:ascii="Arial" w:eastAsia="Arial" w:hAnsi="Arial" w:cs="Arial"/>
-          <w:color w:val="000000"/>
-          <w:sz w:val="24"/>
-          <w:szCs w:val="24"/>
-        </w:rPr>
-      </w:pPr>
-    </w:p>
-    <w:p>
-      <w:pPr>
-        <w:spacing w:line="360" w:lineRule="auto"/>
-        <w:jc w:val="both"/>
-        <w:rPr>
-          <w:rFonts w:ascii="Arial" w:eastAsia="Arial" w:hAnsi="Arial" w:cs="Arial"/>
-          <w:color w:val="000000"/>
-          <w:sz w:val="24"/>
-          <w:szCs w:val="24"/>
-        </w:rPr>
-      </w:pPr>
-    </w:p>
-    <w:p>
-      <w:pPr>
-        <w:spacing w:line="360" w:lineRule="auto"/>
-        <w:jc w:val="both"/>
-        <w:rPr>
-          <w:rFonts w:ascii="Arial" w:eastAsia="Arial" w:hAnsi="Arial" w:cs="Arial"/>
-          <w:color w:val="000000"/>
-          <w:sz w:val="24"/>
-          <w:szCs w:val="24"/>
-        </w:rPr>
-      </w:pPr>
-    </w:p>
-    <w:p>
-      <w:pPr>
-        <w:spacing w:line="360" w:lineRule="auto"/>
-        <w:jc w:val="both"/>
-        <w:rPr>
-          <w:rFonts w:ascii="Arial" w:eastAsia="Arial" w:hAnsi="Arial" w:cs="Arial"/>
-          <w:color w:val="000000"/>
-          <w:sz w:val="24"/>
-          <w:szCs w:val="24"/>
-        </w:rPr>
-      </w:pPr>
-    </w:p>
-    <w:p>
-      <w:pPr>
-        <w:spacing w:line="360" w:lineRule="auto"/>
-        <w:jc w:val="both"/>
-        <w:rPr>
-          <w:rFonts w:ascii="Arial" w:eastAsia="Arial" w:hAnsi="Arial" w:cs="Arial"/>
-          <w:color w:val="000000"/>
-          <w:sz w:val="24"/>
-          <w:szCs w:val="24"/>
-        </w:rPr>
-      </w:pPr>
-    </w:p>
-    <w:p>
-      <w:pPr>
-        <w:spacing w:line="360" w:lineRule="auto"/>
-        <w:jc w:val="both"/>
-        <w:rPr>
-          <w:rFonts w:ascii="Arial" w:eastAsia="Arial" w:hAnsi="Arial" w:cs="Arial"/>
-          <w:color w:val="000000"/>
-          <w:sz w:val="24"/>
-          <w:szCs w:val="24"/>
-        </w:rPr>
-      </w:pPr>
-    </w:p>
-    <w:p>
-      <w:pPr>
-        <w:spacing w:line="360" w:lineRule="auto"/>
-        <w:jc w:val="both"/>
-        <w:rPr>
-          <w:rFonts w:ascii="Arial" w:eastAsia="Arial" w:hAnsi="Arial" w:cs="Arial"/>
-          <w:color w:val="000000"/>
-          <w:sz w:val="24"/>
-          <w:szCs w:val="24"/>
-        </w:rPr>
-      </w:pPr>
-    </w:p>
-    <w:p>
-      <w:pPr>
-        <w:spacing w:line="360" w:lineRule="auto"/>
-        <w:jc w:val="both"/>
-        <w:rPr>
-          <w:rFonts w:ascii="Arial" w:eastAsia="Arial" w:hAnsi="Arial" w:cs="Arial"/>
-          <w:color w:val="000000"/>
-          <w:sz w:val="24"/>
-          <w:szCs w:val="24"/>
-        </w:rPr>
-      </w:pPr>
-    </w:p>
-    <w:p>
-      <w:pPr>
-        <w:spacing w:line="360" w:lineRule="auto"/>
-        <w:jc w:val="both"/>
-        <w:rPr>
-          <w:rFonts w:ascii="Arial" w:eastAsia="Arial" w:hAnsi="Arial" w:cs="Arial"/>
-          <w:color w:val="000000"/>
-          <w:sz w:val="24"/>
-          <w:szCs w:val="24"/>
-        </w:rPr>
-      </w:pPr>
-    </w:p>
-    <w:p>
-      <w:pPr>
-        <w:spacing w:line="360" w:lineRule="auto"/>
-        <w:jc w:val="both"/>
-        <w:rPr>
-          <w:rFonts w:ascii="Arial" w:eastAsia="Arial" w:hAnsi="Arial" w:cs="Arial"/>
-          <w:color w:val="000000"/>
-          <w:sz w:val="24"/>
-          <w:szCs w:val="24"/>
-        </w:rPr>
-      </w:pPr>
-    </w:p>
-    <w:p>
-      <w:pPr>
-        <w:spacing w:line="360" w:lineRule="auto"/>
-        <w:jc w:val="both"/>
-        <w:rPr>
-          <w:rFonts w:ascii="Arial" w:eastAsia="Arial" w:hAnsi="Arial" w:cs="Arial"/>
-          <w:color w:val="000000"/>
-          <w:sz w:val="24"/>
-          <w:szCs w:val="24"/>
-        </w:rPr>
-      </w:pPr>
-    </w:p>
-    <w:p>
-      <w:pPr>
-        <w:spacing w:line="360" w:lineRule="auto"/>
-        <w:jc w:val="both"/>
-        <w:rPr>
-          <w:rFonts w:ascii="Arial" w:eastAsia="Arial" w:hAnsi="Arial" w:cs="Arial"/>
-          <w:color w:val="000000"/>
-          <w:sz w:val="24"/>
-          <w:szCs w:val="24"/>
-        </w:rPr>
-      </w:pPr>
-    </w:p>
-    <w:p>
-      <w:pPr>
-        <w:spacing w:line="360" w:lineRule="auto"/>
-        <w:jc w:val="both"/>
-        <w:rPr>
-          <w:rFonts w:ascii="Arial" w:eastAsia="Arial" w:hAnsi="Arial" w:cs="Arial"/>
-          <w:color w:val="000000"/>
-          <w:sz w:val="24"/>
-          <w:szCs w:val="24"/>
-        </w:rPr>
-      </w:pPr>
-    </w:p>
-    <w:p>
-      <w:pPr>
-        <w:spacing w:line="360" w:lineRule="auto"/>
-        <w:jc w:val="both"/>
-        <w:rPr>
-          <w:rFonts w:ascii="Arial" w:eastAsia="Arial" w:hAnsi="Arial" w:cs="Arial"/>
+          <w:sz w:val="24"/>
+          <w:szCs w:val="24"/>
+          <w:lang w:val="es-ES"/>
+        </w:rPr>
+        <w:t>Fundamento (</w:t>
+      </w:r>
+      <w:proofErr w:type="spellStart"/>
+      <w:r>
+        <w:rPr>
+          <w:rFonts w:ascii="Arial" w:eastAsia="Times New Roman" w:hAnsi="Arial" w:cs="Arial"/>
+          <w:b/>
+          <w:bCs/>
+          <w:sz w:val="24"/>
+          <w:szCs w:val="24"/>
+          <w:lang w:val="es-ES"/>
+        </w:rPr>
+        <w:t>pfSense</w:t>
+      </w:r>
+      <w:proofErr w:type="spellEnd"/>
+      <w:r>
+        <w:rPr>
+          <w:rFonts w:ascii="Arial" w:eastAsia="Times New Roman" w:hAnsi="Arial" w:cs="Arial"/>
+          <w:b/>
+          <w:bCs/>
+          <w:sz w:val="24"/>
+          <w:szCs w:val="24"/>
+          <w:lang w:val="es-ES"/>
+        </w:rPr>
+        <w:t>):</w:t>
+      </w:r>
+      <w:r>
+        <w:rPr>
+          <w:rFonts w:ascii="Arial" w:eastAsia="Times New Roman" w:hAnsi="Arial" w:cs="Arial"/>
+          <w:sz w:val="24"/>
+          <w:szCs w:val="24"/>
+          <w:lang w:val="es-ES"/>
+        </w:rPr>
+        <w:t xml:space="preserve"> las reglas se evalúan en la </w:t>
+      </w:r>
+      <w:r>
+        <w:rPr>
+          <w:rFonts w:ascii="Arial" w:eastAsia="Times New Roman" w:hAnsi="Arial" w:cs="Arial"/>
+          <w:b/>
+          <w:bCs/>
+          <w:sz w:val="24"/>
+          <w:szCs w:val="24"/>
+          <w:lang w:val="es-ES"/>
+        </w:rPr>
+        <w:t>interfaz de origen</w:t>
+      </w:r>
+      <w:r>
+        <w:rPr>
+          <w:rFonts w:ascii="Arial" w:eastAsia="Times New Roman" w:hAnsi="Arial" w:cs="Arial"/>
+          <w:sz w:val="24"/>
+          <w:szCs w:val="24"/>
+          <w:lang w:val="es-ES"/>
+        </w:rPr>
+        <w:t xml:space="preserve">, de arriba abajo (gana la primera coincidencia), con una </w:t>
+      </w:r>
+      <w:r>
+        <w:rPr>
+          <w:rFonts w:ascii="Arial" w:eastAsia="Times New Roman" w:hAnsi="Arial" w:cs="Arial"/>
+          <w:b/>
+          <w:bCs/>
+          <w:sz w:val="24"/>
+          <w:szCs w:val="24"/>
+          <w:lang w:val="es-ES"/>
+        </w:rPr>
+        <w:t>denegación implícita</w:t>
+      </w:r>
+      <w:r>
+        <w:rPr>
+          <w:rFonts w:ascii="Arial" w:eastAsia="Times New Roman" w:hAnsi="Arial" w:cs="Arial"/>
+          <w:sz w:val="24"/>
+          <w:szCs w:val="24"/>
+          <w:lang w:val="es-ES"/>
+        </w:rPr>
+        <w:t xml:space="preserve"> al final; todo lo no permitido queda bloqueado.</w:t>
+      </w:r>
+    </w:p>
+    <w:p>
+      <w:pPr>
+        <w:numPr>
+          <w:ilvl w:val="0"/>
+          <w:numId w:val="5"/>
+        </w:numPr>
+        <w:spacing w:before="100" w:beforeAutospacing="1" w:after="100" w:afterAutospacing="1" w:line="240" w:lineRule="auto"/>
+        <w:rPr>
+          <w:rFonts w:ascii="Arial" w:eastAsia="Times New Roman" w:hAnsi="Arial" w:cs="Arial"/>
+          <w:sz w:val="24"/>
+          <w:szCs w:val="24"/>
+          <w:lang w:val="es-ES"/>
+        </w:rPr>
+      </w:pPr>
+      <w:r>
+        <w:rPr>
+          <w:rFonts w:ascii="Arial" w:eastAsia="Times New Roman" w:hAnsi="Arial" w:cs="Arial"/>
+          <w:b/>
+          <w:bCs/>
+          <w:sz w:val="24"/>
+          <w:szCs w:val="24"/>
+          <w:lang w:val="es-ES"/>
+        </w:rPr>
+        <w:t>Reglas implementadas:</w:t>
+      </w:r>
+    </w:p>
+    <w:p>
+      <w:pPr>
+        <w:numPr>
+          <w:ilvl w:val="1"/>
+          <w:numId w:val="5"/>
+        </w:numPr>
+        <w:spacing w:before="100" w:beforeAutospacing="1" w:after="100" w:afterAutospacing="1" w:line="240" w:lineRule="auto"/>
+        <w:rPr>
+          <w:rFonts w:ascii="Arial" w:eastAsia="Times New Roman" w:hAnsi="Arial" w:cs="Arial"/>
+          <w:sz w:val="24"/>
+          <w:szCs w:val="24"/>
+          <w:lang w:val="es-ES"/>
+        </w:rPr>
+      </w:pPr>
+      <w:r>
+        <w:rPr>
+          <w:rFonts w:ascii="Arial" w:eastAsia="Times New Roman" w:hAnsi="Arial" w:cs="Arial"/>
+          <w:i/>
+          <w:iCs/>
+          <w:sz w:val="24"/>
+          <w:szCs w:val="24"/>
+          <w:lang w:val="es-ES"/>
+        </w:rPr>
+        <w:t>DMZ → Servidores (TCP 5432)</w:t>
+      </w:r>
+      <w:r>
+        <w:rPr>
+          <w:rFonts w:ascii="Arial" w:eastAsia="Times New Roman" w:hAnsi="Arial" w:cs="Arial"/>
+          <w:sz w:val="24"/>
+          <w:szCs w:val="24"/>
+          <w:lang w:val="es-ES"/>
+        </w:rPr>
+        <w:t>: el servicio de la DMZ accede a la base de datos/aplicación.</w:t>
+      </w:r>
+    </w:p>
+    <w:p>
+      <w:pPr>
+        <w:spacing w:before="100" w:beforeAutospacing="1" w:after="100" w:afterAutospacing="1" w:line="240" w:lineRule="auto"/>
+        <w:ind w:left="720"/>
+        <w:jc w:val="center"/>
+        <w:rPr>
+          <w:rFonts w:ascii="Arial" w:eastAsia="Times New Roman" w:hAnsi="Arial" w:cs="Arial"/>
+          <w:sz w:val="24"/>
+          <w:szCs w:val="24"/>
+          <w:lang w:val="es-ES"/>
+        </w:rPr>
+      </w:pPr>
+      <w:r>
+        <w:rPr>
+          <w:rFonts w:ascii="Arial" w:eastAsia="Times New Roman" w:hAnsi="Arial" w:cs="Arial"/>
+          <w:noProof/>
+          <w:sz w:val="24"/>
+          <w:szCs w:val="24"/>
+          <w:lang w:val="es-ES"/>
+        </w:rPr>
+        <w:drawing>
+          <wp:inline distT="0" distB="0" distL="0" distR="0">
+            <wp:extent cx="3191069" cy="1798468"/>
+            <wp:effectExtent l="0" t="0" r="0" b="0"/>
+            <wp:docPr id="19" name="Imagen 19"/>
+            <wp:cNvGraphicFramePr>
+              <a:graphicFrameLocks xmlns:a="http://schemas.openxmlformats.org/drawingml/2006/main" noChangeAspect="1"/>
+            </wp:cNvGraphicFramePr>
+            <a:graphic xmlns:a="http://schemas.openxmlformats.org/drawingml/2006/main">
+              <a:graphicData uri="http://schemas.openxmlformats.org/drawingml/2006/picture">
+                <pic:pic xmlns:pic="http://schemas.openxmlformats.org/drawingml/2006/picture">
+                  <pic:nvPicPr>
+                    <pic:cNvPr id="19" name="Regla dmz en pfsense.JPG"/>
+                    <pic:cNvPicPr/>
+                  </pic:nvPicPr>
+                  <pic:blipFill>
+                    <a:blip r:embed="rId24" cstate="print">
+                      <a:extLst>
+                        <a:ext uri="{28A0092B-C50C-407E-A947-70E740481C1C}">
+                          <a14:useLocalDpi xmlns:a14="http://schemas.microsoft.com/office/drawing/2010/main" val="0"/>
+                        </a:ext>
+                      </a:extLst>
+                    </a:blip>
+                    <a:stretch>
+                      <a:fillRect/>
+                    </a:stretch>
+                  </pic:blipFill>
+                  <pic:spPr>
+                    <a:xfrm>
+                      <a:off x="0" y="0"/>
+                      <a:ext cx="3199388" cy="1803156"/>
+                    </a:xfrm>
+                    <a:prstGeom prst="rect">
+                      <a:avLst/>
+                    </a:prstGeom>
+                  </pic:spPr>
+                </pic:pic>
+              </a:graphicData>
+            </a:graphic>
+          </wp:inline>
+        </w:drawing>
+      </w:r>
+    </w:p>
+    <w:p>
+      <w:pPr>
+        <w:spacing w:line="360" w:lineRule="auto"/>
+        <w:jc w:val="center"/>
+        <w:rPr>
+          <w:rFonts w:ascii="Arial" w:hAnsi="Arial" w:cs="Arial"/>
+          <w:color w:val="000000"/>
+          <w:sz w:val="24"/>
+          <w:szCs w:val="24"/>
+        </w:rPr>
+      </w:pPr>
+      <w:r>
+        <w:rPr>
+          <w:rFonts w:ascii="Arial" w:hAnsi="Arial" w:cs="Arial"/>
+          <w:color w:val="000000"/>
+          <w:sz w:val="24"/>
+          <w:szCs w:val="24"/>
+        </w:rPr>
+        <w:t>Ilustración 1</w:t>
+      </w:r>
+      <w:r>
+        <w:rPr>
+          <w:rFonts w:ascii="Arial" w:hAnsi="Arial" w:cs="Arial"/>
+          <w:color w:val="000000"/>
+          <w:sz w:val="24"/>
+          <w:szCs w:val="24"/>
+        </w:rPr>
+        <w:t>6</w:t>
+      </w:r>
+      <w:r>
+        <w:rPr>
+          <w:rFonts w:ascii="Arial" w:hAnsi="Arial" w:cs="Arial"/>
+          <w:color w:val="000000"/>
+          <w:sz w:val="24"/>
+          <w:szCs w:val="24"/>
+        </w:rPr>
+        <w:t xml:space="preserve">: </w:t>
+      </w:r>
+      <w:r>
+        <w:rPr>
+          <w:rFonts w:ascii="Arial" w:hAnsi="Arial" w:cs="Arial"/>
+          <w:color w:val="000000"/>
+          <w:sz w:val="24"/>
+          <w:szCs w:val="24"/>
+        </w:rPr>
+        <w:t>Regla DMZ</w:t>
+      </w:r>
+    </w:p>
+    <w:p>
+      <w:pPr>
+        <w:numPr>
+          <w:ilvl w:val="1"/>
+          <w:numId w:val="5"/>
+        </w:numPr>
+        <w:spacing w:before="100" w:beforeAutospacing="1" w:after="100" w:afterAutospacing="1" w:line="240" w:lineRule="auto"/>
+        <w:rPr>
+          <w:rFonts w:ascii="Arial" w:eastAsia="Times New Roman" w:hAnsi="Arial" w:cs="Arial"/>
+          <w:sz w:val="24"/>
+          <w:szCs w:val="24"/>
+          <w:lang w:val="es-ES"/>
+        </w:rPr>
+      </w:pPr>
+      <w:r>
+        <w:rPr>
+          <w:rFonts w:ascii="Arial" w:eastAsia="Times New Roman" w:hAnsi="Arial" w:cs="Arial"/>
+          <w:i/>
+          <w:iCs/>
+          <w:sz w:val="24"/>
+          <w:szCs w:val="24"/>
+          <w:lang w:val="es-ES"/>
+        </w:rPr>
+        <w:t xml:space="preserve">Gestión → cualquier destino (protocolo </w:t>
+      </w:r>
+      <w:proofErr w:type="spellStart"/>
+      <w:r>
+        <w:rPr>
+          <w:rFonts w:ascii="Arial" w:eastAsia="Times New Roman" w:hAnsi="Arial" w:cs="Arial"/>
+          <w:i/>
+          <w:iCs/>
+          <w:sz w:val="24"/>
+          <w:szCs w:val="24"/>
+          <w:lang w:val="es-ES"/>
+        </w:rPr>
+        <w:t>Any</w:t>
+      </w:r>
+      <w:proofErr w:type="spellEnd"/>
+      <w:r>
+        <w:rPr>
+          <w:rFonts w:ascii="Arial" w:eastAsia="Times New Roman" w:hAnsi="Arial" w:cs="Arial"/>
+          <w:i/>
+          <w:iCs/>
+          <w:sz w:val="24"/>
+          <w:szCs w:val="24"/>
+          <w:lang w:val="es-ES"/>
+        </w:rPr>
+        <w:t>)</w:t>
+      </w:r>
+      <w:r>
+        <w:rPr>
+          <w:rFonts w:ascii="Arial" w:eastAsia="Times New Roman" w:hAnsi="Arial" w:cs="Arial"/>
+          <w:sz w:val="24"/>
+          <w:szCs w:val="24"/>
+          <w:lang w:val="es-ES"/>
+        </w:rPr>
+        <w:t>: zona de administración, con acceso a todas las zonas y al cortafuegos.</w:t>
+      </w:r>
+    </w:p>
+    <w:p>
+      <w:pPr>
+        <w:spacing w:before="100" w:beforeAutospacing="1" w:after="100" w:afterAutospacing="1" w:line="240" w:lineRule="auto"/>
+        <w:jc w:val="center"/>
+        <w:rPr>
+          <w:rFonts w:ascii="Arial" w:eastAsia="Times New Roman" w:hAnsi="Arial" w:cs="Arial"/>
+          <w:sz w:val="24"/>
+          <w:szCs w:val="24"/>
+          <w:lang w:val="es-ES"/>
+        </w:rPr>
+      </w:pPr>
+      <w:r>
+        <w:rPr>
+          <w:rFonts w:ascii="Arial" w:eastAsia="Times New Roman" w:hAnsi="Arial" w:cs="Arial"/>
+          <w:noProof/>
+          <w:sz w:val="24"/>
+          <w:szCs w:val="24"/>
+          <w:lang w:val="es-ES"/>
+        </w:rPr>
+        <w:drawing>
+          <wp:inline distT="0" distB="0" distL="0" distR="0">
+            <wp:extent cx="2743200" cy="2095238"/>
+            <wp:effectExtent l="0" t="0" r="0" b="635"/>
+            <wp:docPr id="20" name="Imagen 20"/>
+            <wp:cNvGraphicFramePr>
+              <a:graphicFrameLocks xmlns:a="http://schemas.openxmlformats.org/drawingml/2006/main" noChangeAspect="1"/>
+            </wp:cNvGraphicFramePr>
+            <a:graphic xmlns:a="http://schemas.openxmlformats.org/drawingml/2006/main">
+              <a:graphicData uri="http://schemas.openxmlformats.org/drawingml/2006/picture">
+                <pic:pic xmlns:pic="http://schemas.openxmlformats.org/drawingml/2006/picture">
+                  <pic:nvPicPr>
+                    <pic:cNvPr id="20" name="Regla gestion en pfsense.JPG"/>
+                    <pic:cNvPicPr/>
+                  </pic:nvPicPr>
+                  <pic:blipFill>
+                    <a:blip r:embed="rId25" cstate="print">
+                      <a:extLst>
+                        <a:ext uri="{28A0092B-C50C-407E-A947-70E740481C1C}">
+                          <a14:useLocalDpi xmlns:a14="http://schemas.microsoft.com/office/drawing/2010/main" val="0"/>
+                        </a:ext>
+                      </a:extLst>
+                    </a:blip>
+                    <a:stretch>
+                      <a:fillRect/>
+                    </a:stretch>
+                  </pic:blipFill>
+                  <pic:spPr>
+                    <a:xfrm>
+                      <a:off x="0" y="0"/>
+                      <a:ext cx="2751816" cy="2101819"/>
+                    </a:xfrm>
+                    <a:prstGeom prst="rect">
+                      <a:avLst/>
+                    </a:prstGeom>
+                  </pic:spPr>
+                </pic:pic>
+              </a:graphicData>
+            </a:graphic>
+          </wp:inline>
+        </w:drawing>
+      </w:r>
+    </w:p>
+    <w:p>
+      <w:pPr>
+        <w:spacing w:line="360" w:lineRule="auto"/>
+        <w:jc w:val="center"/>
+        <w:rPr>
+          <w:rFonts w:ascii="Arial" w:hAnsi="Arial" w:cs="Arial"/>
+          <w:color w:val="000000"/>
+          <w:sz w:val="24"/>
+          <w:szCs w:val="24"/>
+        </w:rPr>
+      </w:pPr>
+      <w:r>
+        <w:rPr>
+          <w:rFonts w:ascii="Arial" w:hAnsi="Arial" w:cs="Arial"/>
+          <w:color w:val="000000"/>
+          <w:sz w:val="24"/>
+          <w:szCs w:val="24"/>
+        </w:rPr>
+        <w:t>Ilustración 1</w:t>
+      </w:r>
+      <w:r>
+        <w:rPr>
+          <w:rFonts w:ascii="Arial" w:hAnsi="Arial" w:cs="Arial"/>
+          <w:color w:val="000000"/>
+          <w:sz w:val="24"/>
+          <w:szCs w:val="24"/>
+        </w:rPr>
+        <w:t>7</w:t>
+      </w:r>
+      <w:r>
+        <w:rPr>
+          <w:rFonts w:ascii="Arial" w:hAnsi="Arial" w:cs="Arial"/>
+          <w:color w:val="000000"/>
+          <w:sz w:val="24"/>
+          <w:szCs w:val="24"/>
+        </w:rPr>
+        <w:t xml:space="preserve">: </w:t>
+      </w:r>
+      <w:r>
+        <w:rPr>
+          <w:rFonts w:ascii="Arial" w:hAnsi="Arial" w:cs="Arial"/>
+          <w:color w:val="000000"/>
+          <w:sz w:val="24"/>
+          <w:szCs w:val="24"/>
+        </w:rPr>
+        <w:t>Regla</w:t>
+      </w:r>
+      <w:r>
+        <w:rPr>
+          <w:rFonts w:ascii="Arial" w:hAnsi="Arial" w:cs="Arial"/>
+          <w:color w:val="000000"/>
+          <w:sz w:val="24"/>
+          <w:szCs w:val="24"/>
+        </w:rPr>
+        <w:t xml:space="preserve"> Gestión</w:t>
+      </w:r>
+    </w:p>
+    <w:p>
+      <w:pPr>
+        <w:spacing w:before="100" w:beforeAutospacing="1" w:after="100" w:afterAutospacing="1" w:line="240" w:lineRule="auto"/>
+        <w:jc w:val="center"/>
+        <w:rPr>
+          <w:rFonts w:ascii="Arial" w:eastAsia="Times New Roman" w:hAnsi="Arial" w:cs="Arial"/>
+          <w:sz w:val="24"/>
+          <w:szCs w:val="24"/>
+          <w:lang w:val="es-ES"/>
+        </w:rPr>
+      </w:pPr>
+    </w:p>
+    <w:p>
+      <w:pPr>
+        <w:numPr>
+          <w:ilvl w:val="1"/>
+          <w:numId w:val="5"/>
+        </w:numPr>
+        <w:spacing w:before="100" w:beforeAutospacing="1" w:after="100" w:afterAutospacing="1" w:line="240" w:lineRule="auto"/>
+        <w:rPr>
+          <w:rFonts w:ascii="Arial" w:eastAsia="Times New Roman" w:hAnsi="Arial" w:cs="Arial"/>
+          <w:sz w:val="24"/>
+          <w:szCs w:val="24"/>
+          <w:lang w:val="es-ES"/>
+        </w:rPr>
+      </w:pPr>
+      <w:r>
+        <w:rPr>
+          <w:rFonts w:ascii="Arial" w:eastAsia="Times New Roman" w:hAnsi="Arial" w:cs="Arial"/>
+          <w:i/>
+          <w:iCs/>
+          <w:sz w:val="24"/>
+          <w:szCs w:val="24"/>
+          <w:lang w:val="es-ES"/>
+        </w:rPr>
+        <w:lastRenderedPageBreak/>
+        <w:t>Usuarios</w:t>
+      </w:r>
+      <w:r>
+        <w:rPr>
+          <w:rFonts w:ascii="Arial" w:eastAsia="Times New Roman" w:hAnsi="Arial" w:cs="Arial"/>
+          <w:i/>
+          <w:iCs/>
+          <w:sz w:val="18"/>
+          <w:szCs w:val="24"/>
+          <w:lang w:val="es-ES"/>
+        </w:rPr>
+        <w:t xml:space="preserve"> </w:t>
+      </w:r>
+      <w:r>
+        <w:rPr>
+          <w:rFonts w:ascii="Arial" w:eastAsia="Times New Roman" w:hAnsi="Arial" w:cs="Arial"/>
+          <w:i/>
+          <w:iCs/>
+          <w:sz w:val="16"/>
+          <w:szCs w:val="24"/>
+          <w:lang w:val="es-ES"/>
+        </w:rPr>
+        <w:t xml:space="preserve">&gt; </w:t>
+      </w:r>
+      <w:r>
+        <w:rPr>
+          <w:rFonts w:ascii="Arial" w:eastAsia="Times New Roman" w:hAnsi="Arial" w:cs="Arial"/>
+          <w:i/>
+          <w:iCs/>
+          <w:sz w:val="24"/>
+          <w:szCs w:val="24"/>
+          <w:lang w:val="es-ES"/>
+        </w:rPr>
+        <w:t>DMZ (TCP 443)</w:t>
+      </w:r>
+      <w:r>
+        <w:rPr>
+          <w:rFonts w:ascii="Arial" w:eastAsia="Times New Roman" w:hAnsi="Arial" w:cs="Arial"/>
+          <w:sz w:val="24"/>
+          <w:szCs w:val="24"/>
+          <w:lang w:val="es-ES"/>
+        </w:rPr>
+        <w:t>: los usuarios solo alcanzan el servicio web publicado.</w:t>
+      </w:r>
+    </w:p>
+    <w:p>
+      <w:pPr>
+        <w:spacing w:before="100" w:beforeAutospacing="1" w:after="100" w:afterAutospacing="1" w:line="240" w:lineRule="auto"/>
+        <w:jc w:val="center"/>
+        <w:rPr>
+          <w:rFonts w:ascii="Arial" w:eastAsia="Times New Roman" w:hAnsi="Arial" w:cs="Arial"/>
+          <w:sz w:val="24"/>
+          <w:szCs w:val="24"/>
+          <w:lang w:val="es-ES"/>
+        </w:rPr>
+      </w:pPr>
+      <w:r>
+        <w:rPr>
+          <w:rFonts w:ascii="Arial" w:eastAsia="Times New Roman" w:hAnsi="Arial" w:cs="Arial"/>
+          <w:noProof/>
+          <w:sz w:val="24"/>
+          <w:szCs w:val="24"/>
+          <w:lang w:val="es-ES"/>
+        </w:rPr>
+        <w:drawing>
+          <wp:inline distT="0" distB="0" distL="0" distR="0">
+            <wp:extent cx="4171016" cy="2780523"/>
+            <wp:effectExtent l="0" t="0" r="1270" b="1270"/>
+            <wp:docPr id="21" name="Imagen 21"/>
+            <wp:cNvGraphicFramePr>
+              <a:graphicFrameLocks xmlns:a="http://schemas.openxmlformats.org/drawingml/2006/main" noChangeAspect="1"/>
+            </wp:cNvGraphicFramePr>
+            <a:graphic xmlns:a="http://schemas.openxmlformats.org/drawingml/2006/main">
+              <a:graphicData uri="http://schemas.openxmlformats.org/drawingml/2006/picture">
+                <pic:pic xmlns:pic="http://schemas.openxmlformats.org/drawingml/2006/picture">
+                  <pic:nvPicPr>
+                    <pic:cNvPr id="21" name="nueva regla dmz en 40.1.JPG"/>
+                    <pic:cNvPicPr/>
+                  </pic:nvPicPr>
+                  <pic:blipFill>
+                    <a:blip r:embed="rId26" cstate="print">
+                      <a:extLst>
+                        <a:ext uri="{28A0092B-C50C-407E-A947-70E740481C1C}">
+                          <a14:useLocalDpi xmlns:a14="http://schemas.microsoft.com/office/drawing/2010/main" val="0"/>
+                        </a:ext>
+                      </a:extLst>
+                    </a:blip>
+                    <a:stretch>
+                      <a:fillRect/>
+                    </a:stretch>
+                  </pic:blipFill>
+                  <pic:spPr>
+                    <a:xfrm>
+                      <a:off x="0" y="0"/>
+                      <a:ext cx="4178264" cy="2785355"/>
+                    </a:xfrm>
+                    <a:prstGeom prst="rect">
+                      <a:avLst/>
+                    </a:prstGeom>
+                  </pic:spPr>
+                </pic:pic>
+              </a:graphicData>
+            </a:graphic>
+          </wp:inline>
+        </w:drawing>
+      </w:r>
+    </w:p>
+    <w:p>
+      <w:pPr>
+        <w:spacing w:line="360" w:lineRule="auto"/>
+        <w:jc w:val="center"/>
+        <w:rPr>
+          <w:rFonts w:ascii="Arial" w:hAnsi="Arial" w:cs="Arial"/>
+          <w:color w:val="000000"/>
+          <w:sz w:val="24"/>
+          <w:szCs w:val="24"/>
+        </w:rPr>
+      </w:pPr>
+      <w:r>
+        <w:rPr>
+          <w:rFonts w:ascii="Arial" w:hAnsi="Arial" w:cs="Arial"/>
+          <w:color w:val="000000"/>
+          <w:sz w:val="24"/>
+          <w:szCs w:val="24"/>
+        </w:rPr>
+        <w:t>Ilustración 1</w:t>
+      </w:r>
+      <w:r>
+        <w:rPr>
+          <w:rFonts w:ascii="Arial" w:hAnsi="Arial" w:cs="Arial"/>
+          <w:color w:val="000000"/>
+          <w:sz w:val="24"/>
+          <w:szCs w:val="24"/>
+        </w:rPr>
+        <w:t>8</w:t>
+      </w:r>
+      <w:r>
+        <w:rPr>
+          <w:rFonts w:ascii="Arial" w:hAnsi="Arial" w:cs="Arial"/>
+          <w:color w:val="000000"/>
+          <w:sz w:val="24"/>
+          <w:szCs w:val="24"/>
+        </w:rPr>
+        <w:t xml:space="preserve">: </w:t>
+      </w:r>
+      <w:r>
+        <w:rPr>
+          <w:rFonts w:ascii="Arial" w:hAnsi="Arial" w:cs="Arial"/>
+          <w:color w:val="000000"/>
+          <w:sz w:val="24"/>
+          <w:szCs w:val="24"/>
+        </w:rPr>
+        <w:t xml:space="preserve">Regla </w:t>
+      </w:r>
+      <w:r>
+        <w:rPr>
+          <w:rFonts w:ascii="Arial" w:hAnsi="Arial" w:cs="Arial"/>
+          <w:color w:val="000000"/>
+          <w:sz w:val="24"/>
+          <w:szCs w:val="24"/>
+        </w:rPr>
+        <w:t>nueva DMZ</w:t>
+      </w:r>
+    </w:p>
+    <w:p>
+      <w:pPr>
+        <w:numPr>
+          <w:ilvl w:val="1"/>
+          <w:numId w:val="5"/>
+        </w:numPr>
+        <w:spacing w:before="100" w:beforeAutospacing="1" w:after="100" w:afterAutospacing="1" w:line="240" w:lineRule="auto"/>
+        <w:rPr>
+          <w:rFonts w:ascii="Arial" w:eastAsia="Times New Roman" w:hAnsi="Arial" w:cs="Arial"/>
+          <w:sz w:val="24"/>
+          <w:szCs w:val="24"/>
+          <w:lang w:val="es-ES"/>
+        </w:rPr>
+      </w:pPr>
+      <w:r>
+        <w:rPr>
+          <w:rFonts w:ascii="Arial" w:eastAsia="Times New Roman" w:hAnsi="Arial" w:cs="Arial"/>
+          <w:sz w:val="24"/>
+          <w:szCs w:val="24"/>
+          <w:lang w:val="es-ES"/>
+        </w:rPr>
+        <w:t>Se eliminaron las reglas por defecto "</w:t>
+      </w:r>
+      <w:proofErr w:type="spellStart"/>
+      <w:r>
+        <w:rPr>
+          <w:rFonts w:ascii="Arial" w:eastAsia="Times New Roman" w:hAnsi="Arial" w:cs="Arial"/>
+          <w:i/>
+          <w:iCs/>
+          <w:sz w:val="24"/>
+          <w:szCs w:val="24"/>
+          <w:lang w:val="es-ES"/>
+        </w:rPr>
+        <w:t>allow</w:t>
+      </w:r>
+      <w:proofErr w:type="spellEnd"/>
+      <w:r>
+        <w:rPr>
+          <w:rFonts w:ascii="Arial" w:eastAsia="Times New Roman" w:hAnsi="Arial" w:cs="Arial"/>
+          <w:i/>
+          <w:iCs/>
+          <w:sz w:val="24"/>
+          <w:szCs w:val="24"/>
+          <w:lang w:val="es-ES"/>
+        </w:rPr>
+        <w:t xml:space="preserve"> LAN </w:t>
+      </w:r>
+      <w:proofErr w:type="spellStart"/>
+      <w:r>
+        <w:rPr>
+          <w:rFonts w:ascii="Arial" w:eastAsia="Times New Roman" w:hAnsi="Arial" w:cs="Arial"/>
+          <w:i/>
+          <w:iCs/>
+          <w:sz w:val="24"/>
+          <w:szCs w:val="24"/>
+          <w:lang w:val="es-ES"/>
+        </w:rPr>
+        <w:t>to</w:t>
+      </w:r>
+      <w:proofErr w:type="spellEnd"/>
+      <w:r>
+        <w:rPr>
+          <w:rFonts w:ascii="Arial" w:eastAsia="Times New Roman" w:hAnsi="Arial" w:cs="Arial"/>
+          <w:i/>
+          <w:iCs/>
+          <w:sz w:val="24"/>
+          <w:szCs w:val="24"/>
+          <w:lang w:val="es-ES"/>
+        </w:rPr>
+        <w:t xml:space="preserve"> </w:t>
+      </w:r>
+      <w:proofErr w:type="spellStart"/>
+      <w:r>
+        <w:rPr>
+          <w:rFonts w:ascii="Arial" w:eastAsia="Times New Roman" w:hAnsi="Arial" w:cs="Arial"/>
+          <w:i/>
+          <w:iCs/>
+          <w:sz w:val="24"/>
+          <w:szCs w:val="24"/>
+          <w:lang w:val="es-ES"/>
+        </w:rPr>
+        <w:t>any</w:t>
+      </w:r>
+      <w:proofErr w:type="spellEnd"/>
+      <w:r>
+        <w:rPr>
+          <w:rFonts w:ascii="Arial" w:eastAsia="Times New Roman" w:hAnsi="Arial" w:cs="Arial"/>
+          <w:sz w:val="24"/>
+          <w:szCs w:val="24"/>
+          <w:lang w:val="es-ES"/>
+        </w:rPr>
+        <w:t xml:space="preserve">" y se desactivó el </w:t>
+      </w:r>
+      <w:proofErr w:type="spellStart"/>
+      <w:r>
+        <w:rPr>
+          <w:rFonts w:ascii="Arial" w:eastAsia="Times New Roman" w:hAnsi="Arial" w:cs="Arial"/>
+          <w:i/>
+          <w:iCs/>
+          <w:sz w:val="24"/>
+          <w:szCs w:val="24"/>
+          <w:lang w:val="es-ES"/>
+        </w:rPr>
+        <w:t>anti-lockout</w:t>
+      </w:r>
+      <w:proofErr w:type="spellEnd"/>
+      <w:r>
+        <w:rPr>
+          <w:rFonts w:ascii="Arial" w:eastAsia="Times New Roman" w:hAnsi="Arial" w:cs="Arial"/>
+          <w:sz w:val="24"/>
+          <w:szCs w:val="24"/>
+          <w:lang w:val="es-ES"/>
+        </w:rPr>
+        <w:t xml:space="preserve"> de la LAN, de modo que rige la denegación por defecto.</w:t>
+      </w:r>
+    </w:p>
+    <w:p>
+      <w:pPr>
+        <w:spacing w:before="100" w:beforeAutospacing="1" w:after="100" w:afterAutospacing="1" w:line="240" w:lineRule="auto"/>
+        <w:rPr>
+          <w:rFonts w:ascii="Arial" w:eastAsia="Times New Roman" w:hAnsi="Arial" w:cs="Arial"/>
+          <w:sz w:val="24"/>
+          <w:szCs w:val="24"/>
+          <w:lang w:val="es-ES"/>
+        </w:rPr>
+      </w:pPr>
+    </w:p>
+    <w:p>
+      <w:pPr>
+        <w:numPr>
+          <w:ilvl w:val="0"/>
+          <w:numId w:val="5"/>
+        </w:numPr>
+        <w:spacing w:before="100" w:beforeAutospacing="1" w:after="100" w:afterAutospacing="1" w:line="240" w:lineRule="auto"/>
+        <w:rPr>
+          <w:rFonts w:ascii="Arial" w:eastAsia="Times New Roman" w:hAnsi="Arial" w:cs="Arial"/>
+          <w:sz w:val="24"/>
+          <w:szCs w:val="24"/>
+          <w:lang w:val="es-ES"/>
+        </w:rPr>
+      </w:pPr>
+      <w:r>
+        <w:rPr>
+          <w:rFonts w:ascii="Arial" w:eastAsia="Times New Roman" w:hAnsi="Arial" w:cs="Arial"/>
+          <w:b/>
+          <w:bCs/>
+          <w:sz w:val="24"/>
+          <w:szCs w:val="24"/>
+          <w:lang w:val="es-ES"/>
+        </w:rPr>
+        <w:t>Segregación de la gestión:</w:t>
+      </w:r>
+      <w:r>
+        <w:rPr>
+          <w:rFonts w:ascii="Arial" w:eastAsia="Times New Roman" w:hAnsi="Arial" w:cs="Arial"/>
+          <w:sz w:val="24"/>
+          <w:szCs w:val="24"/>
+          <w:lang w:val="es-ES"/>
+        </w:rPr>
+        <w:t xml:space="preserve"> la estación de administración se trasladó de la </w:t>
+      </w:r>
+    </w:p>
+    <w:p>
+      <w:pPr>
+        <w:numPr>
+          <w:ilvl w:val="0"/>
+          <w:numId w:val="5"/>
+        </w:numPr>
+        <w:spacing w:before="100" w:beforeAutospacing="1" w:after="100" w:afterAutospacing="1" w:line="240" w:lineRule="auto"/>
+        <w:rPr>
+          <w:rFonts w:ascii="Arial" w:eastAsia="Times New Roman" w:hAnsi="Arial" w:cs="Arial"/>
+          <w:sz w:val="24"/>
+          <w:szCs w:val="24"/>
+          <w:lang w:val="es-ES"/>
+        </w:rPr>
+      </w:pPr>
+      <w:r>
+        <w:rPr>
+          <w:rFonts w:ascii="Arial" w:eastAsia="Times New Roman" w:hAnsi="Arial" w:cs="Arial"/>
+          <w:sz w:val="24"/>
+          <w:szCs w:val="24"/>
+          <w:lang w:val="es-ES"/>
+        </w:rPr>
+        <w:t>VLAN 10 a la VLAN 40 (Gestión): se cambió el puerto del conmutador a la VLAN 40, se asignó al equipo la IP 10.10.40.2 y se añadió una ruta estática (10.10.0.0/16 vía 10.10.40.1). La administración pasa a https://10.10.40.1.</w:t>
+      </w:r>
+    </w:p>
+    <w:p>
+      <w:pPr>
+        <w:numPr>
+          <w:ilvl w:val="0"/>
+          <w:numId w:val="5"/>
+        </w:numPr>
+        <w:spacing w:before="100" w:beforeAutospacing="1" w:after="100" w:afterAutospacing="1" w:line="240" w:lineRule="auto"/>
+        <w:rPr>
+          <w:rFonts w:ascii="Arial" w:eastAsia="Times New Roman" w:hAnsi="Arial" w:cs="Arial"/>
+          <w:sz w:val="24"/>
+          <w:szCs w:val="24"/>
+          <w:lang w:val="es-ES"/>
+        </w:rPr>
+      </w:pPr>
+      <w:r>
+        <w:rPr>
+          <w:rFonts w:ascii="Arial" w:eastAsia="Times New Roman" w:hAnsi="Arial" w:cs="Arial"/>
+          <w:b/>
+          <w:bCs/>
+          <w:sz w:val="24"/>
+          <w:szCs w:val="24"/>
+          <w:lang w:val="es-ES"/>
+        </w:rPr>
+        <w:t>Incidencias (controladas):</w:t>
+      </w:r>
+      <w:r>
+        <w:rPr>
+          <w:rFonts w:ascii="Arial" w:eastAsia="Times New Roman" w:hAnsi="Arial" w:cs="Arial"/>
+          <w:sz w:val="24"/>
+          <w:szCs w:val="24"/>
+          <w:lang w:val="es-ES"/>
+        </w:rPr>
+        <w:t xml:space="preserve"> (1) una regla se creó por error en la interfaz WAN y con el puerto 433, corregida a LAN y 443; (2) la regla de usuarios quedaba por debajo de la regla "</w:t>
+      </w:r>
+      <w:proofErr w:type="spellStart"/>
+      <w:r>
+        <w:rPr>
+          <w:rFonts w:ascii="Arial" w:eastAsia="Times New Roman" w:hAnsi="Arial" w:cs="Arial"/>
+          <w:i/>
+          <w:iCs/>
+          <w:sz w:val="24"/>
+          <w:szCs w:val="24"/>
+          <w:lang w:val="es-ES"/>
+        </w:rPr>
+        <w:t>allow</w:t>
+      </w:r>
+      <w:proofErr w:type="spellEnd"/>
+      <w:r>
+        <w:rPr>
+          <w:rFonts w:ascii="Arial" w:eastAsia="Times New Roman" w:hAnsi="Arial" w:cs="Arial"/>
+          <w:i/>
+          <w:iCs/>
+          <w:sz w:val="24"/>
+          <w:szCs w:val="24"/>
+          <w:lang w:val="es-ES"/>
+        </w:rPr>
+        <w:t xml:space="preserve"> </w:t>
+      </w:r>
+      <w:proofErr w:type="spellStart"/>
+      <w:r>
+        <w:rPr>
+          <w:rFonts w:ascii="Arial" w:eastAsia="Times New Roman" w:hAnsi="Arial" w:cs="Arial"/>
+          <w:i/>
+          <w:iCs/>
+          <w:sz w:val="24"/>
+          <w:szCs w:val="24"/>
+          <w:lang w:val="es-ES"/>
+        </w:rPr>
+        <w:t>all</w:t>
+      </w:r>
+      <w:proofErr w:type="spellEnd"/>
+      <w:r>
+        <w:rPr>
+          <w:rFonts w:ascii="Arial" w:eastAsia="Times New Roman" w:hAnsi="Arial" w:cs="Arial"/>
+          <w:sz w:val="24"/>
+          <w:szCs w:val="24"/>
+          <w:lang w:val="es-ES"/>
+        </w:rPr>
+        <w:t xml:space="preserve">", que se eliminó para respetar el orden de evaluación; (3) el acceso de gestión exigía que la regla estuviera en protocolo </w:t>
+      </w:r>
+      <w:proofErr w:type="spellStart"/>
+      <w:r>
+        <w:rPr>
+          <w:rFonts w:ascii="Arial" w:eastAsia="Times New Roman" w:hAnsi="Arial" w:cs="Arial"/>
+          <w:b/>
+          <w:bCs/>
+          <w:sz w:val="24"/>
+          <w:szCs w:val="24"/>
+          <w:lang w:val="es-ES"/>
+        </w:rPr>
+        <w:t>Any</w:t>
+      </w:r>
+      <w:proofErr w:type="spellEnd"/>
+      <w:r>
+        <w:rPr>
+          <w:rFonts w:ascii="Arial" w:eastAsia="Times New Roman" w:hAnsi="Arial" w:cs="Arial"/>
+          <w:sz w:val="24"/>
+          <w:szCs w:val="24"/>
+          <w:lang w:val="es-ES"/>
+        </w:rPr>
+        <w:t xml:space="preserve"> (no solo TCP) y que el equipo de gestión tuviera </w:t>
+      </w:r>
+      <w:r>
+        <w:rPr>
+          <w:rFonts w:ascii="Arial" w:eastAsia="Times New Roman" w:hAnsi="Arial" w:cs="Arial"/>
+          <w:b/>
+          <w:bCs/>
+          <w:sz w:val="24"/>
+          <w:szCs w:val="24"/>
+          <w:lang w:val="es-ES"/>
+        </w:rPr>
+        <w:t>ruta</w:t>
+      </w:r>
+      <w:r>
+        <w:rPr>
+          <w:rFonts w:ascii="Arial" w:eastAsia="Times New Roman" w:hAnsi="Arial" w:cs="Arial"/>
+          <w:sz w:val="24"/>
+          <w:szCs w:val="24"/>
+          <w:lang w:val="es-ES"/>
+        </w:rPr>
+        <w:t xml:space="preserve"> hacia las demás subredes.</w:t>
+      </w:r>
+    </w:p>
+    <w:p>
+      <w:pPr>
+        <w:spacing w:before="100" w:beforeAutospacing="1" w:after="100" w:afterAutospacing="1" w:line="360" w:lineRule="auto"/>
+        <w:rPr>
+          <w:rFonts w:ascii="Arial" w:eastAsia="Times New Roman" w:hAnsi="Arial" w:cs="Arial"/>
+          <w:sz w:val="24"/>
+          <w:szCs w:val="24"/>
+          <w:lang w:val="es-ES"/>
+        </w:rPr>
+      </w:pPr>
+    </w:p>
+    <w:p>
+      <w:pPr>
+        <w:spacing w:before="100" w:beforeAutospacing="1" w:after="100" w:afterAutospacing="1" w:line="240" w:lineRule="auto"/>
+        <w:rPr>
+          <w:rFonts w:ascii="Arial" w:eastAsia="Times New Roman" w:hAnsi="Arial" w:cs="Arial"/>
+          <w:sz w:val="24"/>
+          <w:szCs w:val="24"/>
+          <w:lang w:val="es-ES"/>
+        </w:rPr>
+      </w:pPr>
+      <w:r>
+        <w:rPr>
+          <w:rFonts w:ascii="Arial" w:eastAsia="Times New Roman" w:hAnsi="Arial" w:cs="Arial"/>
+          <w:b/>
+          <w:bCs/>
+          <w:sz w:val="24"/>
+          <w:szCs w:val="24"/>
+          <w:lang w:val="es-ES"/>
+        </w:rPr>
+        <w:t>R05 — Contención de la zona crítica (prueba de aislamiento)</w:t>
+      </w:r>
+    </w:p>
+    <w:p>
+      <w:pPr>
+        <w:numPr>
+          <w:ilvl w:val="0"/>
+          <w:numId w:val="6"/>
+        </w:numPr>
+        <w:spacing w:before="100" w:beforeAutospacing="1" w:after="100" w:afterAutospacing="1" w:line="240" w:lineRule="auto"/>
+        <w:rPr>
+          <w:rFonts w:ascii="Arial" w:eastAsia="Times New Roman" w:hAnsi="Arial" w:cs="Arial"/>
+          <w:sz w:val="24"/>
+          <w:szCs w:val="24"/>
+          <w:lang w:val="es-ES"/>
+        </w:rPr>
+      </w:pPr>
+      <w:r>
+        <w:rPr>
+          <w:rFonts w:ascii="Arial" w:eastAsia="Times New Roman" w:hAnsi="Arial" w:cs="Arial"/>
+          <w:b/>
+          <w:bCs/>
+          <w:sz w:val="24"/>
+          <w:szCs w:val="24"/>
+          <w:lang w:val="es-ES"/>
+        </w:rPr>
+        <w:t>Objetivo:</w:t>
+      </w:r>
+      <w:r>
+        <w:rPr>
+          <w:rFonts w:ascii="Arial" w:eastAsia="Times New Roman" w:hAnsi="Arial" w:cs="Arial"/>
+          <w:sz w:val="24"/>
+          <w:szCs w:val="24"/>
+          <w:lang w:val="es-ES"/>
+        </w:rPr>
+        <w:t xml:space="preserve"> comprobar que un host de otra zona no puede alcanzar la zona crítica y que solo la zona de Gestión puede hacerlo.</w:t>
+      </w:r>
+    </w:p>
+    <w:p>
+      <w:pPr>
+        <w:numPr>
+          <w:ilvl w:val="0"/>
+          <w:numId w:val="6"/>
+        </w:numPr>
+        <w:spacing w:before="100" w:beforeAutospacing="1" w:after="100" w:afterAutospacing="1" w:line="240" w:lineRule="auto"/>
+        <w:rPr>
+          <w:rFonts w:ascii="Arial" w:eastAsia="Times New Roman" w:hAnsi="Arial" w:cs="Arial"/>
+          <w:sz w:val="24"/>
+          <w:szCs w:val="24"/>
+          <w:lang w:val="es-ES"/>
+        </w:rPr>
+      </w:pPr>
+      <w:r>
+        <w:rPr>
+          <w:rFonts w:ascii="Arial" w:eastAsia="Times New Roman" w:hAnsi="Arial" w:cs="Arial"/>
+          <w:b/>
+          <w:bCs/>
+          <w:sz w:val="24"/>
+          <w:szCs w:val="24"/>
+          <w:lang w:val="es-ES"/>
+        </w:rPr>
+        <w:t>Prueba realizada:</w:t>
+      </w:r>
+    </w:p>
+    <w:p>
+      <w:pPr>
+        <w:numPr>
+          <w:ilvl w:val="1"/>
+          <w:numId w:val="6"/>
+        </w:numPr>
+        <w:spacing w:before="100" w:beforeAutospacing="1" w:after="100" w:afterAutospacing="1" w:line="240" w:lineRule="auto"/>
+        <w:rPr>
+          <w:rFonts w:ascii="Arial" w:eastAsia="Times New Roman" w:hAnsi="Arial" w:cs="Arial"/>
+          <w:sz w:val="24"/>
+          <w:szCs w:val="24"/>
+          <w:lang w:val="es-ES"/>
+        </w:rPr>
+      </w:pPr>
+      <w:r>
+        <w:rPr>
+          <w:rFonts w:ascii="Arial" w:eastAsia="Times New Roman" w:hAnsi="Arial" w:cs="Arial"/>
+          <w:sz w:val="24"/>
+          <w:szCs w:val="24"/>
+          <w:lang w:val="es-ES"/>
+        </w:rPr>
+        <w:lastRenderedPageBreak/>
+        <w:t xml:space="preserve">Desde un equipo de </w:t>
+      </w:r>
+      <w:r>
+        <w:rPr>
+          <w:rFonts w:ascii="Arial" w:eastAsia="Times New Roman" w:hAnsi="Arial" w:cs="Arial"/>
+          <w:b/>
+          <w:bCs/>
+          <w:sz w:val="24"/>
+          <w:szCs w:val="24"/>
+          <w:lang w:val="es-ES"/>
+        </w:rPr>
+        <w:t>Usuarios</w:t>
+      </w:r>
+      <w:r>
+        <w:rPr>
+          <w:rFonts w:ascii="Arial" w:eastAsia="Times New Roman" w:hAnsi="Arial" w:cs="Arial"/>
+          <w:sz w:val="24"/>
+          <w:szCs w:val="24"/>
+          <w:lang w:val="es-ES"/>
+        </w:rPr>
+        <w:t xml:space="preserve"> (10.10.10.100): ping a </w:t>
+      </w:r>
+      <w:r>
+        <w:rPr>
+          <w:rFonts w:ascii="Arial" w:eastAsia="Times New Roman" w:hAnsi="Arial" w:cs="Arial"/>
+          <w:b/>
+          <w:bCs/>
+          <w:sz w:val="24"/>
+          <w:szCs w:val="24"/>
+          <w:lang w:val="es-ES"/>
+        </w:rPr>
+        <w:t>Crítica</w:t>
+      </w:r>
+      <w:r>
+        <w:rPr>
+          <w:rFonts w:ascii="Arial" w:eastAsia="Times New Roman" w:hAnsi="Arial" w:cs="Arial"/>
+          <w:sz w:val="24"/>
+          <w:szCs w:val="24"/>
+          <w:lang w:val="es-ES"/>
+        </w:rPr>
+        <w:t xml:space="preserve"> (10.10.50.1) y a </w:t>
+      </w:r>
+      <w:r>
+        <w:rPr>
+          <w:rFonts w:ascii="Arial" w:eastAsia="Times New Roman" w:hAnsi="Arial" w:cs="Arial"/>
+          <w:b/>
+          <w:bCs/>
+          <w:sz w:val="24"/>
+          <w:szCs w:val="24"/>
+          <w:lang w:val="es-ES"/>
+        </w:rPr>
+        <w:t>Servidores</w:t>
+      </w:r>
+      <w:r>
+        <w:rPr>
+          <w:rFonts w:ascii="Arial" w:eastAsia="Times New Roman" w:hAnsi="Arial" w:cs="Arial"/>
+          <w:sz w:val="24"/>
+          <w:szCs w:val="24"/>
+          <w:lang w:val="es-ES"/>
+        </w:rPr>
+        <w:t xml:space="preserve"> (10.10.20.1) → </w:t>
+      </w:r>
+      <w:r>
+        <w:rPr>
+          <w:rFonts w:ascii="Arial" w:eastAsia="Times New Roman" w:hAnsi="Arial" w:cs="Arial"/>
+          <w:i/>
+          <w:iCs/>
+          <w:sz w:val="24"/>
+          <w:szCs w:val="24"/>
+          <w:lang w:val="es-ES"/>
+        </w:rPr>
+        <w:t>tiempo de espera agotado</w:t>
+      </w:r>
+      <w:r>
+        <w:rPr>
+          <w:rFonts w:ascii="Arial" w:eastAsia="Times New Roman" w:hAnsi="Arial" w:cs="Arial"/>
+          <w:sz w:val="24"/>
+          <w:szCs w:val="24"/>
+          <w:lang w:val="es-ES"/>
+        </w:rPr>
+        <w:t xml:space="preserve"> (bloqueado).</w:t>
+      </w:r>
+    </w:p>
+    <w:p>
+      <w:pPr>
+        <w:numPr>
+          <w:ilvl w:val="1"/>
+          <w:numId w:val="6"/>
+        </w:numPr>
+        <w:spacing w:before="100" w:beforeAutospacing="1" w:after="100" w:afterAutospacing="1" w:line="240" w:lineRule="auto"/>
+        <w:rPr>
+          <w:rFonts w:ascii="Arial" w:eastAsia="Times New Roman" w:hAnsi="Arial" w:cs="Arial"/>
+          <w:sz w:val="24"/>
+          <w:szCs w:val="24"/>
+          <w:lang w:val="es-ES"/>
+        </w:rPr>
+      </w:pPr>
+      <w:r>
+        <w:rPr>
+          <w:rFonts w:ascii="Arial" w:eastAsia="Times New Roman" w:hAnsi="Arial" w:cs="Arial"/>
+          <w:sz w:val="24"/>
+          <w:szCs w:val="24"/>
+          <w:lang w:val="es-ES"/>
+        </w:rPr>
+        <w:t xml:space="preserve">Desde el equipo de </w:t>
+      </w:r>
+      <w:r>
+        <w:rPr>
+          <w:rFonts w:ascii="Arial" w:eastAsia="Times New Roman" w:hAnsi="Arial" w:cs="Arial"/>
+          <w:b/>
+          <w:bCs/>
+          <w:sz w:val="24"/>
+          <w:szCs w:val="24"/>
+          <w:lang w:val="es-ES"/>
+        </w:rPr>
+        <w:t>Gestión</w:t>
+      </w:r>
+      <w:r>
+        <w:rPr>
+          <w:rFonts w:ascii="Arial" w:eastAsia="Times New Roman" w:hAnsi="Arial" w:cs="Arial"/>
+          <w:sz w:val="24"/>
+          <w:szCs w:val="24"/>
+          <w:lang w:val="es-ES"/>
+        </w:rPr>
+        <w:t xml:space="preserve"> (10.10.40.2): ping a </w:t>
+      </w:r>
+      <w:r>
+        <w:rPr>
+          <w:rFonts w:ascii="Arial" w:eastAsia="Times New Roman" w:hAnsi="Arial" w:cs="Arial"/>
+          <w:b/>
+          <w:bCs/>
+          <w:sz w:val="24"/>
+          <w:szCs w:val="24"/>
+          <w:lang w:val="es-ES"/>
+        </w:rPr>
+        <w:t>Crítica</w:t>
+      </w:r>
+      <w:r>
+        <w:rPr>
+          <w:rFonts w:ascii="Arial" w:eastAsia="Times New Roman" w:hAnsi="Arial" w:cs="Arial"/>
+          <w:sz w:val="24"/>
+          <w:szCs w:val="24"/>
+          <w:lang w:val="es-ES"/>
+        </w:rPr>
+        <w:t xml:space="preserve"> (10.10.50.1) → </w:t>
+      </w:r>
+      <w:r>
+        <w:rPr>
+          <w:rFonts w:ascii="Arial" w:eastAsia="Times New Roman" w:hAnsi="Arial" w:cs="Arial"/>
+          <w:i/>
+          <w:iCs/>
+          <w:sz w:val="24"/>
+          <w:szCs w:val="24"/>
+          <w:lang w:val="es-ES"/>
+        </w:rPr>
+        <w:t>respuesta correcta</w:t>
+      </w:r>
+      <w:r>
+        <w:rPr>
+          <w:rFonts w:ascii="Arial" w:eastAsia="Times New Roman" w:hAnsi="Arial" w:cs="Arial"/>
+          <w:sz w:val="24"/>
+          <w:szCs w:val="24"/>
+          <w:lang w:val="es-ES"/>
+        </w:rPr>
+        <w:t xml:space="preserve"> (permitido).</w:t>
+      </w:r>
+    </w:p>
+    <w:p>
+      <w:pPr>
+        <w:numPr>
+          <w:ilvl w:val="0"/>
+          <w:numId w:val="6"/>
+        </w:numPr>
+        <w:spacing w:before="100" w:beforeAutospacing="1" w:after="100" w:afterAutospacing="1" w:line="240" w:lineRule="auto"/>
+        <w:rPr>
+          <w:rFonts w:ascii="Arial" w:eastAsia="Times New Roman" w:hAnsi="Arial" w:cs="Arial"/>
+          <w:sz w:val="24"/>
+          <w:szCs w:val="24"/>
+          <w:lang w:val="es-ES"/>
+        </w:rPr>
+      </w:pPr>
+      <w:r>
+        <w:rPr>
+          <w:rFonts w:ascii="Arial" w:eastAsia="Times New Roman" w:hAnsi="Arial" w:cs="Arial"/>
+          <w:b/>
+          <w:bCs/>
+          <w:sz w:val="24"/>
+          <w:szCs w:val="24"/>
+          <w:lang w:val="es-ES"/>
+        </w:rPr>
+        <w:t>Resultado:</w:t>
+      </w:r>
+      <w:r>
+        <w:rPr>
+          <w:rFonts w:ascii="Arial" w:eastAsia="Times New Roman" w:hAnsi="Arial" w:cs="Arial"/>
+          <w:sz w:val="24"/>
+          <w:szCs w:val="24"/>
+          <w:lang w:val="es-ES"/>
+        </w:rPr>
+        <w:t xml:space="preserve"> el mismo destino (10.10.50.1) es </w:t>
+      </w:r>
+      <w:r>
+        <w:rPr>
+          <w:rFonts w:ascii="Arial" w:eastAsia="Times New Roman" w:hAnsi="Arial" w:cs="Arial"/>
+          <w:b/>
+          <w:bCs/>
+          <w:sz w:val="24"/>
+          <w:szCs w:val="24"/>
+          <w:lang w:val="es-ES"/>
+        </w:rPr>
+        <w:t>inaccesible desde Usuarios</w:t>
+      </w:r>
+      <w:r>
+        <w:rPr>
+          <w:rFonts w:ascii="Arial" w:eastAsia="Times New Roman" w:hAnsi="Arial" w:cs="Arial"/>
+          <w:sz w:val="24"/>
+          <w:szCs w:val="24"/>
+          <w:lang w:val="es-ES"/>
+        </w:rPr>
+        <w:t xml:space="preserve"> y </w:t>
+      </w:r>
+      <w:r>
+        <w:rPr>
+          <w:rFonts w:ascii="Arial" w:eastAsia="Times New Roman" w:hAnsi="Arial" w:cs="Arial"/>
+          <w:b/>
+          <w:bCs/>
+          <w:sz w:val="24"/>
+          <w:szCs w:val="24"/>
+          <w:lang w:val="es-ES"/>
+        </w:rPr>
+        <w:t>accesible desde Gestión</w:t>
+      </w:r>
+      <w:r>
+        <w:rPr>
+          <w:rFonts w:ascii="Arial" w:eastAsia="Times New Roman" w:hAnsi="Arial" w:cs="Arial"/>
+          <w:sz w:val="24"/>
+          <w:szCs w:val="24"/>
+          <w:lang w:val="es-ES"/>
+        </w:rPr>
+        <w:t xml:space="preserve">, lo que demuestra la </w:t>
+      </w:r>
+      <w:r>
+        <w:rPr>
+          <w:rFonts w:ascii="Arial" w:eastAsia="Times New Roman" w:hAnsi="Arial" w:cs="Arial"/>
+          <w:b/>
+          <w:bCs/>
+          <w:sz w:val="24"/>
+          <w:szCs w:val="24"/>
+          <w:lang w:val="es-ES"/>
+        </w:rPr>
+        <w:t>contención del movimiento lateral</w:t>
+      </w:r>
+      <w:r>
+        <w:rPr>
+          <w:rFonts w:ascii="Arial" w:eastAsia="Times New Roman" w:hAnsi="Arial" w:cs="Arial"/>
+          <w:sz w:val="24"/>
+          <w:szCs w:val="24"/>
+          <w:lang w:val="es-ES"/>
+        </w:rPr>
+        <w:t xml:space="preserve"> hacia la zona crítica y la </w:t>
+      </w:r>
+      <w:r>
+        <w:rPr>
+          <w:rFonts w:ascii="Arial" w:eastAsia="Times New Roman" w:hAnsi="Arial" w:cs="Arial"/>
+          <w:b/>
+          <w:bCs/>
+          <w:sz w:val="24"/>
+          <w:szCs w:val="24"/>
+          <w:lang w:val="es-ES"/>
+        </w:rPr>
+        <w:t>segregación del acceso de administración</w:t>
+      </w:r>
+      <w:r>
+        <w:rPr>
+          <w:rFonts w:ascii="Arial" w:eastAsia="Times New Roman" w:hAnsi="Arial" w:cs="Arial"/>
+          <w:sz w:val="24"/>
+          <w:szCs w:val="24"/>
+          <w:lang w:val="es-ES"/>
+        </w:rPr>
+        <w:t>, principios centrales del modelo Zero Trust.</w:t>
+      </w:r>
+    </w:p>
+    <w:p>
+      <w:pPr>
+        <w:spacing w:before="100" w:beforeAutospacing="1" w:after="100" w:afterAutospacing="1" w:line="240" w:lineRule="auto"/>
+        <w:jc w:val="center"/>
+        <w:rPr>
+          <w:rFonts w:ascii="Arial" w:eastAsia="Times New Roman" w:hAnsi="Arial" w:cs="Arial"/>
+          <w:sz w:val="24"/>
+          <w:szCs w:val="24"/>
+          <w:lang w:val="es-ES"/>
+        </w:rPr>
+      </w:pPr>
+      <w:r>
+        <w:rPr>
+          <w:rFonts w:ascii="Arial" w:eastAsia="Times New Roman" w:hAnsi="Arial" w:cs="Arial"/>
+          <w:noProof/>
+          <w:sz w:val="24"/>
+          <w:szCs w:val="24"/>
+          <w:lang w:val="es-ES"/>
+        </w:rPr>
+        <w:drawing>
+          <wp:inline distT="0" distB="0" distL="0" distR="0">
+            <wp:extent cx="2780523" cy="2872986"/>
+            <wp:effectExtent l="0" t="0" r="1270" b="3810"/>
+            <wp:docPr id="22" name="Imagen 22"/>
+            <wp:cNvGraphicFramePr>
+              <a:graphicFrameLocks xmlns:a="http://schemas.openxmlformats.org/drawingml/2006/main" noChangeAspect="1"/>
+            </wp:cNvGraphicFramePr>
+            <a:graphic xmlns:a="http://schemas.openxmlformats.org/drawingml/2006/main">
+              <a:graphicData uri="http://schemas.openxmlformats.org/drawingml/2006/picture">
+                <pic:pic xmlns:pic="http://schemas.openxmlformats.org/drawingml/2006/picture">
+                  <pic:nvPicPr>
+                    <pic:cNvPr id="22" name="Comprobaciones regla dmz en pc1.JPG"/>
+                    <pic:cNvPicPr/>
+                  </pic:nvPicPr>
+                  <pic:blipFill>
+                    <a:blip r:embed="rId27">
+                      <a:extLst>
+                        <a:ext uri="{28A0092B-C50C-407E-A947-70E740481C1C}">
+                          <a14:useLocalDpi xmlns:a14="http://schemas.microsoft.com/office/drawing/2010/main" val="0"/>
+                        </a:ext>
+                      </a:extLst>
+                    </a:blip>
+                    <a:stretch>
+                      <a:fillRect/>
+                    </a:stretch>
+                  </pic:blipFill>
+                  <pic:spPr>
+                    <a:xfrm>
+                      <a:off x="0" y="0"/>
+                      <a:ext cx="2792764" cy="2885634"/>
+                    </a:xfrm>
+                    <a:prstGeom prst="rect">
+                      <a:avLst/>
+                    </a:prstGeom>
+                  </pic:spPr>
+                </pic:pic>
+              </a:graphicData>
+            </a:graphic>
+          </wp:inline>
+        </w:drawing>
+      </w:r>
+    </w:p>
+    <w:p>
+      <w:pPr>
+        <w:spacing w:line="360" w:lineRule="auto"/>
+        <w:jc w:val="center"/>
+        <w:rPr>
+          <w:rFonts w:ascii="Arial" w:hAnsi="Arial" w:cs="Arial"/>
+          <w:color w:val="000000"/>
+          <w:sz w:val="24"/>
+          <w:szCs w:val="24"/>
+        </w:rPr>
+      </w:pPr>
+      <w:r>
+        <w:rPr>
+          <w:rFonts w:ascii="Arial" w:hAnsi="Arial" w:cs="Arial"/>
+          <w:color w:val="000000"/>
+          <w:sz w:val="24"/>
+          <w:szCs w:val="24"/>
+        </w:rPr>
+        <w:t>Ilustración 1</w:t>
+      </w:r>
+      <w:r>
+        <w:rPr>
+          <w:rFonts w:ascii="Arial" w:hAnsi="Arial" w:cs="Arial"/>
+          <w:color w:val="000000"/>
+          <w:sz w:val="24"/>
+          <w:szCs w:val="24"/>
+        </w:rPr>
+        <w:t>9</w:t>
+      </w:r>
+      <w:r>
+        <w:rPr>
+          <w:rFonts w:ascii="Arial" w:hAnsi="Arial" w:cs="Arial"/>
+          <w:color w:val="000000"/>
+          <w:sz w:val="24"/>
+          <w:szCs w:val="24"/>
+        </w:rPr>
+        <w:t xml:space="preserve">: </w:t>
+      </w:r>
+      <w:r>
+        <w:rPr>
+          <w:rFonts w:ascii="Arial" w:hAnsi="Arial" w:cs="Arial"/>
+          <w:color w:val="000000"/>
+          <w:sz w:val="24"/>
+          <w:szCs w:val="24"/>
+        </w:rPr>
+        <w:t>Comprobaciones pc1</w:t>
+      </w:r>
+    </w:p>
+    <w:p>
+      <w:pPr>
+        <w:spacing w:line="360" w:lineRule="auto"/>
+        <w:jc w:val="center"/>
+        <w:rPr>
+          <w:rFonts w:ascii="Arial" w:hAnsi="Arial" w:cs="Arial"/>
+          <w:color w:val="000000"/>
+          <w:sz w:val="24"/>
+          <w:szCs w:val="24"/>
+        </w:rPr>
+      </w:pPr>
+      <w:r>
+        <w:rPr>
+          <w:rFonts w:ascii="Arial" w:hAnsi="Arial" w:cs="Arial"/>
+          <w:noProof/>
+          <w:color w:val="000000"/>
+          <w:sz w:val="24"/>
+          <w:szCs w:val="24"/>
+        </w:rPr>
+        <w:drawing>
+          <wp:inline distT="0" distB="0" distL="0" distR="0">
+            <wp:extent cx="3722914" cy="2860449"/>
+            <wp:effectExtent l="0" t="0" r="0" b="0"/>
+            <wp:docPr id="23" name="Imagen 23"/>
+            <wp:cNvGraphicFramePr>
+              <a:graphicFrameLocks xmlns:a="http://schemas.openxmlformats.org/drawingml/2006/main" noChangeAspect="1"/>
+            </wp:cNvGraphicFramePr>
+            <a:graphic xmlns:a="http://schemas.openxmlformats.org/drawingml/2006/main">
+              <a:graphicData uri="http://schemas.openxmlformats.org/drawingml/2006/picture">
+                <pic:pic xmlns:pic="http://schemas.openxmlformats.org/drawingml/2006/picture">
+                  <pic:nvPicPr>
+                    <pic:cNvPr id="23" name="ping 2.JPG"/>
+                    <pic:cNvPicPr/>
+                  </pic:nvPicPr>
+                  <pic:blipFill>
+                    <a:blip r:embed="rId28">
+                      <a:extLst>
+                        <a:ext uri="{28A0092B-C50C-407E-A947-70E740481C1C}">
+                          <a14:useLocalDpi xmlns:a14="http://schemas.microsoft.com/office/drawing/2010/main" val="0"/>
+                        </a:ext>
+                      </a:extLst>
+                    </a:blip>
+                    <a:stretch>
+                      <a:fillRect/>
+                    </a:stretch>
+                  </pic:blipFill>
+                  <pic:spPr>
+                    <a:xfrm>
+                      <a:off x="0" y="0"/>
+                      <a:ext cx="3737073" cy="2871328"/>
+                    </a:xfrm>
+                    <a:prstGeom prst="rect">
+                      <a:avLst/>
+                    </a:prstGeom>
+                  </pic:spPr>
+                </pic:pic>
+              </a:graphicData>
+            </a:graphic>
+          </wp:inline>
+        </w:drawing>
+      </w:r>
+    </w:p>
+    <w:p>
+      <w:pPr>
+        <w:spacing w:line="360" w:lineRule="auto"/>
+        <w:jc w:val="center"/>
+        <w:rPr>
+          <w:rFonts w:ascii="Arial" w:hAnsi="Arial" w:cs="Arial"/>
+          <w:color w:val="000000"/>
+          <w:sz w:val="24"/>
+          <w:szCs w:val="24"/>
+        </w:rPr>
+      </w:pPr>
+      <w:r>
+        <w:rPr>
+          <w:rFonts w:ascii="Arial" w:hAnsi="Arial" w:cs="Arial"/>
+          <w:color w:val="000000"/>
+          <w:sz w:val="24"/>
+          <w:szCs w:val="24"/>
+        </w:rPr>
+        <w:t xml:space="preserve">Ilustración </w:t>
+      </w:r>
+      <w:r>
+        <w:rPr>
+          <w:rFonts w:ascii="Arial" w:hAnsi="Arial" w:cs="Arial"/>
+          <w:color w:val="000000"/>
+          <w:sz w:val="24"/>
+          <w:szCs w:val="24"/>
+        </w:rPr>
+        <w:t>20</w:t>
+      </w:r>
+      <w:r>
+        <w:rPr>
+          <w:rFonts w:ascii="Arial" w:hAnsi="Arial" w:cs="Arial"/>
+          <w:color w:val="000000"/>
+          <w:sz w:val="24"/>
+          <w:szCs w:val="24"/>
+        </w:rPr>
+        <w:t xml:space="preserve">: </w:t>
+      </w:r>
+      <w:r>
+        <w:rPr>
+          <w:rFonts w:ascii="Arial" w:hAnsi="Arial" w:cs="Arial"/>
+          <w:color w:val="000000"/>
+          <w:sz w:val="24"/>
+          <w:szCs w:val="24"/>
+        </w:rPr>
+        <w:t>Comprobaciones</w:t>
+      </w:r>
+      <w:r>
+        <w:rPr>
+          <w:rFonts w:ascii="Arial" w:hAnsi="Arial" w:cs="Arial"/>
+          <w:color w:val="000000"/>
+          <w:sz w:val="24"/>
+          <w:szCs w:val="24"/>
+        </w:rPr>
+        <w:t xml:space="preserve"> 2</w:t>
+      </w:r>
+    </w:p>
+    <w:p>
+      <w:pPr>
+        <w:spacing w:line="360" w:lineRule="auto"/>
+        <w:jc w:val="center"/>
+        <w:rPr>
+          <w:rFonts w:ascii="Arial" w:hAnsi="Arial" w:cs="Arial"/>
           <w:color w:val="000000"/>
           <w:sz w:val="24"/>
           <w:szCs w:val="24"/>
@@ -24503,6 +26070,263 @@
           <w:szCs w:val="24"/>
         </w:rPr>
       </w:pPr>
+    </w:p>
+    <w:p>
+      <w:pPr>
+        <w:spacing w:line="360" w:lineRule="auto"/>
+        <w:jc w:val="both"/>
+        <w:rPr>
+          <w:rFonts w:ascii="Arial" w:eastAsia="Arial" w:hAnsi="Arial" w:cs="Arial"/>
+          <w:color w:val="000000"/>
+          <w:sz w:val="24"/>
+          <w:szCs w:val="24"/>
+        </w:rPr>
+      </w:pPr>
+      <w:r>
+        <w:rPr>
+          <w:rFonts w:ascii="Arial" w:eastAsia="Arial" w:hAnsi="Arial" w:cs="Arial"/>
+          <w:color w:val="000000"/>
+          <w:sz w:val="24"/>
+          <w:szCs w:val="24"/>
+        </w:rPr>
+        <w:t>DESPLIEGUE E INSTALACIÓN</w:t>
+      </w:r>
+    </w:p>
+    <w:p>
+      <w:pPr>
+        <w:spacing w:line="360" w:lineRule="auto"/>
+        <w:jc w:val="both"/>
+        <w:rPr>
+          <w:rFonts w:ascii="Arial" w:eastAsia="Arial" w:hAnsi="Arial" w:cs="Arial"/>
+          <w:color w:val="000000"/>
+          <w:sz w:val="24"/>
+          <w:szCs w:val="24"/>
+        </w:rPr>
+      </w:pPr>
+      <w:r>
+        <w:rPr>
+          <w:rFonts w:ascii="Arial" w:eastAsia="Arial" w:hAnsi="Arial" w:cs="Arial"/>
+          <w:b/>
+          <w:bCs/>
+          <w:color w:val="000000"/>
+          <w:sz w:val="24"/>
+          <w:szCs w:val="24"/>
+        </w:rPr>
+        <w:t>Metodología usada</w:t>
+      </w:r>
+    </w:p>
+    <w:p>
+      <w:pPr>
+        <w:spacing w:line="360" w:lineRule="auto"/>
+        <w:jc w:val="both"/>
+        <w:rPr>
+          <w:rFonts w:ascii="Arial" w:eastAsia="Arial" w:hAnsi="Arial" w:cs="Arial"/>
+          <w:color w:val="000000"/>
+          <w:sz w:val="24"/>
+          <w:szCs w:val="24"/>
+        </w:rPr>
+      </w:pPr>
+      <w:r>
+        <w:rPr>
+          <w:rFonts w:ascii="Arial" w:eastAsia="Arial" w:hAnsi="Arial" w:cs="Arial"/>
+          <w:color w:val="000000"/>
+          <w:sz w:val="24"/>
+          <w:szCs w:val="24"/>
+        </w:rPr>
+        <w:t>La metodología seguida es iterativa</w:t>
+      </w:r>
+    </w:p>
+    <w:p>
+      <w:pPr>
+        <w:spacing w:line="360" w:lineRule="auto"/>
+        <w:jc w:val="both"/>
+        <w:rPr>
+          <w:rFonts w:ascii="Arial" w:eastAsia="Arial" w:hAnsi="Arial" w:cs="Arial"/>
+          <w:color w:val="000000"/>
+          <w:sz w:val="24"/>
+          <w:szCs w:val="24"/>
+        </w:rPr>
+      </w:pPr>
+    </w:p>
+    <w:p>
+      <w:pPr>
+        <w:spacing w:line="360" w:lineRule="auto"/>
+        <w:jc w:val="both"/>
+        <w:rPr>
+          <w:rFonts w:ascii="Arial" w:eastAsia="Arial" w:hAnsi="Arial" w:cs="Arial"/>
+          <w:color w:val="000000"/>
+          <w:sz w:val="24"/>
+          <w:szCs w:val="24"/>
+        </w:rPr>
+      </w:pPr>
+    </w:p>
+    <w:p>
+      <w:pPr>
+        <w:spacing w:line="360" w:lineRule="auto"/>
+        <w:jc w:val="both"/>
+        <w:rPr>
+          <w:rFonts w:ascii="Arial" w:eastAsia="Arial" w:hAnsi="Arial" w:cs="Arial"/>
+          <w:color w:val="000000"/>
+          <w:sz w:val="24"/>
+          <w:szCs w:val="24"/>
+        </w:rPr>
+      </w:pPr>
+    </w:p>
+    <w:p>
+      <w:pPr>
+        <w:spacing w:line="360" w:lineRule="auto"/>
+        <w:jc w:val="both"/>
+        <w:rPr>
+          <w:rFonts w:ascii="Arial" w:eastAsia="Arial" w:hAnsi="Arial" w:cs="Arial"/>
+          <w:color w:val="000000"/>
+          <w:sz w:val="24"/>
+          <w:szCs w:val="24"/>
+        </w:rPr>
+      </w:pPr>
+    </w:p>
+    <w:p>
+      <w:pPr>
+        <w:spacing w:line="360" w:lineRule="auto"/>
+        <w:jc w:val="both"/>
+        <w:rPr>
+          <w:rFonts w:ascii="Arial" w:eastAsia="Arial" w:hAnsi="Arial" w:cs="Arial"/>
+          <w:color w:val="000000"/>
+          <w:sz w:val="24"/>
+          <w:szCs w:val="24"/>
+        </w:rPr>
+      </w:pPr>
+    </w:p>
+    <w:p>
+      <w:pPr>
+        <w:spacing w:line="360" w:lineRule="auto"/>
+        <w:jc w:val="both"/>
+        <w:rPr>
+          <w:rFonts w:ascii="Arial" w:eastAsia="Arial" w:hAnsi="Arial" w:cs="Arial"/>
+          <w:color w:val="000000"/>
+          <w:sz w:val="24"/>
+          <w:szCs w:val="24"/>
+        </w:rPr>
+      </w:pPr>
+    </w:p>
+    <w:p>
+      <w:pPr>
+        <w:spacing w:line="360" w:lineRule="auto"/>
+        <w:jc w:val="both"/>
+        <w:rPr>
+          <w:rFonts w:ascii="Arial" w:eastAsia="Arial" w:hAnsi="Arial" w:cs="Arial"/>
+          <w:color w:val="000000"/>
+          <w:sz w:val="24"/>
+          <w:szCs w:val="24"/>
+        </w:rPr>
+      </w:pPr>
+    </w:p>
+    <w:p>
+      <w:pPr>
+        <w:spacing w:line="360" w:lineRule="auto"/>
+        <w:jc w:val="both"/>
+        <w:rPr>
+          <w:rFonts w:ascii="Arial" w:eastAsia="Arial" w:hAnsi="Arial" w:cs="Arial"/>
+          <w:color w:val="000000"/>
+          <w:sz w:val="24"/>
+          <w:szCs w:val="24"/>
+        </w:rPr>
+      </w:pPr>
+    </w:p>
+    <w:p>
+      <w:pPr>
+        <w:spacing w:line="360" w:lineRule="auto"/>
+        <w:jc w:val="both"/>
+        <w:rPr>
+          <w:rFonts w:ascii="Arial" w:eastAsia="Arial" w:hAnsi="Arial" w:cs="Arial"/>
+          <w:color w:val="000000"/>
+          <w:sz w:val="24"/>
+          <w:szCs w:val="24"/>
+        </w:rPr>
+      </w:pPr>
+    </w:p>
+    <w:p>
+      <w:pPr>
+        <w:spacing w:line="360" w:lineRule="auto"/>
+        <w:jc w:val="both"/>
+        <w:rPr>
+          <w:rFonts w:ascii="Arial" w:eastAsia="Arial" w:hAnsi="Arial" w:cs="Arial"/>
+          <w:color w:val="000000"/>
+          <w:sz w:val="24"/>
+          <w:szCs w:val="24"/>
+        </w:rPr>
+      </w:pPr>
+    </w:p>
+    <w:p>
+      <w:pPr>
+        <w:spacing w:line="360" w:lineRule="auto"/>
+        <w:jc w:val="both"/>
+        <w:rPr>
+          <w:rFonts w:ascii="Arial" w:eastAsia="Arial" w:hAnsi="Arial" w:cs="Arial"/>
+          <w:color w:val="000000"/>
+          <w:sz w:val="24"/>
+          <w:szCs w:val="24"/>
+        </w:rPr>
+      </w:pPr>
+    </w:p>
+    <w:p>
+      <w:pPr>
+        <w:spacing w:line="360" w:lineRule="auto"/>
+        <w:jc w:val="both"/>
+        <w:rPr>
+          <w:rFonts w:ascii="Arial" w:eastAsia="Arial" w:hAnsi="Arial" w:cs="Arial"/>
+          <w:color w:val="000000"/>
+          <w:sz w:val="24"/>
+          <w:szCs w:val="24"/>
+        </w:rPr>
+      </w:pPr>
+    </w:p>
+    <w:p>
+      <w:pPr>
+        <w:spacing w:line="360" w:lineRule="auto"/>
+        <w:jc w:val="both"/>
+        <w:rPr>
+          <w:rFonts w:ascii="Arial" w:eastAsia="Arial" w:hAnsi="Arial" w:cs="Arial"/>
+          <w:color w:val="000000"/>
+          <w:sz w:val="24"/>
+          <w:szCs w:val="24"/>
+        </w:rPr>
+      </w:pPr>
+    </w:p>
+    <w:p>
+      <w:pPr>
+        <w:spacing w:line="360" w:lineRule="auto"/>
+        <w:jc w:val="both"/>
+        <w:rPr>
+          <w:rFonts w:ascii="Arial" w:eastAsia="Arial" w:hAnsi="Arial" w:cs="Arial"/>
+          <w:color w:val="000000"/>
+          <w:sz w:val="24"/>
+          <w:szCs w:val="24"/>
+        </w:rPr>
+      </w:pPr>
+    </w:p>
+    <w:p>
+      <w:pPr>
+        <w:spacing w:line="360" w:lineRule="auto"/>
+        <w:jc w:val="both"/>
+        <w:rPr>
+          <w:rFonts w:ascii="Arial" w:eastAsia="Arial" w:hAnsi="Arial" w:cs="Arial"/>
+          <w:color w:val="000000"/>
+          <w:sz w:val="24"/>
+          <w:szCs w:val="24"/>
+        </w:rPr>
+      </w:pPr>
+    </w:p>
+    <w:p>
+      <w:pPr>
+        <w:spacing w:line="360" w:lineRule="auto"/>
+        <w:jc w:val="both"/>
+        <w:rPr>
+          <w:rFonts w:ascii="Arial" w:eastAsia="Arial" w:hAnsi="Arial" w:cs="Arial"/>
+          <w:color w:val="000000"/>
+          <w:sz w:val="24"/>
+          <w:szCs w:val="24"/>
+        </w:rPr>
+      </w:pPr>
       <w:r>
         <w:rPr>
           <w:rFonts w:ascii="Arial" w:eastAsia="Arial" w:hAnsi="Arial" w:cs="Arial"/>
@@ -25584,8 +27408,8 @@
       </w:r>
     </w:p>
     <w:sectPr>
-      <w:headerReference w:type="default" r:id="rId21"/>
-      <w:footerReference w:type="default" r:id="rId22"/>
+      <w:headerReference w:type="default" r:id="rId29"/>
+      <w:footerReference w:type="default" r:id="rId30"/>
       <w:pgSz w:w="11906" w:h="16838"/>
       <w:pgMar w:top="1440" w:right="1440" w:bottom="1440" w:left="1440" w:header="426" w:footer="720" w:gutter="0"/>
       <w:pgNumType w:start="1"/>
@@ -26197,9 +28021,9 @@
     </w:lvl>
   </w:abstractNum>
   <w:abstractNum w:abstractNumId="2" w15:restartNumberingAfterBreak="0">
-    <w:nsid w:val="48FA72A2"/>
+    <w:nsid w:val="46671B06"/>
     <w:multiLevelType w:val="multilevel"/>
-    <w:tmpl w:val="E2EABFDE"/>
+    <w:tmpl w:val="F30CB10E"/>
     <w:lvl w:ilvl="0">
       <w:start w:val="1"/>
       <w:numFmt w:val="bullet"/>
@@ -26346,6 +28170,304 @@
     </w:lvl>
   </w:abstractNum>
   <w:abstractNum w:abstractNumId="3" w15:restartNumberingAfterBreak="0">
+    <w:nsid w:val="48FA72A2"/>
+    <w:multiLevelType w:val="multilevel"/>
+    <w:tmpl w:val="E2EABFDE"/>
+    <w:lvl w:ilvl="0">
+      <w:start w:val="1"/>
+      <w:numFmt w:val="bullet"/>
+      <w:lvlText w:val=""/>
+      <w:lvlJc w:val="left"/>
+      <w:pPr>
+        <w:tabs>
+          <w:tab w:val="num" w:pos="720"/>
+        </w:tabs>
+        <w:ind w:left="720" w:hanging="360"/>
+      </w:pPr>
+      <w:rPr>
+        <w:rFonts w:ascii="Symbol" w:hAnsi="Symbol" w:hint="default"/>
+        <w:sz w:val="20"/>
+      </w:rPr>
+    </w:lvl>
+    <w:lvl w:ilvl="1">
+      <w:start w:val="1"/>
+      <w:numFmt w:val="bullet"/>
+      <w:lvlText w:val="o"/>
+      <w:lvlJc w:val="left"/>
+      <w:pPr>
+        <w:tabs>
+          <w:tab w:val="num" w:pos="1440"/>
+        </w:tabs>
+        <w:ind w:left="1440" w:hanging="360"/>
+      </w:pPr>
+      <w:rPr>
+        <w:rFonts w:ascii="Courier New" w:hAnsi="Courier New" w:hint="default"/>
+        <w:sz w:val="20"/>
+      </w:rPr>
+    </w:lvl>
+    <w:lvl w:ilvl="2" w:tentative="1">
+      <w:start w:val="1"/>
+      <w:numFmt w:val="bullet"/>
+      <w:lvlText w:val=""/>
+      <w:lvlJc w:val="left"/>
+      <w:pPr>
+        <w:tabs>
+          <w:tab w:val="num" w:pos="2160"/>
+        </w:tabs>
+        <w:ind w:left="2160" w:hanging="360"/>
+      </w:pPr>
+      <w:rPr>
+        <w:rFonts w:ascii="Wingdings" w:hAnsi="Wingdings" w:hint="default"/>
+        <w:sz w:val="20"/>
+      </w:rPr>
+    </w:lvl>
+    <w:lvl w:ilvl="3" w:tentative="1">
+      <w:start w:val="1"/>
+      <w:numFmt w:val="bullet"/>
+      <w:lvlText w:val=""/>
+      <w:lvlJc w:val="left"/>
+      <w:pPr>
+        <w:tabs>
+          <w:tab w:val="num" w:pos="2880"/>
+        </w:tabs>
+        <w:ind w:left="2880" w:hanging="360"/>
+      </w:pPr>
+      <w:rPr>
+        <w:rFonts w:ascii="Wingdings" w:hAnsi="Wingdings" w:hint="default"/>
+        <w:sz w:val="20"/>
+      </w:rPr>
+    </w:lvl>
+    <w:lvl w:ilvl="4" w:tentative="1">
+      <w:start w:val="1"/>
+      <w:numFmt w:val="bullet"/>
+      <w:lvlText w:val=""/>
+      <w:lvlJc w:val="left"/>
+      <w:pPr>
+        <w:tabs>
+          <w:tab w:val="num" w:pos="3600"/>
+        </w:tabs>
+        <w:ind w:left="3600" w:hanging="360"/>
+      </w:pPr>
+      <w:rPr>
+        <w:rFonts w:ascii="Wingdings" w:hAnsi="Wingdings" w:hint="default"/>
+        <w:sz w:val="20"/>
+      </w:rPr>
+    </w:lvl>
+    <w:lvl w:ilvl="5" w:tentative="1">
+      <w:start w:val="1"/>
+      <w:numFmt w:val="bullet"/>
+      <w:lvlText w:val=""/>
+      <w:lvlJc w:val="left"/>
+      <w:pPr>
+        <w:tabs>
+          <w:tab w:val="num" w:pos="4320"/>
+        </w:tabs>
+        <w:ind w:left="4320" w:hanging="360"/>
+      </w:pPr>
+      <w:rPr>
+        <w:rFonts w:ascii="Wingdings" w:hAnsi="Wingdings" w:hint="default"/>
+        <w:sz w:val="20"/>
+      </w:rPr>
+    </w:lvl>
+    <w:lvl w:ilvl="6" w:tentative="1">
+      <w:start w:val="1"/>
+      <w:numFmt w:val="bullet"/>
+      <w:lvlText w:val=""/>
+      <w:lvlJc w:val="left"/>
+      <w:pPr>
+        <w:tabs>
+          <w:tab w:val="num" w:pos="5040"/>
+        </w:tabs>
+        <w:ind w:left="5040" w:hanging="360"/>
+      </w:pPr>
+      <w:rPr>
+        <w:rFonts w:ascii="Wingdings" w:hAnsi="Wingdings" w:hint="default"/>
+        <w:sz w:val="20"/>
+      </w:rPr>
+    </w:lvl>
+    <w:lvl w:ilvl="7" w:tentative="1">
+      <w:start w:val="1"/>
+      <w:numFmt w:val="bullet"/>
+      <w:lvlText w:val=""/>
+      <w:lvlJc w:val="left"/>
+      <w:pPr>
+        <w:tabs>
+          <w:tab w:val="num" w:pos="5760"/>
+        </w:tabs>
+        <w:ind w:left="5760" w:hanging="360"/>
+      </w:pPr>
+      <w:rPr>
+        <w:rFonts w:ascii="Wingdings" w:hAnsi="Wingdings" w:hint="default"/>
+        <w:sz w:val="20"/>
+      </w:rPr>
+    </w:lvl>
+    <w:lvl w:ilvl="8" w:tentative="1">
+      <w:start w:val="1"/>
+      <w:numFmt w:val="bullet"/>
+      <w:lvlText w:val=""/>
+      <w:lvlJc w:val="left"/>
+      <w:pPr>
+        <w:tabs>
+          <w:tab w:val="num" w:pos="6480"/>
+        </w:tabs>
+        <w:ind w:left="6480" w:hanging="360"/>
+      </w:pPr>
+      <w:rPr>
+        <w:rFonts w:ascii="Wingdings" w:hAnsi="Wingdings" w:hint="default"/>
+        <w:sz w:val="20"/>
+      </w:rPr>
+    </w:lvl>
+  </w:abstractNum>
+  <w:abstractNum w:abstractNumId="4" w15:restartNumberingAfterBreak="0">
+    <w:nsid w:val="5CCB2240"/>
+    <w:multiLevelType w:val="multilevel"/>
+    <w:tmpl w:val="406E0B0E"/>
+    <w:lvl w:ilvl="0">
+      <w:start w:val="1"/>
+      <w:numFmt w:val="bullet"/>
+      <w:lvlText w:val=""/>
+      <w:lvlJc w:val="left"/>
+      <w:pPr>
+        <w:tabs>
+          <w:tab w:val="num" w:pos="720"/>
+        </w:tabs>
+        <w:ind w:left="720" w:hanging="360"/>
+      </w:pPr>
+      <w:rPr>
+        <w:rFonts w:ascii="Symbol" w:hAnsi="Symbol" w:hint="default"/>
+        <w:sz w:val="20"/>
+      </w:rPr>
+    </w:lvl>
+    <w:lvl w:ilvl="1">
+      <w:start w:val="1"/>
+      <w:numFmt w:val="bullet"/>
+      <w:lvlText w:val="o"/>
+      <w:lvlJc w:val="left"/>
+      <w:pPr>
+        <w:tabs>
+          <w:tab w:val="num" w:pos="1440"/>
+        </w:tabs>
+        <w:ind w:left="1440" w:hanging="360"/>
+      </w:pPr>
+      <w:rPr>
+        <w:rFonts w:ascii="Courier New" w:hAnsi="Courier New" w:hint="default"/>
+        <w:sz w:val="20"/>
+      </w:rPr>
+    </w:lvl>
+    <w:lvl w:ilvl="2" w:tentative="1">
+      <w:start w:val="1"/>
+      <w:numFmt w:val="bullet"/>
+      <w:lvlText w:val=""/>
+      <w:lvlJc w:val="left"/>
+      <w:pPr>
+        <w:tabs>
+          <w:tab w:val="num" w:pos="2160"/>
+        </w:tabs>
+        <w:ind w:left="2160" w:hanging="360"/>
+      </w:pPr>
+      <w:rPr>
+        <w:rFonts w:ascii="Wingdings" w:hAnsi="Wingdings" w:hint="default"/>
+        <w:sz w:val="20"/>
+      </w:rPr>
+    </w:lvl>
+    <w:lvl w:ilvl="3" w:tentative="1">
+      <w:start w:val="1"/>
+      <w:numFmt w:val="bullet"/>
+      <w:lvlText w:val=""/>
+      <w:lvlJc w:val="left"/>
+      <w:pPr>
+        <w:tabs>
+          <w:tab w:val="num" w:pos="2880"/>
+        </w:tabs>
+        <w:ind w:left="2880" w:hanging="360"/>
+      </w:pPr>
+      <w:rPr>
+        <w:rFonts w:ascii="Wingdings" w:hAnsi="Wingdings" w:hint="default"/>
+        <w:sz w:val="20"/>
+      </w:rPr>
+    </w:lvl>
+    <w:lvl w:ilvl="4" w:tentative="1">
+      <w:start w:val="1"/>
+      <w:numFmt w:val="bullet"/>
+      <w:lvlText w:val=""/>
+      <w:lvlJc w:val="left"/>
+      <w:pPr>
+        <w:tabs>
+          <w:tab w:val="num" w:pos="3600"/>
+        </w:tabs>
+        <w:ind w:left="3600" w:hanging="360"/>
+      </w:pPr>
+      <w:rPr>
+        <w:rFonts w:ascii="Wingdings" w:hAnsi="Wingdings" w:hint="default"/>
+        <w:sz w:val="20"/>
+      </w:rPr>
+    </w:lvl>
+    <w:lvl w:ilvl="5" w:tentative="1">
+      <w:start w:val="1"/>
+      <w:numFmt w:val="bullet"/>
+      <w:lvlText w:val=""/>
+      <w:lvlJc w:val="left"/>
+      <w:pPr>
+        <w:tabs>
+          <w:tab w:val="num" w:pos="4320"/>
+        </w:tabs>
+        <w:ind w:left="4320" w:hanging="360"/>
+      </w:pPr>
+      <w:rPr>
+        <w:rFonts w:ascii="Wingdings" w:hAnsi="Wingdings" w:hint="default"/>
+        <w:sz w:val="20"/>
+      </w:rPr>
+    </w:lvl>
+    <w:lvl w:ilvl="6" w:tentative="1">
+      <w:start w:val="1"/>
+      <w:numFmt w:val="bullet"/>
+      <w:lvlText w:val=""/>
+      <w:lvlJc w:val="left"/>
+      <w:pPr>
+        <w:tabs>
+          <w:tab w:val="num" w:pos="5040"/>
+        </w:tabs>
+        <w:ind w:left="5040" w:hanging="360"/>
+      </w:pPr>
+      <w:rPr>
+        <w:rFonts w:ascii="Wingdings" w:hAnsi="Wingdings" w:hint="default"/>
+        <w:sz w:val="20"/>
+      </w:rPr>
+    </w:lvl>
+    <w:lvl w:ilvl="7" w:tentative="1">
+      <w:start w:val="1"/>
+      <w:numFmt w:val="bullet"/>
+      <w:lvlText w:val=""/>
+      <w:lvlJc w:val="left"/>
+      <w:pPr>
+        <w:tabs>
+          <w:tab w:val="num" w:pos="5760"/>
+        </w:tabs>
+        <w:ind w:left="5760" w:hanging="360"/>
+      </w:pPr>
+      <w:rPr>
+        <w:rFonts w:ascii="Wingdings" w:hAnsi="Wingdings" w:hint="default"/>
+        <w:sz w:val="20"/>
+      </w:rPr>
+    </w:lvl>
+    <w:lvl w:ilvl="8" w:tentative="1">
+      <w:start w:val="1"/>
+      <w:numFmt w:val="bullet"/>
+      <w:lvlText w:val=""/>
+      <w:lvlJc w:val="left"/>
+      <w:pPr>
+        <w:tabs>
+          <w:tab w:val="num" w:pos="6480"/>
+        </w:tabs>
+        <w:ind w:left="6480" w:hanging="360"/>
+      </w:pPr>
+      <w:rPr>
+        <w:rFonts w:ascii="Wingdings" w:hAnsi="Wingdings" w:hint="default"/>
+        <w:sz w:val="20"/>
+      </w:rPr>
+    </w:lvl>
+  </w:abstractNum>
+  <w:abstractNum w:abstractNumId="5" w15:restartNumberingAfterBreak="0">
     <w:nsid w:val="619321DB"/>
     <w:multiLevelType w:val="hybridMultilevel"/>
     <w:tmpl w:val="F72CDAE4"/>
@@ -26441,10 +28563,16 @@
     <w:abstractNumId w:val="0"/>
   </w:num>
   <w:num w:numId="3">
+    <w:abstractNumId w:val="5"/>
+  </w:num>
+  <w:num w:numId="4">
     <w:abstractNumId w:val="3"/>
   </w:num>
-  <w:num w:numId="4">
+  <w:num w:numId="5">
     <w:abstractNumId w:val="2"/>
+  </w:num>
+  <w:num w:numId="6">
+    <w:abstractNumId w:val="4"/>
   </w:num>
 </w:numbering>
 </file>
@@ -27172,6 +29300,63 @@
       <w:iCs/>
     </w:rPr>
   </w:style>
+  <w:style w:type="paragraph" w:styleId="Encabezado">
+    <w:name w:val="header"/>
+    <w:basedOn w:val="Normal"/>
+    <w:link w:val="EncabezadoCar"/>
+    <w:uiPriority w:val="99"/>
+    <w:unhideWhenUsed/>
+    <w:rsid w:val="00F32A89"/>
+    <w:pPr>
+      <w:tabs>
+        <w:tab w:val="center" w:pos="4252"/>
+        <w:tab w:val="right" w:pos="8504"/>
+      </w:tabs>
+      <w:spacing w:after="0" w:line="240" w:lineRule="auto"/>
+    </w:pPr>
+  </w:style>
+  <w:style w:type="character" w:customStyle="1" w:styleId="EncabezadoCar">
+    <w:name w:val="Encabezado Car"/>
+    <w:basedOn w:val="Fuentedeprrafopredeter"/>
+    <w:link w:val="Encabezado"/>
+    <w:uiPriority w:val="99"/>
+    <w:rsid w:val="00F32A89"/>
+  </w:style>
+  <w:style w:type="paragraph" w:styleId="Piedepgina">
+    <w:name w:val="footer"/>
+    <w:basedOn w:val="Normal"/>
+    <w:link w:val="PiedepginaCar"/>
+    <w:uiPriority w:val="99"/>
+    <w:unhideWhenUsed/>
+    <w:rsid w:val="00F32A89"/>
+    <w:pPr>
+      <w:tabs>
+        <w:tab w:val="center" w:pos="4252"/>
+        <w:tab w:val="right" w:pos="8504"/>
+      </w:tabs>
+      <w:spacing w:after="0" w:line="240" w:lineRule="auto"/>
+    </w:pPr>
+  </w:style>
+  <w:style w:type="character" w:customStyle="1" w:styleId="PiedepginaCar">
+    <w:name w:val="Pie de página Car"/>
+    <w:basedOn w:val="Fuentedeprrafopredeter"/>
+    <w:link w:val="Piedepgina"/>
+    <w:uiPriority w:val="99"/>
+    <w:rsid w:val="00F32A89"/>
+  </w:style>
+  <w:style w:type="character" w:styleId="CdigoHTML">
+    <w:name w:val="HTML Code"/>
+    <w:basedOn w:val="Fuentedeprrafopredeter"/>
+    <w:uiPriority w:val="99"/>
+    <w:semiHidden/>
+    <w:unhideWhenUsed/>
+    <w:rsid w:val="00996014"/>
+    <w:rPr>
+      <w:rFonts w:ascii="Courier New" w:eastAsia="Times New Roman" w:hAnsi="Courier New" w:cs="Courier New"/>
+      <w:sz w:val="20"/>
+      <w:szCs w:val="20"/>
+    </w:rPr>
+  </w:style>
 </w:styles>
 </file>
 

</xml_diff>